<commit_message>
Yayın: hibe kapsamı Kümes A ve B bloklarıyla sınırlandı
Uygun harcama 458.119 -> 295.246 Avro; kriter 1'in 300.000 Avro
kademesine girildi. Hibe dışı kalan yapı ve pozların satın alma
belgeleri yayından kaldırıldı (68 -> 44 belge).

Co-Authored-By: Claude Opus 5 <noreply@anthropic.com>
Claude-Session: https://claude.ai/code/session_01HJPp6bx7wepUX5p8fxGcjg
</commit_message>
<xml_diff>
--- a/belgeler/27_KESIF_OZETI_EK_01_KUMES_A_BLOK.docx
+++ b/belgeler/27_KESIF_OZETI_EK_01_KUMES_A_BLOK.docx
@@ -2795,7 +2795,6 @@
         <w:tc>
           <w:tcPr>
             <w:tcW w:type="dxa" w:w="1928"/>
-            <w:vMerge w:val="restart"/>
             <w:tcBorders>
               <w:top w:val="single" w:color="808080" w:sz="4"/>
               <w:left w:val="single" w:color="808080" w:sz="4"/>
@@ -2892,7 +2891,7 @@
                 <w:sz w:val="14"/>
                 <w:szCs w:val="14"/>
               </w:rPr>
-              <w:t xml:space="preserve">TKDK-0042</w:t>
+              <w:t xml:space="preserve">TKDK-0115</w:t>
             </w:r>
           </w:p>
         </w:tc>
@@ -2926,7 +2925,7 @@
                 <w:sz w:val="14"/>
                 <w:szCs w:val="14"/>
               </w:rPr>
-              <w:t xml:space="preserve">6 cm poliüretan dolgulu (üst min. 0,40 mm, alt min. 0,30 mm) boyalı galvanizli sac levhalar ile ısı yalıtımlı çatı kaplaması yapılması</w:t>
+              <w:t xml:space="preserve">Galvanizli düz sacdan yağmur oluğu veya iniş borusu yapılması</w:t>
             </w:r>
           </w:p>
         </w:tc>
@@ -2960,7 +2959,7 @@
                 <w:sz w:val="14"/>
                 <w:szCs w:val="14"/>
               </w:rPr>
-              <w:t xml:space="preserve">m²</w:t>
+              <w:t xml:space="preserve">kg</w:t>
             </w:r>
           </w:p>
         </w:tc>
@@ -2994,7 +2993,7 @@
                 <w:sz w:val="14"/>
                 <w:szCs w:val="14"/>
               </w:rPr>
-              <w:t xml:space="preserve">1.204,98</w:t>
+              <w:t xml:space="preserve">360,16</w:t>
             </w:r>
           </w:p>
         </w:tc>
@@ -3002,15 +3001,39 @@
       <w:tr>
         <w:tc>
           <w:tcPr>
-            <w:vMerge w:val="continue"/>
-            <w:tcBorders>
-              <w:top w:val="single" w:color="808080" w:sz="4"/>
-              <w:left w:val="single" w:color="808080" w:sz="4"/>
-              <w:bottom w:val="single" w:color="808080" w:sz="4"/>
-              <w:right w:val="single" w:color="808080" w:sz="4"/>
-            </w:tcBorders>
-          </w:tcPr>
-          <w:p/>
+            <w:tcW w:type="dxa" w:w="1928"/>
+            <w:vMerge w:val="restart"/>
+            <w:tcBorders>
+              <w:top w:val="single" w:color="808080" w:sz="4"/>
+              <w:left w:val="single" w:color="808080" w:sz="4"/>
+              <w:bottom w:val="single" w:color="808080" w:sz="4"/>
+              <w:right w:val="single" w:color="808080" w:sz="4"/>
+            </w:tcBorders>
+            <w:shd w:fill="EDEDED" w:color="auto" w:val="clear"/>
+            <w:tcMar>
+              <w:top w:type="dxa" w:w="40"/>
+              <w:left w:type="dxa" w:w="60"/>
+              <w:bottom w:type="dxa" w:w="40"/>
+              <w:right w:type="dxa" w:w="60"/>
+            </w:tcMar>
+            <w:vAlign w:val="center"/>
+          </w:tcPr>
+          <w:p>
+            <w:pPr>
+              <w:spacing w:after="0" w:before="0"/>
+              <w:jc w:val="left"/>
+            </w:pPr>
+            <w:r>
+              <w:rPr>
+                <w:rFonts w:ascii="Calibri" w:cs="Calibri" w:eastAsia="Calibri" w:hAnsi="Calibri"/>
+                <w:b/>
+                <w:bCs/>
+                <w:sz w:val="14"/>
+                <w:szCs w:val="14"/>
+              </w:rPr>
+              <w:t xml:space="preserve">Doğramacılık işleri (Demir, Alüminyum, PVC, Kompozit)</w:t>
+            </w:r>
+          </w:p>
         </w:tc>
         <w:tc>
           <w:tcPr>
@@ -3042,7 +3065,7 @@
                 <w:sz w:val="14"/>
                 <w:szCs w:val="14"/>
               </w:rPr>
-              <w:t xml:space="preserve">2</w:t>
+              <w:t xml:space="preserve">1</w:t>
             </w:r>
           </w:p>
         </w:tc>
@@ -3076,7 +3099,7 @@
                 <w:sz w:val="14"/>
                 <w:szCs w:val="14"/>
               </w:rPr>
-              <w:t xml:space="preserve">TKDK-0115</w:t>
+              <w:t xml:space="preserve">TKDK-0151</w:t>
             </w:r>
           </w:p>
         </w:tc>
@@ -3110,7 +3133,7 @@
                 <w:sz w:val="14"/>
                 <w:szCs w:val="14"/>
               </w:rPr>
-              <w:t xml:space="preserve">Galvanizli düz sacdan yağmur oluğu veya iniş borusu yapılması</w:t>
+              <w:t xml:space="preserve">5 cm poliüretan dolgulu (üst 0,50 mm düz, alt 0,40 mm düz) fabrikasyon rulo boyama sistemi ile boyanmış galvaniz levhalar ile ısı yalıtımlı kapı yapılması</w:t>
             </w:r>
           </w:p>
         </w:tc>
@@ -3144,7 +3167,7 @@
                 <w:sz w:val="14"/>
                 <w:szCs w:val="14"/>
               </w:rPr>
-              <w:t xml:space="preserve">kg</w:t>
+              <w:t xml:space="preserve">m²</w:t>
             </w:r>
           </w:p>
         </w:tc>
@@ -3178,7 +3201,7 @@
                 <w:sz w:val="14"/>
                 <w:szCs w:val="14"/>
               </w:rPr>
-              <w:t xml:space="preserve">360,16</w:t>
+              <w:t xml:space="preserve">13,40</w:t>
             </w:r>
           </w:p>
         </w:tc>
@@ -3186,6 +3209,374 @@
       <w:tr>
         <w:tc>
           <w:tcPr>
+            <w:vMerge w:val="continue"/>
+            <w:tcBorders>
+              <w:top w:val="single" w:color="808080" w:sz="4"/>
+              <w:left w:val="single" w:color="808080" w:sz="4"/>
+              <w:bottom w:val="single" w:color="808080" w:sz="4"/>
+              <w:right w:val="single" w:color="808080" w:sz="4"/>
+            </w:tcBorders>
+          </w:tcPr>
+          <w:p/>
+        </w:tc>
+        <w:tc>
+          <w:tcPr>
+            <w:tcW w:type="dxa" w:w="454"/>
+            <w:tcBorders>
+              <w:top w:val="single" w:color="808080" w:sz="4"/>
+              <w:left w:val="single" w:color="808080" w:sz="4"/>
+              <w:bottom w:val="single" w:color="808080" w:sz="4"/>
+              <w:right w:val="single" w:color="808080" w:sz="4"/>
+            </w:tcBorders>
+            <w:tcMar>
+              <w:top w:type="dxa" w:w="40"/>
+              <w:left w:type="dxa" w:w="60"/>
+              <w:bottom w:type="dxa" w:w="40"/>
+              <w:right w:type="dxa" w:w="60"/>
+            </w:tcMar>
+            <w:vAlign w:val="top"/>
+          </w:tcPr>
+          <w:p>
+            <w:pPr>
+              <w:spacing w:after="0" w:before="0"/>
+              <w:jc w:val="center"/>
+            </w:pPr>
+            <w:r>
+              <w:rPr>
+                <w:rFonts w:ascii="Calibri" w:cs="Calibri" w:eastAsia="Calibri" w:hAnsi="Calibri"/>
+                <w:b w:val="false"/>
+                <w:bCs w:val="false"/>
+                <w:sz w:val="14"/>
+                <w:szCs w:val="14"/>
+              </w:rPr>
+              <w:t xml:space="preserve">2</w:t>
+            </w:r>
+          </w:p>
+        </w:tc>
+        <w:tc>
+          <w:tcPr>
+            <w:tcW w:type="dxa" w:w="1134"/>
+            <w:tcBorders>
+              <w:top w:val="single" w:color="808080" w:sz="4"/>
+              <w:left w:val="single" w:color="808080" w:sz="4"/>
+              <w:bottom w:val="single" w:color="808080" w:sz="4"/>
+              <w:right w:val="single" w:color="808080" w:sz="4"/>
+            </w:tcBorders>
+            <w:tcMar>
+              <w:top w:type="dxa" w:w="40"/>
+              <w:left w:type="dxa" w:w="60"/>
+              <w:bottom w:type="dxa" w:w="40"/>
+              <w:right w:type="dxa" w:w="60"/>
+            </w:tcMar>
+            <w:vAlign w:val="top"/>
+          </w:tcPr>
+          <w:p>
+            <w:pPr>
+              <w:spacing w:after="0" w:before="0"/>
+              <w:jc w:val="center"/>
+            </w:pPr>
+            <w:r>
+              <w:rPr>
+                <w:rFonts w:ascii="Calibri" w:cs="Calibri" w:eastAsia="Calibri" w:hAnsi="Calibri"/>
+                <w:b w:val="false"/>
+                <w:bCs w:val="false"/>
+                <w:sz w:val="14"/>
+                <w:szCs w:val="14"/>
+              </w:rPr>
+              <w:t xml:space="preserve">TKDK-0175</w:t>
+            </w:r>
+          </w:p>
+        </w:tc>
+        <w:tc>
+          <w:tcPr>
+            <w:tcW w:type="dxa" w:w="5102"/>
+            <w:tcBorders>
+              <w:top w:val="single" w:color="808080" w:sz="4"/>
+              <w:left w:val="single" w:color="808080" w:sz="4"/>
+              <w:bottom w:val="single" w:color="808080" w:sz="4"/>
+              <w:right w:val="single" w:color="808080" w:sz="4"/>
+            </w:tcBorders>
+            <w:tcMar>
+              <w:top w:type="dxa" w:w="40"/>
+              <w:left w:type="dxa" w:w="60"/>
+              <w:bottom w:type="dxa" w:w="40"/>
+              <w:right w:type="dxa" w:w="60"/>
+            </w:tcMar>
+            <w:vAlign w:val="top"/>
+          </w:tcPr>
+          <w:p>
+            <w:pPr>
+              <w:spacing w:after="0" w:before="0"/>
+              <w:jc w:val="left"/>
+            </w:pPr>
+            <w:r>
+              <w:rPr>
+                <w:rFonts w:ascii="Calibri" w:cs="Calibri" w:eastAsia="Calibri" w:hAnsi="Calibri"/>
+                <w:b w:val="false"/>
+                <w:bCs w:val="false"/>
+                <w:sz w:val="14"/>
+                <w:szCs w:val="14"/>
+              </w:rPr>
+              <w:t xml:space="preserve">PVC kaplamalı, iki yüzü odun lifinden yapılmış levhalarla (MDF) presli, kraft dolgulu iç kapı kanadı yapılması, yerinde takılması</w:t>
+            </w:r>
+          </w:p>
+        </w:tc>
+        <w:tc>
+          <w:tcPr>
+            <w:tcW w:type="dxa" w:w="680"/>
+            <w:tcBorders>
+              <w:top w:val="single" w:color="808080" w:sz="4"/>
+              <w:left w:val="single" w:color="808080" w:sz="4"/>
+              <w:bottom w:val="single" w:color="808080" w:sz="4"/>
+              <w:right w:val="single" w:color="808080" w:sz="4"/>
+            </w:tcBorders>
+            <w:tcMar>
+              <w:top w:type="dxa" w:w="40"/>
+              <w:left w:type="dxa" w:w="60"/>
+              <w:bottom w:type="dxa" w:w="40"/>
+              <w:right w:type="dxa" w:w="60"/>
+            </w:tcMar>
+            <w:vAlign w:val="top"/>
+          </w:tcPr>
+          <w:p>
+            <w:pPr>
+              <w:spacing w:after="0" w:before="0"/>
+              <w:jc w:val="center"/>
+            </w:pPr>
+            <w:r>
+              <w:rPr>
+                <w:rFonts w:ascii="Calibri" w:cs="Calibri" w:eastAsia="Calibri" w:hAnsi="Calibri"/>
+                <w:b w:val="false"/>
+                <w:bCs w:val="false"/>
+                <w:sz w:val="14"/>
+                <w:szCs w:val="14"/>
+              </w:rPr>
+              <w:t xml:space="preserve">m²</w:t>
+            </w:r>
+          </w:p>
+        </w:tc>
+        <w:tc>
+          <w:tcPr>
+            <w:tcW w:type="dxa" w:w="1134"/>
+            <w:tcBorders>
+              <w:top w:val="single" w:color="808080" w:sz="4"/>
+              <w:left w:val="single" w:color="808080" w:sz="4"/>
+              <w:bottom w:val="single" w:color="808080" w:sz="4"/>
+              <w:right w:val="single" w:color="808080" w:sz="4"/>
+            </w:tcBorders>
+            <w:tcMar>
+              <w:top w:type="dxa" w:w="40"/>
+              <w:left w:type="dxa" w:w="60"/>
+              <w:bottom w:type="dxa" w:w="40"/>
+              <w:right w:type="dxa" w:w="60"/>
+            </w:tcMar>
+            <w:vAlign w:val="top"/>
+          </w:tcPr>
+          <w:p>
+            <w:pPr>
+              <w:spacing w:after="0" w:before="0"/>
+              <w:jc w:val="right"/>
+            </w:pPr>
+            <w:r>
+              <w:rPr>
+                <w:rFonts w:ascii="Calibri" w:cs="Calibri" w:eastAsia="Calibri" w:hAnsi="Calibri"/>
+                <w:b w:val="false"/>
+                <w:bCs w:val="false"/>
+                <w:sz w:val="14"/>
+                <w:szCs w:val="14"/>
+              </w:rPr>
+              <w:t xml:space="preserve">5,67</w:t>
+            </w:r>
+          </w:p>
+        </w:tc>
+      </w:tr>
+      <w:tr>
+        <w:tc>
+          <w:tcPr>
+            <w:vMerge w:val="continue"/>
+            <w:tcBorders>
+              <w:top w:val="single" w:color="808080" w:sz="4"/>
+              <w:left w:val="single" w:color="808080" w:sz="4"/>
+              <w:bottom w:val="single" w:color="808080" w:sz="4"/>
+              <w:right w:val="single" w:color="808080" w:sz="4"/>
+            </w:tcBorders>
+          </w:tcPr>
+          <w:p/>
+        </w:tc>
+        <w:tc>
+          <w:tcPr>
+            <w:tcW w:type="dxa" w:w="454"/>
+            <w:tcBorders>
+              <w:top w:val="single" w:color="808080" w:sz="4"/>
+              <w:left w:val="single" w:color="808080" w:sz="4"/>
+              <w:bottom w:val="single" w:color="808080" w:sz="4"/>
+              <w:right w:val="single" w:color="808080" w:sz="4"/>
+            </w:tcBorders>
+            <w:tcMar>
+              <w:top w:type="dxa" w:w="40"/>
+              <w:left w:type="dxa" w:w="60"/>
+              <w:bottom w:type="dxa" w:w="40"/>
+              <w:right w:type="dxa" w:w="60"/>
+            </w:tcMar>
+            <w:vAlign w:val="top"/>
+          </w:tcPr>
+          <w:p>
+            <w:pPr>
+              <w:spacing w:after="0" w:before="0"/>
+              <w:jc w:val="center"/>
+            </w:pPr>
+            <w:r>
+              <w:rPr>
+                <w:rFonts w:ascii="Calibri" w:cs="Calibri" w:eastAsia="Calibri" w:hAnsi="Calibri"/>
+                <w:b w:val="false"/>
+                <w:bCs w:val="false"/>
+                <w:sz w:val="14"/>
+                <w:szCs w:val="14"/>
+              </w:rPr>
+              <w:t xml:space="preserve">3</w:t>
+            </w:r>
+          </w:p>
+        </w:tc>
+        <w:tc>
+          <w:tcPr>
+            <w:tcW w:type="dxa" w:w="1134"/>
+            <w:tcBorders>
+              <w:top w:val="single" w:color="808080" w:sz="4"/>
+              <w:left w:val="single" w:color="808080" w:sz="4"/>
+              <w:bottom w:val="single" w:color="808080" w:sz="4"/>
+              <w:right w:val="single" w:color="808080" w:sz="4"/>
+            </w:tcBorders>
+            <w:tcMar>
+              <w:top w:type="dxa" w:w="40"/>
+              <w:left w:type="dxa" w:w="60"/>
+              <w:bottom w:type="dxa" w:w="40"/>
+              <w:right w:type="dxa" w:w="60"/>
+            </w:tcMar>
+            <w:vAlign w:val="top"/>
+          </w:tcPr>
+          <w:p>
+            <w:pPr>
+              <w:spacing w:after="0" w:before="0"/>
+              <w:jc w:val="center"/>
+            </w:pPr>
+            <w:r>
+              <w:rPr>
+                <w:rFonts w:ascii="Calibri" w:cs="Calibri" w:eastAsia="Calibri" w:hAnsi="Calibri"/>
+                <w:b w:val="false"/>
+                <w:bCs w:val="false"/>
+                <w:sz w:val="14"/>
+                <w:szCs w:val="14"/>
+              </w:rPr>
+              <w:t xml:space="preserve">15.550.1002</w:t>
+            </w:r>
+          </w:p>
+        </w:tc>
+        <w:tc>
+          <w:tcPr>
+            <w:tcW w:type="dxa" w:w="5102"/>
+            <w:tcBorders>
+              <w:top w:val="single" w:color="808080" w:sz="4"/>
+              <w:left w:val="single" w:color="808080" w:sz="4"/>
+              <w:bottom w:val="single" w:color="808080" w:sz="4"/>
+              <w:right w:val="single" w:color="808080" w:sz="4"/>
+            </w:tcBorders>
+            <w:tcMar>
+              <w:top w:type="dxa" w:w="40"/>
+              <w:left w:type="dxa" w:w="60"/>
+              <w:bottom w:type="dxa" w:w="40"/>
+              <w:right w:type="dxa" w:w="60"/>
+            </w:tcMar>
+            <w:vAlign w:val="top"/>
+          </w:tcPr>
+          <w:p>
+            <w:pPr>
+              <w:spacing w:after="0" w:before="0"/>
+              <w:jc w:val="left"/>
+            </w:pPr>
+            <w:r>
+              <w:rPr>
+                <w:rFonts w:ascii="Calibri" w:cs="Calibri" w:eastAsia="Calibri" w:hAnsi="Calibri"/>
+                <w:b w:val="false"/>
+                <w:bCs w:val="false"/>
+                <w:sz w:val="14"/>
+                <w:szCs w:val="14"/>
+              </w:rPr>
+              <w:t xml:space="preserve">1,50 mm kalınlığında sıcak haddelenmiş sacdan bükme kapı kasası yapılması ve yerine konulması</w:t>
+            </w:r>
+          </w:p>
+        </w:tc>
+        <w:tc>
+          <w:tcPr>
+            <w:tcW w:type="dxa" w:w="680"/>
+            <w:tcBorders>
+              <w:top w:val="single" w:color="808080" w:sz="4"/>
+              <w:left w:val="single" w:color="808080" w:sz="4"/>
+              <w:bottom w:val="single" w:color="808080" w:sz="4"/>
+              <w:right w:val="single" w:color="808080" w:sz="4"/>
+            </w:tcBorders>
+            <w:tcMar>
+              <w:top w:type="dxa" w:w="40"/>
+              <w:left w:type="dxa" w:w="60"/>
+              <w:bottom w:type="dxa" w:w="40"/>
+              <w:right w:type="dxa" w:w="60"/>
+            </w:tcMar>
+            <w:vAlign w:val="top"/>
+          </w:tcPr>
+          <w:p>
+            <w:pPr>
+              <w:spacing w:after="0" w:before="0"/>
+              <w:jc w:val="center"/>
+            </w:pPr>
+            <w:r>
+              <w:rPr>
+                <w:rFonts w:ascii="Calibri" w:cs="Calibri" w:eastAsia="Calibri" w:hAnsi="Calibri"/>
+                <w:b w:val="false"/>
+                <w:bCs w:val="false"/>
+                <w:sz w:val="14"/>
+                <w:szCs w:val="14"/>
+              </w:rPr>
+              <w:t xml:space="preserve">kg</w:t>
+            </w:r>
+          </w:p>
+        </w:tc>
+        <w:tc>
+          <w:tcPr>
+            <w:tcW w:type="dxa" w:w="1134"/>
+            <w:tcBorders>
+              <w:top w:val="single" w:color="808080" w:sz="4"/>
+              <w:left w:val="single" w:color="808080" w:sz="4"/>
+              <w:bottom w:val="single" w:color="808080" w:sz="4"/>
+              <w:right w:val="single" w:color="808080" w:sz="4"/>
+            </w:tcBorders>
+            <w:tcMar>
+              <w:top w:type="dxa" w:w="40"/>
+              <w:left w:type="dxa" w:w="60"/>
+              <w:bottom w:type="dxa" w:w="40"/>
+              <w:right w:type="dxa" w:w="60"/>
+            </w:tcMar>
+            <w:vAlign w:val="top"/>
+          </w:tcPr>
+          <w:p>
+            <w:pPr>
+              <w:spacing w:after="0" w:before="0"/>
+              <w:jc w:val="right"/>
+            </w:pPr>
+            <w:r>
+              <w:rPr>
+                <w:rFonts w:ascii="Calibri" w:cs="Calibri" w:eastAsia="Calibri" w:hAnsi="Calibri"/>
+                <w:b w:val="false"/>
+                <w:bCs w:val="false"/>
+                <w:sz w:val="14"/>
+                <w:szCs w:val="14"/>
+              </w:rPr>
+              <w:t xml:space="preserve">54,31</w:t>
+            </w:r>
+          </w:p>
+        </w:tc>
+      </w:tr>
+      <w:tr>
+        <w:tc>
+          <w:tcPr>
             <w:tcW w:type="dxa" w:w="1928"/>
             <w:vMerge w:val="restart"/>
             <w:tcBorders>
@@ -3216,7 +3607,7 @@
                 <w:sz w:val="14"/>
                 <w:szCs w:val="14"/>
               </w:rPr>
-              <w:t xml:space="preserve">Doğramacılık işleri (Demir, Alüminyum, PVC, Kompozit)</w:t>
+              <w:t xml:space="preserve">Sıva, alçı, derz ve şap işleri</w:t>
             </w:r>
           </w:p>
         </w:tc>
@@ -3284,7 +3675,7 @@
                 <w:sz w:val="14"/>
                 <w:szCs w:val="14"/>
               </w:rPr>
-              <w:t xml:space="preserve">TKDK-0151</w:t>
+              <w:t xml:space="preserve">15.275.1116</w:t>
             </w:r>
           </w:p>
         </w:tc>
@@ -3318,7 +3709,7 @@
                 <w:sz w:val="14"/>
                 <w:szCs w:val="14"/>
               </w:rPr>
-              <w:t xml:space="preserve">5 cm poliüretan dolgulu (üst 0,50 mm düz, alt 0,40 mm düz) fabrikasyon rulo boyama sistemi ile boyanmış galvaniz levhalar ile ısı yalıtımlı kapı yapılması</w:t>
+              <w:t xml:space="preserve">250 kg çimento dozlu harç ile kaba sıva yapılması</w:t>
             </w:r>
           </w:p>
         </w:tc>
@@ -3386,7 +3777,7 @@
                 <w:sz w:val="14"/>
                 <w:szCs w:val="14"/>
               </w:rPr>
-              <w:t xml:space="preserve">13,40</w:t>
+              <w:t xml:space="preserve">557,76</w:t>
             </w:r>
           </w:p>
         </w:tc>
@@ -3468,7 +3859,7 @@
                 <w:sz w:val="14"/>
                 <w:szCs w:val="14"/>
               </w:rPr>
-              <w:t xml:space="preserve">TKDK-0175</w:t>
+              <w:t xml:space="preserve">15.275.1117</w:t>
             </w:r>
           </w:p>
         </w:tc>
@@ -3502,7 +3893,7 @@
                 <w:sz w:val="14"/>
                 <w:szCs w:val="14"/>
               </w:rPr>
-              <w:t xml:space="preserve">PVC kaplamalı, iki yüzü odun lifinden yapılmış levhalarla (MDF) presli, kraft dolgulu iç kapı kanadı yapılması, yerinde takılması</w:t>
+              <w:t xml:space="preserve">200 kg çimento ve kireç karışımı harç ile kaba sıva yapılması (iç cephe)</w:t>
             </w:r>
           </w:p>
         </w:tc>
@@ -3570,7 +3961,7 @@
                 <w:sz w:val="14"/>
                 <w:szCs w:val="14"/>
               </w:rPr>
-              <w:t xml:space="preserve">5,67</w:t>
+              <w:t xml:space="preserve">647,76</w:t>
             </w:r>
           </w:p>
         </w:tc>
@@ -3578,15 +3969,39 @@
       <w:tr>
         <w:tc>
           <w:tcPr>
-            <w:vMerge w:val="continue"/>
-            <w:tcBorders>
-              <w:top w:val="single" w:color="808080" w:sz="4"/>
-              <w:left w:val="single" w:color="808080" w:sz="4"/>
-              <w:bottom w:val="single" w:color="808080" w:sz="4"/>
-              <w:right w:val="single" w:color="808080" w:sz="4"/>
-            </w:tcBorders>
-          </w:tcPr>
-          <w:p/>
+            <w:tcW w:type="dxa" w:w="1928"/>
+            <w:vMerge w:val="restart"/>
+            <w:tcBorders>
+              <w:top w:val="single" w:color="808080" w:sz="4"/>
+              <w:left w:val="single" w:color="808080" w:sz="4"/>
+              <w:bottom w:val="single" w:color="808080" w:sz="4"/>
+              <w:right w:val="single" w:color="808080" w:sz="4"/>
+            </w:tcBorders>
+            <w:shd w:fill="EDEDED" w:color="auto" w:val="clear"/>
+            <w:tcMar>
+              <w:top w:type="dxa" w:w="40"/>
+              <w:left w:type="dxa" w:w="60"/>
+              <w:bottom w:type="dxa" w:w="40"/>
+              <w:right w:type="dxa" w:w="60"/>
+            </w:tcMar>
+            <w:vAlign w:val="center"/>
+          </w:tcPr>
+          <w:p>
+            <w:pPr>
+              <w:spacing w:after="0" w:before="0"/>
+              <w:jc w:val="left"/>
+            </w:pPr>
+            <w:r>
+              <w:rPr>
+                <w:rFonts w:ascii="Calibri" w:cs="Calibri" w:eastAsia="Calibri" w:hAnsi="Calibri"/>
+                <w:b/>
+                <w:bCs/>
+                <w:sz w:val="14"/>
+                <w:szCs w:val="14"/>
+              </w:rPr>
+              <w:t xml:space="preserve">Boya, badana ve cila işleri</w:t>
+            </w:r>
+          </w:p>
         </w:tc>
         <w:tc>
           <w:tcPr>
@@ -3618,7 +4033,7 @@
                 <w:sz w:val="14"/>
                 <w:szCs w:val="14"/>
               </w:rPr>
-              <w:t xml:space="preserve">3</w:t>
+              <w:t xml:space="preserve">1</w:t>
             </w:r>
           </w:p>
         </w:tc>
@@ -3652,7 +4067,7 @@
                 <w:sz w:val="14"/>
                 <w:szCs w:val="14"/>
               </w:rPr>
-              <w:t xml:space="preserve">15.550.1002</w:t>
+              <w:t xml:space="preserve">15.540.1606</w:t>
             </w:r>
           </w:p>
         </w:tc>
@@ -3686,7 +4101,7 @@
                 <w:sz w:val="14"/>
                 <w:szCs w:val="14"/>
               </w:rPr>
-              <w:t xml:space="preserve">1,50 mm kalınlığında sıcak haddelenmiş sacdan bükme kapı kasası yapılması ve yerine konulması</w:t>
+              <w:t xml:space="preserve">Brüt beton, sıvalı veya eski boyalı yüzeylere astar uygulanarak silikon esaslı su bazlı dış cephe boyası yapılması</w:t>
             </w:r>
           </w:p>
         </w:tc>
@@ -3720,7 +4135,7 @@
                 <w:sz w:val="14"/>
                 <w:szCs w:val="14"/>
               </w:rPr>
-              <w:t xml:space="preserve">kg</w:t>
+              <w:t xml:space="preserve">m²</w:t>
             </w:r>
           </w:p>
         </w:tc>
@@ -3754,7 +4169,7 @@
                 <w:sz w:val="14"/>
                 <w:szCs w:val="14"/>
               </w:rPr>
-              <w:t xml:space="preserve">54,31</w:t>
+              <w:t xml:space="preserve">557,76</w:t>
             </w:r>
           </w:p>
         </w:tc>
@@ -3762,6 +4177,604 @@
       <w:tr>
         <w:tc>
           <w:tcPr>
+            <w:vMerge w:val="continue"/>
+            <w:tcBorders>
+              <w:top w:val="single" w:color="808080" w:sz="4"/>
+              <w:left w:val="single" w:color="808080" w:sz="4"/>
+              <w:bottom w:val="single" w:color="808080" w:sz="4"/>
+              <w:right w:val="single" w:color="808080" w:sz="4"/>
+            </w:tcBorders>
+          </w:tcPr>
+          <w:p/>
+        </w:tc>
+        <w:tc>
+          <w:tcPr>
+            <w:tcW w:type="dxa" w:w="454"/>
+            <w:tcBorders>
+              <w:top w:val="single" w:color="808080" w:sz="4"/>
+              <w:left w:val="single" w:color="808080" w:sz="4"/>
+              <w:bottom w:val="single" w:color="808080" w:sz="4"/>
+              <w:right w:val="single" w:color="808080" w:sz="4"/>
+            </w:tcBorders>
+            <w:tcMar>
+              <w:top w:type="dxa" w:w="40"/>
+              <w:left w:type="dxa" w:w="60"/>
+              <w:bottom w:type="dxa" w:w="40"/>
+              <w:right w:type="dxa" w:w="60"/>
+            </w:tcMar>
+            <w:vAlign w:val="top"/>
+          </w:tcPr>
+          <w:p>
+            <w:pPr>
+              <w:spacing w:after="0" w:before="0"/>
+              <w:jc w:val="center"/>
+            </w:pPr>
+            <w:r>
+              <w:rPr>
+                <w:rFonts w:ascii="Calibri" w:cs="Calibri" w:eastAsia="Calibri" w:hAnsi="Calibri"/>
+                <w:b w:val="false"/>
+                <w:bCs w:val="false"/>
+                <w:sz w:val="14"/>
+                <w:szCs w:val="14"/>
+              </w:rPr>
+              <w:t xml:space="preserve">2</w:t>
+            </w:r>
+          </w:p>
+        </w:tc>
+        <w:tc>
+          <w:tcPr>
+            <w:tcW w:type="dxa" w:w="1134"/>
+            <w:tcBorders>
+              <w:top w:val="single" w:color="808080" w:sz="4"/>
+              <w:left w:val="single" w:color="808080" w:sz="4"/>
+              <w:bottom w:val="single" w:color="808080" w:sz="4"/>
+              <w:right w:val="single" w:color="808080" w:sz="4"/>
+            </w:tcBorders>
+            <w:tcMar>
+              <w:top w:type="dxa" w:w="40"/>
+              <w:left w:type="dxa" w:w="60"/>
+              <w:bottom w:type="dxa" w:w="40"/>
+              <w:right w:type="dxa" w:w="60"/>
+            </w:tcMar>
+            <w:vAlign w:val="top"/>
+          </w:tcPr>
+          <w:p>
+            <w:pPr>
+              <w:spacing w:after="0" w:before="0"/>
+              <w:jc w:val="center"/>
+            </w:pPr>
+            <w:r>
+              <w:rPr>
+                <w:rFonts w:ascii="Calibri" w:cs="Calibri" w:eastAsia="Calibri" w:hAnsi="Calibri"/>
+                <w:b w:val="false"/>
+                <w:bCs w:val="false"/>
+                <w:sz w:val="14"/>
+                <w:szCs w:val="14"/>
+              </w:rPr>
+              <w:t xml:space="preserve">15.540.1537</w:t>
+            </w:r>
+          </w:p>
+        </w:tc>
+        <w:tc>
+          <w:tcPr>
+            <w:tcW w:type="dxa" w:w="5102"/>
+            <w:tcBorders>
+              <w:top w:val="single" w:color="808080" w:sz="4"/>
+              <w:left w:val="single" w:color="808080" w:sz="4"/>
+              <w:bottom w:val="single" w:color="808080" w:sz="4"/>
+              <w:right w:val="single" w:color="808080" w:sz="4"/>
+            </w:tcBorders>
+            <w:tcMar>
+              <w:top w:type="dxa" w:w="40"/>
+              <w:left w:type="dxa" w:w="60"/>
+              <w:bottom w:type="dxa" w:w="40"/>
+              <w:right w:type="dxa" w:w="60"/>
+            </w:tcMar>
+            <w:vAlign w:val="top"/>
+          </w:tcPr>
+          <w:p>
+            <w:pPr>
+              <w:spacing w:after="0" w:before="0"/>
+              <w:jc w:val="left"/>
+            </w:pPr>
+            <w:r>
+              <w:rPr>
+                <w:rFonts w:ascii="Calibri" w:cs="Calibri" w:eastAsia="Calibri" w:hAnsi="Calibri"/>
+                <w:b w:val="false"/>
+                <w:bCs w:val="false"/>
+                <w:sz w:val="14"/>
+                <w:szCs w:val="14"/>
+              </w:rPr>
+              <w:t xml:space="preserve">Yeni sıva yüzeylere astar uygulanarak iki kat su bazlı plastik antibakteriyel iç cephe boyası yapılması</w:t>
+            </w:r>
+          </w:p>
+        </w:tc>
+        <w:tc>
+          <w:tcPr>
+            <w:tcW w:type="dxa" w:w="680"/>
+            <w:tcBorders>
+              <w:top w:val="single" w:color="808080" w:sz="4"/>
+              <w:left w:val="single" w:color="808080" w:sz="4"/>
+              <w:bottom w:val="single" w:color="808080" w:sz="4"/>
+              <w:right w:val="single" w:color="808080" w:sz="4"/>
+            </w:tcBorders>
+            <w:tcMar>
+              <w:top w:type="dxa" w:w="40"/>
+              <w:left w:type="dxa" w:w="60"/>
+              <w:bottom w:type="dxa" w:w="40"/>
+              <w:right w:type="dxa" w:w="60"/>
+            </w:tcMar>
+            <w:vAlign w:val="top"/>
+          </w:tcPr>
+          <w:p>
+            <w:pPr>
+              <w:spacing w:after="0" w:before="0"/>
+              <w:jc w:val="center"/>
+            </w:pPr>
+            <w:r>
+              <w:rPr>
+                <w:rFonts w:ascii="Calibri" w:cs="Calibri" w:eastAsia="Calibri" w:hAnsi="Calibri"/>
+                <w:b w:val="false"/>
+                <w:bCs w:val="false"/>
+                <w:sz w:val="14"/>
+                <w:szCs w:val="14"/>
+              </w:rPr>
+              <w:t xml:space="preserve">m²</w:t>
+            </w:r>
+          </w:p>
+        </w:tc>
+        <w:tc>
+          <w:tcPr>
+            <w:tcW w:type="dxa" w:w="1134"/>
+            <w:tcBorders>
+              <w:top w:val="single" w:color="808080" w:sz="4"/>
+              <w:left w:val="single" w:color="808080" w:sz="4"/>
+              <w:bottom w:val="single" w:color="808080" w:sz="4"/>
+              <w:right w:val="single" w:color="808080" w:sz="4"/>
+            </w:tcBorders>
+            <w:tcMar>
+              <w:top w:type="dxa" w:w="40"/>
+              <w:left w:type="dxa" w:w="60"/>
+              <w:bottom w:type="dxa" w:w="40"/>
+              <w:right w:type="dxa" w:w="60"/>
+            </w:tcMar>
+            <w:vAlign w:val="top"/>
+          </w:tcPr>
+          <w:p>
+            <w:pPr>
+              <w:spacing w:after="0" w:before="0"/>
+              <w:jc w:val="right"/>
+            </w:pPr>
+            <w:r>
+              <w:rPr>
+                <w:rFonts w:ascii="Calibri" w:cs="Calibri" w:eastAsia="Calibri" w:hAnsi="Calibri"/>
+                <w:b w:val="false"/>
+                <w:bCs w:val="false"/>
+                <w:sz w:val="14"/>
+                <w:szCs w:val="14"/>
+              </w:rPr>
+              <w:t xml:space="preserve">612,76</w:t>
+            </w:r>
+          </w:p>
+        </w:tc>
+      </w:tr>
+      <w:tr>
+        <w:tc>
+          <w:tcPr>
+            <w:tcW w:type="dxa" w:w="1928"/>
+            <w:tcBorders>
+              <w:top w:val="single" w:color="808080" w:sz="4"/>
+              <w:left w:val="single" w:color="808080" w:sz="4"/>
+              <w:bottom w:val="single" w:color="808080" w:sz="4"/>
+              <w:right w:val="single" w:color="808080" w:sz="4"/>
+            </w:tcBorders>
+            <w:shd w:fill="EDEDED" w:color="auto" w:val="clear"/>
+            <w:tcMar>
+              <w:top w:type="dxa" w:w="40"/>
+              <w:left w:type="dxa" w:w="60"/>
+              <w:bottom w:type="dxa" w:w="40"/>
+              <w:right w:type="dxa" w:w="60"/>
+            </w:tcMar>
+            <w:vAlign w:val="center"/>
+          </w:tcPr>
+          <w:p>
+            <w:pPr>
+              <w:spacing w:after="0" w:before="0"/>
+              <w:jc w:val="left"/>
+            </w:pPr>
+            <w:r>
+              <w:rPr>
+                <w:rFonts w:ascii="Calibri" w:cs="Calibri" w:eastAsia="Calibri" w:hAnsi="Calibri"/>
+                <w:b/>
+                <w:bCs/>
+                <w:sz w:val="14"/>
+                <w:szCs w:val="14"/>
+              </w:rPr>
+              <w:t xml:space="preserve">İnce yapı ve tamamlayıcı imalatlar</w:t>
+            </w:r>
+          </w:p>
+        </w:tc>
+        <w:tc>
+          <w:tcPr>
+            <w:tcW w:type="dxa" w:w="454"/>
+            <w:tcBorders>
+              <w:top w:val="single" w:color="808080" w:sz="4"/>
+              <w:left w:val="single" w:color="808080" w:sz="4"/>
+              <w:bottom w:val="single" w:color="808080" w:sz="4"/>
+              <w:right w:val="single" w:color="808080" w:sz="4"/>
+            </w:tcBorders>
+            <w:tcMar>
+              <w:top w:type="dxa" w:w="40"/>
+              <w:left w:type="dxa" w:w="60"/>
+              <w:bottom w:type="dxa" w:w="40"/>
+              <w:right w:type="dxa" w:w="60"/>
+            </w:tcMar>
+            <w:vAlign w:val="top"/>
+          </w:tcPr>
+          <w:p>
+            <w:pPr>
+              <w:spacing w:after="0" w:before="0"/>
+              <w:jc w:val="center"/>
+            </w:pPr>
+            <w:r>
+              <w:rPr>
+                <w:rFonts w:ascii="Calibri" w:cs="Calibri" w:eastAsia="Calibri" w:hAnsi="Calibri"/>
+                <w:b w:val="false"/>
+                <w:bCs w:val="false"/>
+                <w:sz w:val="14"/>
+                <w:szCs w:val="14"/>
+              </w:rPr>
+              <w:t xml:space="preserve">1</w:t>
+            </w:r>
+          </w:p>
+        </w:tc>
+        <w:tc>
+          <w:tcPr>
+            <w:tcW w:type="dxa" w:w="1134"/>
+            <w:tcBorders>
+              <w:top w:val="single" w:color="808080" w:sz="4"/>
+              <w:left w:val="single" w:color="808080" w:sz="4"/>
+              <w:bottom w:val="single" w:color="808080" w:sz="4"/>
+              <w:right w:val="single" w:color="808080" w:sz="4"/>
+            </w:tcBorders>
+            <w:tcMar>
+              <w:top w:type="dxa" w:w="40"/>
+              <w:left w:type="dxa" w:w="60"/>
+              <w:bottom w:type="dxa" w:w="40"/>
+              <w:right w:type="dxa" w:w="60"/>
+            </w:tcMar>
+            <w:vAlign w:val="top"/>
+          </w:tcPr>
+          <w:p>
+            <w:pPr>
+              <w:spacing w:after="0" w:before="0"/>
+              <w:jc w:val="center"/>
+            </w:pPr>
+            <w:r>
+              <w:rPr>
+                <w:rFonts w:ascii="Calibri" w:cs="Calibri" w:eastAsia="Calibri" w:hAnsi="Calibri"/>
+                <w:b w:val="false"/>
+                <w:bCs w:val="false"/>
+                <w:sz w:val="14"/>
+                <w:szCs w:val="14"/>
+              </w:rPr>
+              <w:t xml:space="preserve">TKDK-0177</w:t>
+            </w:r>
+          </w:p>
+        </w:tc>
+        <w:tc>
+          <w:tcPr>
+            <w:tcW w:type="dxa" w:w="5102"/>
+            <w:tcBorders>
+              <w:top w:val="single" w:color="808080" w:sz="4"/>
+              <w:left w:val="single" w:color="808080" w:sz="4"/>
+              <w:bottom w:val="single" w:color="808080" w:sz="4"/>
+              <w:right w:val="single" w:color="808080" w:sz="4"/>
+            </w:tcBorders>
+            <w:tcMar>
+              <w:top w:type="dxa" w:w="40"/>
+              <w:left w:type="dxa" w:w="60"/>
+              <w:bottom w:type="dxa" w:w="40"/>
+              <w:right w:type="dxa" w:w="60"/>
+            </w:tcMar>
+            <w:vAlign w:val="top"/>
+          </w:tcPr>
+          <w:p>
+            <w:pPr>
+              <w:spacing w:after="0" w:before="0"/>
+              <w:jc w:val="left"/>
+            </w:pPr>
+            <w:r>
+              <w:rPr>
+                <w:rFonts w:ascii="Calibri" w:cs="Calibri" w:eastAsia="Calibri" w:hAnsi="Calibri"/>
+                <w:b w:val="false"/>
+                <w:bCs w:val="false"/>
+                <w:sz w:val="14"/>
+                <w:szCs w:val="14"/>
+              </w:rPr>
+              <w:t xml:space="preserve">(25x70 - 25x75 - 40x80 cm) anma ebatlarında, her türlü desen ve yüzey özelliğinde, renkli duvar karosu ile 3 mm derz aralıklı döşeme, duvar ve cephe kaplaması yapılması (karo yapıştırıcısı ile)</w:t>
+            </w:r>
+          </w:p>
+        </w:tc>
+        <w:tc>
+          <w:tcPr>
+            <w:tcW w:type="dxa" w:w="680"/>
+            <w:tcBorders>
+              <w:top w:val="single" w:color="808080" w:sz="4"/>
+              <w:left w:val="single" w:color="808080" w:sz="4"/>
+              <w:bottom w:val="single" w:color="808080" w:sz="4"/>
+              <w:right w:val="single" w:color="808080" w:sz="4"/>
+            </w:tcBorders>
+            <w:tcMar>
+              <w:top w:type="dxa" w:w="40"/>
+              <w:left w:type="dxa" w:w="60"/>
+              <w:bottom w:type="dxa" w:w="40"/>
+              <w:right w:type="dxa" w:w="60"/>
+            </w:tcMar>
+            <w:vAlign w:val="top"/>
+          </w:tcPr>
+          <w:p>
+            <w:pPr>
+              <w:spacing w:after="0" w:before="0"/>
+              <w:jc w:val="center"/>
+            </w:pPr>
+            <w:r>
+              <w:rPr>
+                <w:rFonts w:ascii="Calibri" w:cs="Calibri" w:eastAsia="Calibri" w:hAnsi="Calibri"/>
+                <w:b w:val="false"/>
+                <w:bCs w:val="false"/>
+                <w:sz w:val="14"/>
+                <w:szCs w:val="14"/>
+              </w:rPr>
+              <w:t xml:space="preserve">m²</w:t>
+            </w:r>
+          </w:p>
+        </w:tc>
+        <w:tc>
+          <w:tcPr>
+            <w:tcW w:type="dxa" w:w="1134"/>
+            <w:tcBorders>
+              <w:top w:val="single" w:color="808080" w:sz="4"/>
+              <w:left w:val="single" w:color="808080" w:sz="4"/>
+              <w:bottom w:val="single" w:color="808080" w:sz="4"/>
+              <w:right w:val="single" w:color="808080" w:sz="4"/>
+            </w:tcBorders>
+            <w:tcMar>
+              <w:top w:type="dxa" w:w="40"/>
+              <w:left w:type="dxa" w:w="60"/>
+              <w:bottom w:type="dxa" w:w="40"/>
+              <w:right w:type="dxa" w:w="60"/>
+            </w:tcMar>
+            <w:vAlign w:val="top"/>
+          </w:tcPr>
+          <w:p>
+            <w:pPr>
+              <w:spacing w:after="0" w:before="0"/>
+              <w:jc w:val="right"/>
+            </w:pPr>
+            <w:r>
+              <w:rPr>
+                <w:rFonts w:ascii="Calibri" w:cs="Calibri" w:eastAsia="Calibri" w:hAnsi="Calibri"/>
+                <w:b w:val="false"/>
+                <w:bCs w:val="false"/>
+                <w:sz w:val="14"/>
+                <w:szCs w:val="14"/>
+              </w:rPr>
+              <w:t xml:space="preserve">60,00</w:t>
+            </w:r>
+          </w:p>
+        </w:tc>
+      </w:tr>
+      <w:tr>
+        <w:tc>
+          <w:tcPr>
+            <w:tcW w:type="dxa" w:w="1928"/>
+            <w:tcBorders>
+              <w:top w:val="single" w:color="808080" w:sz="4"/>
+              <w:left w:val="single" w:color="808080" w:sz="4"/>
+              <w:bottom w:val="single" w:color="808080" w:sz="4"/>
+              <w:right w:val="single" w:color="808080" w:sz="4"/>
+            </w:tcBorders>
+            <w:shd w:fill="EDEDED" w:color="auto" w:val="clear"/>
+            <w:tcMar>
+              <w:top w:type="dxa" w:w="40"/>
+              <w:left w:type="dxa" w:w="60"/>
+              <w:bottom w:type="dxa" w:w="40"/>
+              <w:right w:type="dxa" w:w="60"/>
+            </w:tcMar>
+            <w:vAlign w:val="center"/>
+          </w:tcPr>
+          <w:p>
+            <w:pPr>
+              <w:spacing w:after="0" w:before="0"/>
+              <w:jc w:val="left"/>
+            </w:pPr>
+            <w:r>
+              <w:rPr>
+                <w:rFonts w:ascii="Calibri" w:cs="Calibri" w:eastAsia="Calibri" w:hAnsi="Calibri"/>
+                <w:b/>
+                <w:bCs/>
+                <w:sz w:val="14"/>
+                <w:szCs w:val="14"/>
+              </w:rPr>
+              <w:t xml:space="preserve">Kanalizasyon işleri</w:t>
+            </w:r>
+          </w:p>
+        </w:tc>
+        <w:tc>
+          <w:tcPr>
+            <w:tcW w:type="dxa" w:w="454"/>
+            <w:tcBorders>
+              <w:top w:val="single" w:color="808080" w:sz="4"/>
+              <w:left w:val="single" w:color="808080" w:sz="4"/>
+              <w:bottom w:val="single" w:color="808080" w:sz="4"/>
+              <w:right w:val="single" w:color="808080" w:sz="4"/>
+            </w:tcBorders>
+            <w:tcMar>
+              <w:top w:type="dxa" w:w="40"/>
+              <w:left w:type="dxa" w:w="60"/>
+              <w:bottom w:type="dxa" w:w="40"/>
+              <w:right w:type="dxa" w:w="60"/>
+            </w:tcMar>
+            <w:vAlign w:val="top"/>
+          </w:tcPr>
+          <w:p>
+            <w:pPr>
+              <w:spacing w:after="0" w:before="0"/>
+              <w:jc w:val="center"/>
+            </w:pPr>
+            <w:r>
+              <w:rPr>
+                <w:rFonts w:ascii="Calibri" w:cs="Calibri" w:eastAsia="Calibri" w:hAnsi="Calibri"/>
+                <w:b w:val="false"/>
+                <w:bCs w:val="false"/>
+                <w:sz w:val="14"/>
+                <w:szCs w:val="14"/>
+              </w:rPr>
+              <w:t xml:space="preserve">1</w:t>
+            </w:r>
+          </w:p>
+        </w:tc>
+        <w:tc>
+          <w:tcPr>
+            <w:tcW w:type="dxa" w:w="1134"/>
+            <w:tcBorders>
+              <w:top w:val="single" w:color="808080" w:sz="4"/>
+              <w:left w:val="single" w:color="808080" w:sz="4"/>
+              <w:bottom w:val="single" w:color="808080" w:sz="4"/>
+              <w:right w:val="single" w:color="808080" w:sz="4"/>
+            </w:tcBorders>
+            <w:tcMar>
+              <w:top w:type="dxa" w:w="40"/>
+              <w:left w:type="dxa" w:w="60"/>
+              <w:bottom w:type="dxa" w:w="40"/>
+              <w:right w:type="dxa" w:w="60"/>
+            </w:tcMar>
+            <w:vAlign w:val="top"/>
+          </w:tcPr>
+          <w:p>
+            <w:pPr>
+              <w:spacing w:after="0" w:before="0"/>
+              <w:jc w:val="center"/>
+            </w:pPr>
+            <w:r>
+              <w:rPr>
+                <w:rFonts w:ascii="Calibri" w:cs="Calibri" w:eastAsia="Calibri" w:hAnsi="Calibri"/>
+                <w:b w:val="false"/>
+                <w:bCs w:val="false"/>
+                <w:sz w:val="14"/>
+                <w:szCs w:val="14"/>
+              </w:rPr>
+              <w:t xml:space="preserve">43.527.1001</w:t>
+            </w:r>
+          </w:p>
+        </w:tc>
+        <w:tc>
+          <w:tcPr>
+            <w:tcW w:type="dxa" w:w="5102"/>
+            <w:tcBorders>
+              <w:top w:val="single" w:color="808080" w:sz="4"/>
+              <w:left w:val="single" w:color="808080" w:sz="4"/>
+              <w:bottom w:val="single" w:color="808080" w:sz="4"/>
+              <w:right w:val="single" w:color="808080" w:sz="4"/>
+            </w:tcBorders>
+            <w:tcMar>
+              <w:top w:type="dxa" w:w="40"/>
+              <w:left w:type="dxa" w:w="60"/>
+              <w:bottom w:type="dxa" w:w="40"/>
+              <w:right w:type="dxa" w:w="60"/>
+            </w:tcMar>
+            <w:vAlign w:val="top"/>
+          </w:tcPr>
+          <w:p>
+            <w:pPr>
+              <w:spacing w:after="0" w:before="0"/>
+              <w:jc w:val="left"/>
+            </w:pPr>
+            <w:r>
+              <w:rPr>
+                <w:rFonts w:ascii="Calibri" w:cs="Calibri" w:eastAsia="Calibri" w:hAnsi="Calibri"/>
+                <w:b w:val="false"/>
+                <w:bCs w:val="false"/>
+                <w:sz w:val="14"/>
+                <w:szCs w:val="14"/>
+              </w:rPr>
+              <w:t xml:space="preserve">Çapı 150 mm HDPE koruge boru döşenmesi (SN 8, lastik conta ve boru bedeli dahil)</w:t>
+            </w:r>
+          </w:p>
+        </w:tc>
+        <w:tc>
+          <w:tcPr>
+            <w:tcW w:type="dxa" w:w="680"/>
+            <w:tcBorders>
+              <w:top w:val="single" w:color="808080" w:sz="4"/>
+              <w:left w:val="single" w:color="808080" w:sz="4"/>
+              <w:bottom w:val="single" w:color="808080" w:sz="4"/>
+              <w:right w:val="single" w:color="808080" w:sz="4"/>
+            </w:tcBorders>
+            <w:tcMar>
+              <w:top w:type="dxa" w:w="40"/>
+              <w:left w:type="dxa" w:w="60"/>
+              <w:bottom w:type="dxa" w:w="40"/>
+              <w:right w:type="dxa" w:w="60"/>
+            </w:tcMar>
+            <w:vAlign w:val="top"/>
+          </w:tcPr>
+          <w:p>
+            <w:pPr>
+              <w:spacing w:after="0" w:before="0"/>
+              <w:jc w:val="center"/>
+            </w:pPr>
+            <w:r>
+              <w:rPr>
+                <w:rFonts w:ascii="Calibri" w:cs="Calibri" w:eastAsia="Calibri" w:hAnsi="Calibri"/>
+                <w:b w:val="false"/>
+                <w:bCs w:val="false"/>
+                <w:sz w:val="14"/>
+                <w:szCs w:val="14"/>
+              </w:rPr>
+              <w:t xml:space="preserve">m</w:t>
+            </w:r>
+          </w:p>
+        </w:tc>
+        <w:tc>
+          <w:tcPr>
+            <w:tcW w:type="dxa" w:w="1134"/>
+            <w:tcBorders>
+              <w:top w:val="single" w:color="808080" w:sz="4"/>
+              <w:left w:val="single" w:color="808080" w:sz="4"/>
+              <w:bottom w:val="single" w:color="808080" w:sz="4"/>
+              <w:right w:val="single" w:color="808080" w:sz="4"/>
+            </w:tcBorders>
+            <w:tcMar>
+              <w:top w:type="dxa" w:w="40"/>
+              <w:left w:type="dxa" w:w="60"/>
+              <w:bottom w:type="dxa" w:w="40"/>
+              <w:right w:type="dxa" w:w="60"/>
+            </w:tcMar>
+            <w:vAlign w:val="top"/>
+          </w:tcPr>
+          <w:p>
+            <w:pPr>
+              <w:spacing w:after="0" w:before="0"/>
+              <w:jc w:val="right"/>
+            </w:pPr>
+            <w:r>
+              <w:rPr>
+                <w:rFonts w:ascii="Calibri" w:cs="Calibri" w:eastAsia="Calibri" w:hAnsi="Calibri"/>
+                <w:b w:val="false"/>
+                <w:bCs w:val="false"/>
+                <w:sz w:val="14"/>
+                <w:szCs w:val="14"/>
+              </w:rPr>
+              <w:t xml:space="preserve">25,00</w:t>
+            </w:r>
+          </w:p>
+        </w:tc>
+      </w:tr>
+      <w:tr>
+        <w:tc>
+          <w:tcPr>
             <w:tcW w:type="dxa" w:w="1928"/>
             <w:vMerge w:val="restart"/>
             <w:tcBorders>
@@ -3792,7 +4805,7 @@
                 <w:sz w:val="14"/>
                 <w:szCs w:val="14"/>
               </w:rPr>
-              <w:t xml:space="preserve">Sıva, alçı, derz ve şap işleri</w:t>
+              <w:t xml:space="preserve">Elektrik tesisatı ve aydınlatma</w:t>
             </w:r>
           </w:p>
         </w:tc>
@@ -3860,7 +4873,7 @@
                 <w:sz w:val="14"/>
                 <w:szCs w:val="14"/>
               </w:rPr>
-              <w:t xml:space="preserve">15.275.1116</w:t>
+              <w:t xml:space="preserve">30.100.2105</w:t>
             </w:r>
           </w:p>
         </w:tc>
@@ -3894,7 +4907,7 @@
                 <w:sz w:val="14"/>
                 <w:szCs w:val="14"/>
               </w:rPr>
-              <w:t xml:space="preserve">250 kg çimento dozlu harç ile kaba sıva yapılması</w:t>
+              <w:t xml:space="preserve">Kümes dağıtım panosu (sıva üstü galvanizli sac tablo, 0,40-0,50 m²)</w:t>
             </w:r>
           </w:p>
         </w:tc>
@@ -3928,7 +4941,7 @@
                 <w:sz w:val="14"/>
                 <w:szCs w:val="14"/>
               </w:rPr>
-              <w:t xml:space="preserve">m²</w:t>
+              <w:t xml:space="preserve">ad</w:t>
             </w:r>
           </w:p>
         </w:tc>
@@ -3962,7 +4975,7 @@
                 <w:sz w:val="14"/>
                 <w:szCs w:val="14"/>
               </w:rPr>
-              <w:t xml:space="preserve">557,76</w:t>
+              <w:t xml:space="preserve">1,00</w:t>
             </w:r>
           </w:p>
         </w:tc>
@@ -4044,7 +5057,7 @@
                 <w:sz w:val="14"/>
                 <w:szCs w:val="14"/>
               </w:rPr>
-              <w:t xml:space="preserve">15.275.1117</w:t>
+              <w:t xml:space="preserve">30.110.1102</w:t>
             </w:r>
           </w:p>
         </w:tc>
@@ -4078,7 +5091,7 @@
                 <w:sz w:val="14"/>
                 <w:szCs w:val="14"/>
               </w:rPr>
-              <w:t xml:space="preserve">200 kg çimento ve kireç karışımı harç ile kaba sıva yapılması (iç cephe)</w:t>
+              <w:t xml:space="preserve">Termik-manyetik kompakt şalter 3x100 A, Icu 35 kA — kümes besleme</w:t>
             </w:r>
           </w:p>
         </w:tc>
@@ -4112,7 +5125,7 @@
                 <w:sz w:val="14"/>
                 <w:szCs w:val="14"/>
               </w:rPr>
-              <w:t xml:space="preserve">m²</w:t>
+              <w:t xml:space="preserve">ad</w:t>
             </w:r>
           </w:p>
         </w:tc>
@@ -4146,7 +5159,7 @@
                 <w:sz w:val="14"/>
                 <w:szCs w:val="14"/>
               </w:rPr>
-              <w:t xml:space="preserve">647,76</w:t>
+              <w:t xml:space="preserve">1,00</w:t>
             </w:r>
           </w:p>
         </w:tc>
@@ -4154,22 +5167,100 @@
       <w:tr>
         <w:tc>
           <w:tcPr>
-            <w:tcW w:type="dxa" w:w="1928"/>
-            <w:vMerge w:val="restart"/>
-            <w:tcBorders>
-              <w:top w:val="single" w:color="808080" w:sz="4"/>
-              <w:left w:val="single" w:color="808080" w:sz="4"/>
-              <w:bottom w:val="single" w:color="808080" w:sz="4"/>
-              <w:right w:val="single" w:color="808080" w:sz="4"/>
-            </w:tcBorders>
-            <w:shd w:fill="EDEDED" w:color="auto" w:val="clear"/>
-            <w:tcMar>
-              <w:top w:type="dxa" w:w="40"/>
-              <w:left w:type="dxa" w:w="60"/>
-              <w:bottom w:type="dxa" w:w="40"/>
-              <w:right w:type="dxa" w:w="60"/>
-            </w:tcMar>
-            <w:vAlign w:val="center"/>
+            <w:vMerge w:val="continue"/>
+            <w:tcBorders>
+              <w:top w:val="single" w:color="808080" w:sz="4"/>
+              <w:left w:val="single" w:color="808080" w:sz="4"/>
+              <w:bottom w:val="single" w:color="808080" w:sz="4"/>
+              <w:right w:val="single" w:color="808080" w:sz="4"/>
+            </w:tcBorders>
+          </w:tcPr>
+          <w:p/>
+        </w:tc>
+        <w:tc>
+          <w:tcPr>
+            <w:tcW w:type="dxa" w:w="454"/>
+            <w:tcBorders>
+              <w:top w:val="single" w:color="808080" w:sz="4"/>
+              <w:left w:val="single" w:color="808080" w:sz="4"/>
+              <w:bottom w:val="single" w:color="808080" w:sz="4"/>
+              <w:right w:val="single" w:color="808080" w:sz="4"/>
+            </w:tcBorders>
+            <w:tcMar>
+              <w:top w:type="dxa" w:w="40"/>
+              <w:left w:type="dxa" w:w="60"/>
+              <w:bottom w:type="dxa" w:w="40"/>
+              <w:right w:type="dxa" w:w="60"/>
+            </w:tcMar>
+            <w:vAlign w:val="top"/>
+          </w:tcPr>
+          <w:p>
+            <w:pPr>
+              <w:spacing w:after="0" w:before="0"/>
+              <w:jc w:val="center"/>
+            </w:pPr>
+            <w:r>
+              <w:rPr>
+                <w:rFonts w:ascii="Calibri" w:cs="Calibri" w:eastAsia="Calibri" w:hAnsi="Calibri"/>
+                <w:b w:val="false"/>
+                <w:bCs w:val="false"/>
+                <w:sz w:val="14"/>
+                <w:szCs w:val="14"/>
+              </w:rPr>
+              <w:t xml:space="preserve">3</w:t>
+            </w:r>
+          </w:p>
+        </w:tc>
+        <w:tc>
+          <w:tcPr>
+            <w:tcW w:type="dxa" w:w="1134"/>
+            <w:tcBorders>
+              <w:top w:val="single" w:color="808080" w:sz="4"/>
+              <w:left w:val="single" w:color="808080" w:sz="4"/>
+              <w:bottom w:val="single" w:color="808080" w:sz="4"/>
+              <w:right w:val="single" w:color="808080" w:sz="4"/>
+            </w:tcBorders>
+            <w:tcMar>
+              <w:top w:type="dxa" w:w="40"/>
+              <w:left w:type="dxa" w:w="60"/>
+              <w:bottom w:type="dxa" w:w="40"/>
+              <w:right w:type="dxa" w:w="60"/>
+            </w:tcMar>
+            <w:vAlign w:val="top"/>
+          </w:tcPr>
+          <w:p>
+            <w:pPr>
+              <w:spacing w:after="0" w:before="0"/>
+              <w:jc w:val="center"/>
+            </w:pPr>
+            <w:r>
+              <w:rPr>
+                <w:rFonts w:ascii="Calibri" w:cs="Calibri" w:eastAsia="Calibri" w:hAnsi="Calibri"/>
+                <w:b w:val="false"/>
+                <w:bCs w:val="false"/>
+                <w:sz w:val="14"/>
+                <w:szCs w:val="14"/>
+              </w:rPr>
+              <w:t xml:space="preserve">30.115.1003</w:t>
+            </w:r>
+          </w:p>
+        </w:tc>
+        <w:tc>
+          <w:tcPr>
+            <w:tcW w:type="dxa" w:w="5102"/>
+            <w:tcBorders>
+              <w:top w:val="single" w:color="808080" w:sz="4"/>
+              <w:left w:val="single" w:color="808080" w:sz="4"/>
+              <w:bottom w:val="single" w:color="808080" w:sz="4"/>
+              <w:right w:val="single" w:color="808080" w:sz="4"/>
+            </w:tcBorders>
+            <w:tcMar>
+              <w:top w:type="dxa" w:w="40"/>
+              <w:left w:type="dxa" w:w="60"/>
+              <w:bottom w:type="dxa" w:w="40"/>
+              <w:right w:type="dxa" w:w="60"/>
+            </w:tcMar>
+            <w:vAlign w:val="top"/>
           </w:tcPr>
           <w:p>
             <w:pPr>
@@ -4179,46 +5270,46 @@
             <w:r>
               <w:rPr>
                 <w:rFonts w:ascii="Calibri" w:cs="Calibri" w:eastAsia="Calibri" w:hAnsi="Calibri"/>
-                <w:b/>
-                <w:bCs/>
-                <w:sz w:val="14"/>
-                <w:szCs w:val="14"/>
-              </w:rPr>
-              <w:t xml:space="preserve">Boya, badana ve cila işleri</w:t>
-            </w:r>
-          </w:p>
-        </w:tc>
-        <w:tc>
-          <w:tcPr>
-            <w:tcW w:type="dxa" w:w="454"/>
-            <w:tcBorders>
-              <w:top w:val="single" w:color="808080" w:sz="4"/>
-              <w:left w:val="single" w:color="808080" w:sz="4"/>
-              <w:bottom w:val="single" w:color="808080" w:sz="4"/>
-              <w:right w:val="single" w:color="808080" w:sz="4"/>
-            </w:tcBorders>
-            <w:tcMar>
-              <w:top w:type="dxa" w:w="40"/>
-              <w:left w:type="dxa" w:w="60"/>
-              <w:bottom w:type="dxa" w:w="40"/>
-              <w:right w:type="dxa" w:w="60"/>
-            </w:tcMar>
-            <w:vAlign w:val="top"/>
-          </w:tcPr>
-          <w:p>
-            <w:pPr>
-              <w:spacing w:after="0" w:before="0"/>
-              <w:jc w:val="center"/>
-            </w:pPr>
-            <w:r>
-              <w:rPr>
-                <w:rFonts w:ascii="Calibri" w:cs="Calibri" w:eastAsia="Calibri" w:hAnsi="Calibri"/>
-                <w:b w:val="false"/>
-                <w:bCs w:val="false"/>
-                <w:sz w:val="14"/>
-                <w:szCs w:val="14"/>
-              </w:rPr>
-              <w:t xml:space="preserve">1</w:t>
+                <w:b w:val="false"/>
+                <w:bCs w:val="false"/>
+                <w:sz w:val="14"/>
+                <w:szCs w:val="14"/>
+              </w:rPr>
+              <w:t xml:space="preserve">Kaçak akım koruma şalteri 2x63 A, 30 mA</w:t>
+            </w:r>
+          </w:p>
+        </w:tc>
+        <w:tc>
+          <w:tcPr>
+            <w:tcW w:type="dxa" w:w="680"/>
+            <w:tcBorders>
+              <w:top w:val="single" w:color="808080" w:sz="4"/>
+              <w:left w:val="single" w:color="808080" w:sz="4"/>
+              <w:bottom w:val="single" w:color="808080" w:sz="4"/>
+              <w:right w:val="single" w:color="808080" w:sz="4"/>
+            </w:tcBorders>
+            <w:tcMar>
+              <w:top w:type="dxa" w:w="40"/>
+              <w:left w:type="dxa" w:w="60"/>
+              <w:bottom w:type="dxa" w:w="40"/>
+              <w:right w:type="dxa" w:w="60"/>
+            </w:tcMar>
+            <w:vAlign w:val="top"/>
+          </w:tcPr>
+          <w:p>
+            <w:pPr>
+              <w:spacing w:after="0" w:before="0"/>
+              <w:jc w:val="center"/>
+            </w:pPr>
+            <w:r>
+              <w:rPr>
+                <w:rFonts w:ascii="Calibri" w:cs="Calibri" w:eastAsia="Calibri" w:hAnsi="Calibri"/>
+                <w:b w:val="false"/>
+                <w:bCs w:val="false"/>
+                <w:sz w:val="14"/>
+                <w:szCs w:val="14"/>
+              </w:rPr>
+              <w:t xml:space="preserve">ad</w:t>
             </w:r>
           </w:p>
         </w:tc>
@@ -4242,108 +5333,6 @@
           <w:p>
             <w:pPr>
               <w:spacing w:after="0" w:before="0"/>
-              <w:jc w:val="center"/>
-            </w:pPr>
-            <w:r>
-              <w:rPr>
-                <w:rFonts w:ascii="Calibri" w:cs="Calibri" w:eastAsia="Calibri" w:hAnsi="Calibri"/>
-                <w:b w:val="false"/>
-                <w:bCs w:val="false"/>
-                <w:sz w:val="14"/>
-                <w:szCs w:val="14"/>
-              </w:rPr>
-              <w:t xml:space="preserve">15.540.1606</w:t>
-            </w:r>
-          </w:p>
-        </w:tc>
-        <w:tc>
-          <w:tcPr>
-            <w:tcW w:type="dxa" w:w="5102"/>
-            <w:tcBorders>
-              <w:top w:val="single" w:color="808080" w:sz="4"/>
-              <w:left w:val="single" w:color="808080" w:sz="4"/>
-              <w:bottom w:val="single" w:color="808080" w:sz="4"/>
-              <w:right w:val="single" w:color="808080" w:sz="4"/>
-            </w:tcBorders>
-            <w:tcMar>
-              <w:top w:type="dxa" w:w="40"/>
-              <w:left w:type="dxa" w:w="60"/>
-              <w:bottom w:type="dxa" w:w="40"/>
-              <w:right w:type="dxa" w:w="60"/>
-            </w:tcMar>
-            <w:vAlign w:val="top"/>
-          </w:tcPr>
-          <w:p>
-            <w:pPr>
-              <w:spacing w:after="0" w:before="0"/>
-              <w:jc w:val="left"/>
-            </w:pPr>
-            <w:r>
-              <w:rPr>
-                <w:rFonts w:ascii="Calibri" w:cs="Calibri" w:eastAsia="Calibri" w:hAnsi="Calibri"/>
-                <w:b w:val="false"/>
-                <w:bCs w:val="false"/>
-                <w:sz w:val="14"/>
-                <w:szCs w:val="14"/>
-              </w:rPr>
-              <w:t xml:space="preserve">Brüt beton, sıvalı veya eski boyalı yüzeylere astar uygulanarak silikon esaslı su bazlı dış cephe boyası yapılması</w:t>
-            </w:r>
-          </w:p>
-        </w:tc>
-        <w:tc>
-          <w:tcPr>
-            <w:tcW w:type="dxa" w:w="680"/>
-            <w:tcBorders>
-              <w:top w:val="single" w:color="808080" w:sz="4"/>
-              <w:left w:val="single" w:color="808080" w:sz="4"/>
-              <w:bottom w:val="single" w:color="808080" w:sz="4"/>
-              <w:right w:val="single" w:color="808080" w:sz="4"/>
-            </w:tcBorders>
-            <w:tcMar>
-              <w:top w:type="dxa" w:w="40"/>
-              <w:left w:type="dxa" w:w="60"/>
-              <w:bottom w:type="dxa" w:w="40"/>
-              <w:right w:type="dxa" w:w="60"/>
-            </w:tcMar>
-            <w:vAlign w:val="top"/>
-          </w:tcPr>
-          <w:p>
-            <w:pPr>
-              <w:spacing w:after="0" w:before="0"/>
-              <w:jc w:val="center"/>
-            </w:pPr>
-            <w:r>
-              <w:rPr>
-                <w:rFonts w:ascii="Calibri" w:cs="Calibri" w:eastAsia="Calibri" w:hAnsi="Calibri"/>
-                <w:b w:val="false"/>
-                <w:bCs w:val="false"/>
-                <w:sz w:val="14"/>
-                <w:szCs w:val="14"/>
-              </w:rPr>
-              <w:t xml:space="preserve">m²</w:t>
-            </w:r>
-          </w:p>
-        </w:tc>
-        <w:tc>
-          <w:tcPr>
-            <w:tcW w:type="dxa" w:w="1134"/>
-            <w:tcBorders>
-              <w:top w:val="single" w:color="808080" w:sz="4"/>
-              <w:left w:val="single" w:color="808080" w:sz="4"/>
-              <w:bottom w:val="single" w:color="808080" w:sz="4"/>
-              <w:right w:val="single" w:color="808080" w:sz="4"/>
-            </w:tcBorders>
-            <w:tcMar>
-              <w:top w:type="dxa" w:w="40"/>
-              <w:left w:type="dxa" w:w="60"/>
-              <w:bottom w:type="dxa" w:w="40"/>
-              <w:right w:type="dxa" w:w="60"/>
-            </w:tcMar>
-            <w:vAlign w:val="top"/>
-          </w:tcPr>
-          <w:p>
-            <w:pPr>
-              <w:spacing w:after="0" w:before="0"/>
               <w:jc w:val="right"/>
             </w:pPr>
             <w:r>
@@ -4354,7 +5343,7 @@
                 <w:sz w:val="14"/>
                 <w:szCs w:val="14"/>
               </w:rPr>
-              <w:t xml:space="preserve">557,76</w:t>
+              <w:t xml:space="preserve">2,00</w:t>
             </w:r>
           </w:p>
         </w:tc>
@@ -4402,7 +5391,7 @@
                 <w:sz w:val="14"/>
                 <w:szCs w:val="14"/>
               </w:rPr>
-              <w:t xml:space="preserve">2</w:t>
+              <w:t xml:space="preserve">4</w:t>
             </w:r>
           </w:p>
         </w:tc>
@@ -4436,7 +5425,7 @@
                 <w:sz w:val="14"/>
                 <w:szCs w:val="14"/>
               </w:rPr>
-              <w:t xml:space="preserve">15.540.1537</w:t>
+              <w:t xml:space="preserve">30.140.3104</w:t>
             </w:r>
           </w:p>
         </w:tc>
@@ -4470,7 +5459,7 @@
                 <w:sz w:val="14"/>
                 <w:szCs w:val="14"/>
               </w:rPr>
-              <w:t xml:space="preserve">Yeni sıva yüzeylere astar uygulanarak iki kat su bazlı plastik antibakteriyel iç cephe boyası yapılması</w:t>
+              <w:t xml:space="preserve">YVV (NYY) 1 kV yeraltı kablosu ile kolon hattı tesisi — 1x25 mm²</w:t>
             </w:r>
           </w:p>
         </w:tc>
@@ -4504,7 +5493,7 @@
                 <w:sz w:val="14"/>
                 <w:szCs w:val="14"/>
               </w:rPr>
-              <w:t xml:space="preserve">m²</w:t>
+              <w:t xml:space="preserve">m</w:t>
             </w:r>
           </w:p>
         </w:tc>
@@ -4538,7 +5527,7 @@
                 <w:sz w:val="14"/>
                 <w:szCs w:val="14"/>
               </w:rPr>
-              <w:t xml:space="preserve">612,76</w:t>
+              <w:t xml:space="preserve">300,00</w:t>
             </w:r>
           </w:p>
         </w:tc>
@@ -4546,21 +5535,100 @@
       <w:tr>
         <w:tc>
           <w:tcPr>
-            <w:tcW w:type="dxa" w:w="1928"/>
-            <w:tcBorders>
-              <w:top w:val="single" w:color="808080" w:sz="4"/>
-              <w:left w:val="single" w:color="808080" w:sz="4"/>
-              <w:bottom w:val="single" w:color="808080" w:sz="4"/>
-              <w:right w:val="single" w:color="808080" w:sz="4"/>
-            </w:tcBorders>
-            <w:shd w:fill="EDEDED" w:color="auto" w:val="clear"/>
-            <w:tcMar>
-              <w:top w:type="dxa" w:w="40"/>
-              <w:left w:type="dxa" w:w="60"/>
-              <w:bottom w:type="dxa" w:w="40"/>
-              <w:right w:type="dxa" w:w="60"/>
-            </w:tcMar>
-            <w:vAlign w:val="center"/>
+            <w:vMerge w:val="continue"/>
+            <w:tcBorders>
+              <w:top w:val="single" w:color="808080" w:sz="4"/>
+              <w:left w:val="single" w:color="808080" w:sz="4"/>
+              <w:bottom w:val="single" w:color="808080" w:sz="4"/>
+              <w:right w:val="single" w:color="808080" w:sz="4"/>
+            </w:tcBorders>
+          </w:tcPr>
+          <w:p/>
+        </w:tc>
+        <w:tc>
+          <w:tcPr>
+            <w:tcW w:type="dxa" w:w="454"/>
+            <w:tcBorders>
+              <w:top w:val="single" w:color="808080" w:sz="4"/>
+              <w:left w:val="single" w:color="808080" w:sz="4"/>
+              <w:bottom w:val="single" w:color="808080" w:sz="4"/>
+              <w:right w:val="single" w:color="808080" w:sz="4"/>
+            </w:tcBorders>
+            <w:tcMar>
+              <w:top w:type="dxa" w:w="40"/>
+              <w:left w:type="dxa" w:w="60"/>
+              <w:bottom w:type="dxa" w:w="40"/>
+              <w:right w:type="dxa" w:w="60"/>
+            </w:tcMar>
+            <w:vAlign w:val="top"/>
+          </w:tcPr>
+          <w:p>
+            <w:pPr>
+              <w:spacing w:after="0" w:before="0"/>
+              <w:jc w:val="center"/>
+            </w:pPr>
+            <w:r>
+              <w:rPr>
+                <w:rFonts w:ascii="Calibri" w:cs="Calibri" w:eastAsia="Calibri" w:hAnsi="Calibri"/>
+                <w:b w:val="false"/>
+                <w:bCs w:val="false"/>
+                <w:sz w:val="14"/>
+                <w:szCs w:val="14"/>
+              </w:rPr>
+              <w:t xml:space="preserve">5</w:t>
+            </w:r>
+          </w:p>
+        </w:tc>
+        <w:tc>
+          <w:tcPr>
+            <w:tcW w:type="dxa" w:w="1134"/>
+            <w:tcBorders>
+              <w:top w:val="single" w:color="808080" w:sz="4"/>
+              <w:left w:val="single" w:color="808080" w:sz="4"/>
+              <w:bottom w:val="single" w:color="808080" w:sz="4"/>
+              <w:right w:val="single" w:color="808080" w:sz="4"/>
+            </w:tcBorders>
+            <w:tcMar>
+              <w:top w:type="dxa" w:w="40"/>
+              <w:left w:type="dxa" w:w="60"/>
+              <w:bottom w:type="dxa" w:w="40"/>
+              <w:right w:type="dxa" w:w="60"/>
+            </w:tcMar>
+            <w:vAlign w:val="top"/>
+          </w:tcPr>
+          <w:p>
+            <w:pPr>
+              <w:spacing w:after="0" w:before="0"/>
+              <w:jc w:val="center"/>
+            </w:pPr>
+            <w:r>
+              <w:rPr>
+                <w:rFonts w:ascii="Calibri" w:cs="Calibri" w:eastAsia="Calibri" w:hAnsi="Calibri"/>
+                <w:b w:val="false"/>
+                <w:bCs w:val="false"/>
+                <w:sz w:val="14"/>
+                <w:szCs w:val="14"/>
+              </w:rPr>
+              <w:t xml:space="preserve">30.170.1602</w:t>
+            </w:r>
+          </w:p>
+        </w:tc>
+        <w:tc>
+          <w:tcPr>
+            <w:tcW w:type="dxa" w:w="5102"/>
+            <w:tcBorders>
+              <w:top w:val="single" w:color="808080" w:sz="4"/>
+              <w:left w:val="single" w:color="808080" w:sz="4"/>
+              <w:bottom w:val="single" w:color="808080" w:sz="4"/>
+              <w:right w:val="single" w:color="808080" w:sz="4"/>
+            </w:tcBorders>
+            <w:tcMar>
+              <w:top w:type="dxa" w:w="40"/>
+              <w:left w:type="dxa" w:w="60"/>
+              <w:bottom w:type="dxa" w:w="40"/>
+              <w:right w:type="dxa" w:w="60"/>
+            </w:tcMar>
+            <w:vAlign w:val="top"/>
           </w:tcPr>
           <w:p>
             <w:pPr>
@@ -4570,46 +5638,46 @@
             <w:r>
               <w:rPr>
                 <w:rFonts w:ascii="Calibri" w:cs="Calibri" w:eastAsia="Calibri" w:hAnsi="Calibri"/>
-                <w:b/>
-                <w:bCs/>
-                <w:sz w:val="14"/>
-                <w:szCs w:val="14"/>
-              </w:rPr>
-              <w:t xml:space="preserve">İnce yapı ve tamamlayıcı imalatlar</w:t>
-            </w:r>
-          </w:p>
-        </w:tc>
-        <w:tc>
-          <w:tcPr>
-            <w:tcW w:type="dxa" w:w="454"/>
-            <w:tcBorders>
-              <w:top w:val="single" w:color="808080" w:sz="4"/>
-              <w:left w:val="single" w:color="808080" w:sz="4"/>
-              <w:bottom w:val="single" w:color="808080" w:sz="4"/>
-              <w:right w:val="single" w:color="808080" w:sz="4"/>
-            </w:tcBorders>
-            <w:tcMar>
-              <w:top w:type="dxa" w:w="40"/>
-              <w:left w:type="dxa" w:w="60"/>
-              <w:bottom w:type="dxa" w:w="40"/>
-              <w:right w:type="dxa" w:w="60"/>
-            </w:tcMar>
-            <w:vAlign w:val="top"/>
-          </w:tcPr>
-          <w:p>
-            <w:pPr>
-              <w:spacing w:after="0" w:before="0"/>
-              <w:jc w:val="center"/>
-            </w:pPr>
-            <w:r>
-              <w:rPr>
-                <w:rFonts w:ascii="Calibri" w:cs="Calibri" w:eastAsia="Calibri" w:hAnsi="Calibri"/>
-                <w:b w:val="false"/>
-                <w:bCs w:val="false"/>
-                <w:sz w:val="14"/>
-                <w:szCs w:val="14"/>
-              </w:rPr>
-              <w:t xml:space="preserve">1</w:t>
+                <w:b w:val="false"/>
+                <w:bCs w:val="false"/>
+                <w:sz w:val="14"/>
+                <w:szCs w:val="14"/>
+              </w:rPr>
+              <w:t xml:space="preserve">LED sıva üstü etanj armatür (polikarbon gövdeli), ışık akısı en az 2700 lm — kümes genel aydınlatması</w:t>
+            </w:r>
+          </w:p>
+        </w:tc>
+        <w:tc>
+          <w:tcPr>
+            <w:tcW w:type="dxa" w:w="680"/>
+            <w:tcBorders>
+              <w:top w:val="single" w:color="808080" w:sz="4"/>
+              <w:left w:val="single" w:color="808080" w:sz="4"/>
+              <w:bottom w:val="single" w:color="808080" w:sz="4"/>
+              <w:right w:val="single" w:color="808080" w:sz="4"/>
+            </w:tcBorders>
+            <w:tcMar>
+              <w:top w:type="dxa" w:w="40"/>
+              <w:left w:type="dxa" w:w="60"/>
+              <w:bottom w:type="dxa" w:w="40"/>
+              <w:right w:type="dxa" w:w="60"/>
+            </w:tcMar>
+            <w:vAlign w:val="top"/>
+          </w:tcPr>
+          <w:p>
+            <w:pPr>
+              <w:spacing w:after="0" w:before="0"/>
+              <w:jc w:val="center"/>
+            </w:pPr>
+            <w:r>
+              <w:rPr>
+                <w:rFonts w:ascii="Calibri" w:cs="Calibri" w:eastAsia="Calibri" w:hAnsi="Calibri"/>
+                <w:b w:val="false"/>
+                <w:bCs w:val="false"/>
+                <w:sz w:val="14"/>
+                <w:szCs w:val="14"/>
+              </w:rPr>
+              <w:t xml:space="preserve">ad</w:t>
             </w:r>
           </w:p>
         </w:tc>
@@ -4633,108 +5701,6 @@
           <w:p>
             <w:pPr>
               <w:spacing w:after="0" w:before="0"/>
-              <w:jc w:val="center"/>
-            </w:pPr>
-            <w:r>
-              <w:rPr>
-                <w:rFonts w:ascii="Calibri" w:cs="Calibri" w:eastAsia="Calibri" w:hAnsi="Calibri"/>
-                <w:b w:val="false"/>
-                <w:bCs w:val="false"/>
-                <w:sz w:val="14"/>
-                <w:szCs w:val="14"/>
-              </w:rPr>
-              <w:t xml:space="preserve">TKDK-0177</w:t>
-            </w:r>
-          </w:p>
-        </w:tc>
-        <w:tc>
-          <w:tcPr>
-            <w:tcW w:type="dxa" w:w="5102"/>
-            <w:tcBorders>
-              <w:top w:val="single" w:color="808080" w:sz="4"/>
-              <w:left w:val="single" w:color="808080" w:sz="4"/>
-              <w:bottom w:val="single" w:color="808080" w:sz="4"/>
-              <w:right w:val="single" w:color="808080" w:sz="4"/>
-            </w:tcBorders>
-            <w:tcMar>
-              <w:top w:type="dxa" w:w="40"/>
-              <w:left w:type="dxa" w:w="60"/>
-              <w:bottom w:type="dxa" w:w="40"/>
-              <w:right w:type="dxa" w:w="60"/>
-            </w:tcMar>
-            <w:vAlign w:val="top"/>
-          </w:tcPr>
-          <w:p>
-            <w:pPr>
-              <w:spacing w:after="0" w:before="0"/>
-              <w:jc w:val="left"/>
-            </w:pPr>
-            <w:r>
-              <w:rPr>
-                <w:rFonts w:ascii="Calibri" w:cs="Calibri" w:eastAsia="Calibri" w:hAnsi="Calibri"/>
-                <w:b w:val="false"/>
-                <w:bCs w:val="false"/>
-                <w:sz w:val="14"/>
-                <w:szCs w:val="14"/>
-              </w:rPr>
-              <w:t xml:space="preserve">(25x70 - 25x75 - 40x80 cm) anma ebatlarında, her türlü desen ve yüzey özelliğinde, renkli duvar karosu ile 3 mm derz aralıklı döşeme, duvar ve cephe kaplaması yapılması (karo yapıştırıcısı ile)</w:t>
-            </w:r>
-          </w:p>
-        </w:tc>
-        <w:tc>
-          <w:tcPr>
-            <w:tcW w:type="dxa" w:w="680"/>
-            <w:tcBorders>
-              <w:top w:val="single" w:color="808080" w:sz="4"/>
-              <w:left w:val="single" w:color="808080" w:sz="4"/>
-              <w:bottom w:val="single" w:color="808080" w:sz="4"/>
-              <w:right w:val="single" w:color="808080" w:sz="4"/>
-            </w:tcBorders>
-            <w:tcMar>
-              <w:top w:type="dxa" w:w="40"/>
-              <w:left w:type="dxa" w:w="60"/>
-              <w:bottom w:type="dxa" w:w="40"/>
-              <w:right w:type="dxa" w:w="60"/>
-            </w:tcMar>
-            <w:vAlign w:val="top"/>
-          </w:tcPr>
-          <w:p>
-            <w:pPr>
-              <w:spacing w:after="0" w:before="0"/>
-              <w:jc w:val="center"/>
-            </w:pPr>
-            <w:r>
-              <w:rPr>
-                <w:rFonts w:ascii="Calibri" w:cs="Calibri" w:eastAsia="Calibri" w:hAnsi="Calibri"/>
-                <w:b w:val="false"/>
-                <w:bCs w:val="false"/>
-                <w:sz w:val="14"/>
-                <w:szCs w:val="14"/>
-              </w:rPr>
-              <w:t xml:space="preserve">m²</w:t>
-            </w:r>
-          </w:p>
-        </w:tc>
-        <w:tc>
-          <w:tcPr>
-            <w:tcW w:type="dxa" w:w="1134"/>
-            <w:tcBorders>
-              <w:top w:val="single" w:color="808080" w:sz="4"/>
-              <w:left w:val="single" w:color="808080" w:sz="4"/>
-              <w:bottom w:val="single" w:color="808080" w:sz="4"/>
-              <w:right w:val="single" w:color="808080" w:sz="4"/>
-            </w:tcBorders>
-            <w:tcMar>
-              <w:top w:type="dxa" w:w="40"/>
-              <w:left w:type="dxa" w:w="60"/>
-              <w:bottom w:type="dxa" w:w="40"/>
-              <w:right w:type="dxa" w:w="60"/>
-            </w:tcMar>
-            <w:vAlign w:val="top"/>
-          </w:tcPr>
-          <w:p>
-            <w:pPr>
-              <w:spacing w:after="0" w:before="0"/>
               <w:jc w:val="right"/>
             </w:pPr>
             <w:r>
@@ -4745,7 +5711,7 @@
                 <w:sz w:val="14"/>
                 <w:szCs w:val="14"/>
               </w:rPr>
-              <w:t xml:space="preserve">60,00</w:t>
+              <w:t xml:space="preserve">30,00</w:t>
             </w:r>
           </w:p>
         </w:tc>
@@ -4753,21 +5719,100 @@
       <w:tr>
         <w:tc>
           <w:tcPr>
-            <w:tcW w:type="dxa" w:w="1928"/>
-            <w:tcBorders>
-              <w:top w:val="single" w:color="808080" w:sz="4"/>
-              <w:left w:val="single" w:color="808080" w:sz="4"/>
-              <w:bottom w:val="single" w:color="808080" w:sz="4"/>
-              <w:right w:val="single" w:color="808080" w:sz="4"/>
-            </w:tcBorders>
-            <w:shd w:fill="EDEDED" w:color="auto" w:val="clear"/>
-            <w:tcMar>
-              <w:top w:type="dxa" w:w="40"/>
-              <w:left w:type="dxa" w:w="60"/>
-              <w:bottom w:type="dxa" w:w="40"/>
-              <w:right w:type="dxa" w:w="60"/>
-            </w:tcMar>
-            <w:vAlign w:val="center"/>
+            <w:vMerge w:val="continue"/>
+            <w:tcBorders>
+              <w:top w:val="single" w:color="808080" w:sz="4"/>
+              <w:left w:val="single" w:color="808080" w:sz="4"/>
+              <w:bottom w:val="single" w:color="808080" w:sz="4"/>
+              <w:right w:val="single" w:color="808080" w:sz="4"/>
+            </w:tcBorders>
+          </w:tcPr>
+          <w:p/>
+        </w:tc>
+        <w:tc>
+          <w:tcPr>
+            <w:tcW w:type="dxa" w:w="454"/>
+            <w:tcBorders>
+              <w:top w:val="single" w:color="808080" w:sz="4"/>
+              <w:left w:val="single" w:color="808080" w:sz="4"/>
+              <w:bottom w:val="single" w:color="808080" w:sz="4"/>
+              <w:right w:val="single" w:color="808080" w:sz="4"/>
+            </w:tcBorders>
+            <w:tcMar>
+              <w:top w:type="dxa" w:w="40"/>
+              <w:left w:type="dxa" w:w="60"/>
+              <w:bottom w:type="dxa" w:w="40"/>
+              <w:right w:type="dxa" w:w="60"/>
+            </w:tcMar>
+            <w:vAlign w:val="top"/>
+          </w:tcPr>
+          <w:p>
+            <w:pPr>
+              <w:spacing w:after="0" w:before="0"/>
+              <w:jc w:val="center"/>
+            </w:pPr>
+            <w:r>
+              <w:rPr>
+                <w:rFonts w:ascii="Calibri" w:cs="Calibri" w:eastAsia="Calibri" w:hAnsi="Calibri"/>
+                <w:b w:val="false"/>
+                <w:bCs w:val="false"/>
+                <w:sz w:val="14"/>
+                <w:szCs w:val="14"/>
+              </w:rPr>
+              <w:t xml:space="preserve">6</w:t>
+            </w:r>
+          </w:p>
+        </w:tc>
+        <w:tc>
+          <w:tcPr>
+            <w:tcW w:type="dxa" w:w="1134"/>
+            <w:tcBorders>
+              <w:top w:val="single" w:color="808080" w:sz="4"/>
+              <w:left w:val="single" w:color="808080" w:sz="4"/>
+              <w:bottom w:val="single" w:color="808080" w:sz="4"/>
+              <w:right w:val="single" w:color="808080" w:sz="4"/>
+            </w:tcBorders>
+            <w:tcMar>
+              <w:top w:type="dxa" w:w="40"/>
+              <w:left w:type="dxa" w:w="60"/>
+              <w:bottom w:type="dxa" w:w="40"/>
+              <w:right w:type="dxa" w:w="60"/>
+            </w:tcMar>
+            <w:vAlign w:val="top"/>
+          </w:tcPr>
+          <w:p>
+            <w:pPr>
+              <w:spacing w:after="0" w:before="0"/>
+              <w:jc w:val="center"/>
+            </w:pPr>
+            <w:r>
+              <w:rPr>
+                <w:rFonts w:ascii="Calibri" w:cs="Calibri" w:eastAsia="Calibri" w:hAnsi="Calibri"/>
+                <w:b w:val="false"/>
+                <w:bCs w:val="false"/>
+                <w:sz w:val="14"/>
+                <w:szCs w:val="14"/>
+              </w:rPr>
+              <w:t xml:space="preserve">30.170.1601</w:t>
+            </w:r>
+          </w:p>
+        </w:tc>
+        <w:tc>
+          <w:tcPr>
+            <w:tcW w:type="dxa" w:w="5102"/>
+            <w:tcBorders>
+              <w:top w:val="single" w:color="808080" w:sz="4"/>
+              <w:left w:val="single" w:color="808080" w:sz="4"/>
+              <w:bottom w:val="single" w:color="808080" w:sz="4"/>
+              <w:right w:val="single" w:color="808080" w:sz="4"/>
+            </w:tcBorders>
+            <w:tcMar>
+              <w:top w:type="dxa" w:w="40"/>
+              <w:left w:type="dxa" w:w="60"/>
+              <w:bottom w:type="dxa" w:w="40"/>
+              <w:right w:type="dxa" w:w="60"/>
+            </w:tcMar>
+            <w:vAlign w:val="top"/>
           </w:tcPr>
           <w:p>
             <w:pPr>
@@ -4777,46 +5822,46 @@
             <w:r>
               <w:rPr>
                 <w:rFonts w:ascii="Calibri" w:cs="Calibri" w:eastAsia="Calibri" w:hAnsi="Calibri"/>
-                <w:b/>
-                <w:bCs/>
-                <w:sz w:val="14"/>
-                <w:szCs w:val="14"/>
-              </w:rPr>
-              <w:t xml:space="preserve">Kanalizasyon işleri</w:t>
-            </w:r>
-          </w:p>
-        </w:tc>
-        <w:tc>
-          <w:tcPr>
-            <w:tcW w:type="dxa" w:w="454"/>
-            <w:tcBorders>
-              <w:top w:val="single" w:color="808080" w:sz="4"/>
-              <w:left w:val="single" w:color="808080" w:sz="4"/>
-              <w:bottom w:val="single" w:color="808080" w:sz="4"/>
-              <w:right w:val="single" w:color="808080" w:sz="4"/>
-            </w:tcBorders>
-            <w:tcMar>
-              <w:top w:type="dxa" w:w="40"/>
-              <w:left w:type="dxa" w:w="60"/>
-              <w:bottom w:type="dxa" w:w="40"/>
-              <w:right w:type="dxa" w:w="60"/>
-            </w:tcMar>
-            <w:vAlign w:val="top"/>
-          </w:tcPr>
-          <w:p>
-            <w:pPr>
-              <w:spacing w:after="0" w:before="0"/>
-              <w:jc w:val="center"/>
-            </w:pPr>
-            <w:r>
-              <w:rPr>
-                <w:rFonts w:ascii="Calibri" w:cs="Calibri" w:eastAsia="Calibri" w:hAnsi="Calibri"/>
-                <w:b w:val="false"/>
-                <w:bCs w:val="false"/>
-                <w:sz w:val="14"/>
-                <w:szCs w:val="14"/>
-              </w:rPr>
-              <w:t xml:space="preserve">1</w:t>
+                <w:b w:val="false"/>
+                <w:bCs w:val="false"/>
+                <w:sz w:val="14"/>
+                <w:szCs w:val="14"/>
+              </w:rPr>
+              <w:t xml:space="preserve">LED sıva üstü etanj armatür (polikarbon gövdeli), ışık akısı en az 1800 lm — servis bölümü</w:t>
+            </w:r>
+          </w:p>
+        </w:tc>
+        <w:tc>
+          <w:tcPr>
+            <w:tcW w:type="dxa" w:w="680"/>
+            <w:tcBorders>
+              <w:top w:val="single" w:color="808080" w:sz="4"/>
+              <w:left w:val="single" w:color="808080" w:sz="4"/>
+              <w:bottom w:val="single" w:color="808080" w:sz="4"/>
+              <w:right w:val="single" w:color="808080" w:sz="4"/>
+            </w:tcBorders>
+            <w:tcMar>
+              <w:top w:type="dxa" w:w="40"/>
+              <w:left w:type="dxa" w:w="60"/>
+              <w:bottom w:type="dxa" w:w="40"/>
+              <w:right w:type="dxa" w:w="60"/>
+            </w:tcMar>
+            <w:vAlign w:val="top"/>
+          </w:tcPr>
+          <w:p>
+            <w:pPr>
+              <w:spacing w:after="0" w:before="0"/>
+              <w:jc w:val="center"/>
+            </w:pPr>
+            <w:r>
+              <w:rPr>
+                <w:rFonts w:ascii="Calibri" w:cs="Calibri" w:eastAsia="Calibri" w:hAnsi="Calibri"/>
+                <w:b w:val="false"/>
+                <w:bCs w:val="false"/>
+                <w:sz w:val="14"/>
+                <w:szCs w:val="14"/>
+              </w:rPr>
+              <w:t xml:space="preserve">ad</w:t>
             </w:r>
           </w:p>
         </w:tc>
@@ -4840,108 +5885,6 @@
           <w:p>
             <w:pPr>
               <w:spacing w:after="0" w:before="0"/>
-              <w:jc w:val="center"/>
-            </w:pPr>
-            <w:r>
-              <w:rPr>
-                <w:rFonts w:ascii="Calibri" w:cs="Calibri" w:eastAsia="Calibri" w:hAnsi="Calibri"/>
-                <w:b w:val="false"/>
-                <w:bCs w:val="false"/>
-                <w:sz w:val="14"/>
-                <w:szCs w:val="14"/>
-              </w:rPr>
-              <w:t xml:space="preserve">43.527.1001</w:t>
-            </w:r>
-          </w:p>
-        </w:tc>
-        <w:tc>
-          <w:tcPr>
-            <w:tcW w:type="dxa" w:w="5102"/>
-            <w:tcBorders>
-              <w:top w:val="single" w:color="808080" w:sz="4"/>
-              <w:left w:val="single" w:color="808080" w:sz="4"/>
-              <w:bottom w:val="single" w:color="808080" w:sz="4"/>
-              <w:right w:val="single" w:color="808080" w:sz="4"/>
-            </w:tcBorders>
-            <w:tcMar>
-              <w:top w:type="dxa" w:w="40"/>
-              <w:left w:type="dxa" w:w="60"/>
-              <w:bottom w:type="dxa" w:w="40"/>
-              <w:right w:type="dxa" w:w="60"/>
-            </w:tcMar>
-            <w:vAlign w:val="top"/>
-          </w:tcPr>
-          <w:p>
-            <w:pPr>
-              <w:spacing w:after="0" w:before="0"/>
-              <w:jc w:val="left"/>
-            </w:pPr>
-            <w:r>
-              <w:rPr>
-                <w:rFonts w:ascii="Calibri" w:cs="Calibri" w:eastAsia="Calibri" w:hAnsi="Calibri"/>
-                <w:b w:val="false"/>
-                <w:bCs w:val="false"/>
-                <w:sz w:val="14"/>
-                <w:szCs w:val="14"/>
-              </w:rPr>
-              <w:t xml:space="preserve">Çapı 150 mm HDPE koruge boru döşenmesi (SN 8, lastik conta ve boru bedeli dahil)</w:t>
-            </w:r>
-          </w:p>
-        </w:tc>
-        <w:tc>
-          <w:tcPr>
-            <w:tcW w:type="dxa" w:w="680"/>
-            <w:tcBorders>
-              <w:top w:val="single" w:color="808080" w:sz="4"/>
-              <w:left w:val="single" w:color="808080" w:sz="4"/>
-              <w:bottom w:val="single" w:color="808080" w:sz="4"/>
-              <w:right w:val="single" w:color="808080" w:sz="4"/>
-            </w:tcBorders>
-            <w:tcMar>
-              <w:top w:type="dxa" w:w="40"/>
-              <w:left w:type="dxa" w:w="60"/>
-              <w:bottom w:type="dxa" w:w="40"/>
-              <w:right w:type="dxa" w:w="60"/>
-            </w:tcMar>
-            <w:vAlign w:val="top"/>
-          </w:tcPr>
-          <w:p>
-            <w:pPr>
-              <w:spacing w:after="0" w:before="0"/>
-              <w:jc w:val="center"/>
-            </w:pPr>
-            <w:r>
-              <w:rPr>
-                <w:rFonts w:ascii="Calibri" w:cs="Calibri" w:eastAsia="Calibri" w:hAnsi="Calibri"/>
-                <w:b w:val="false"/>
-                <w:bCs w:val="false"/>
-                <w:sz w:val="14"/>
-                <w:szCs w:val="14"/>
-              </w:rPr>
-              <w:t xml:space="preserve">m</w:t>
-            </w:r>
-          </w:p>
-        </w:tc>
-        <w:tc>
-          <w:tcPr>
-            <w:tcW w:type="dxa" w:w="1134"/>
-            <w:tcBorders>
-              <w:top w:val="single" w:color="808080" w:sz="4"/>
-              <w:left w:val="single" w:color="808080" w:sz="4"/>
-              <w:bottom w:val="single" w:color="808080" w:sz="4"/>
-              <w:right w:val="single" w:color="808080" w:sz="4"/>
-            </w:tcBorders>
-            <w:tcMar>
-              <w:top w:type="dxa" w:w="40"/>
-              <w:left w:type="dxa" w:w="60"/>
-              <w:bottom w:type="dxa" w:w="40"/>
-              <w:right w:type="dxa" w:w="60"/>
-            </w:tcMar>
-            <w:vAlign w:val="top"/>
-          </w:tcPr>
-          <w:p>
-            <w:pPr>
-              <w:spacing w:after="0" w:before="0"/>
               <w:jc w:val="right"/>
             </w:pPr>
             <w:r>
@@ -4952,7 +5895,7 @@
                 <w:sz w:val="14"/>
                 <w:szCs w:val="14"/>
               </w:rPr>
-              <w:t xml:space="preserve">25,00</w:t>
+              <w:t xml:space="preserve">2,00</w:t>
             </w:r>
           </w:p>
         </w:tc>
@@ -4960,22 +5903,100 @@
       <w:tr>
         <w:tc>
           <w:tcPr>
-            <w:tcW w:type="dxa" w:w="1928"/>
-            <w:vMerge w:val="restart"/>
-            <w:tcBorders>
-              <w:top w:val="single" w:color="808080" w:sz="4"/>
-              <w:left w:val="single" w:color="808080" w:sz="4"/>
-              <w:bottom w:val="single" w:color="808080" w:sz="4"/>
-              <w:right w:val="single" w:color="808080" w:sz="4"/>
-            </w:tcBorders>
-            <w:shd w:fill="EDEDED" w:color="auto" w:val="clear"/>
-            <w:tcMar>
-              <w:top w:type="dxa" w:w="40"/>
-              <w:left w:type="dxa" w:w="60"/>
-              <w:bottom w:type="dxa" w:w="40"/>
-              <w:right w:type="dxa" w:w="60"/>
-            </w:tcMar>
-            <w:vAlign w:val="center"/>
+            <w:vMerge w:val="continue"/>
+            <w:tcBorders>
+              <w:top w:val="single" w:color="808080" w:sz="4"/>
+              <w:left w:val="single" w:color="808080" w:sz="4"/>
+              <w:bottom w:val="single" w:color="808080" w:sz="4"/>
+              <w:right w:val="single" w:color="808080" w:sz="4"/>
+            </w:tcBorders>
+          </w:tcPr>
+          <w:p/>
+        </w:tc>
+        <w:tc>
+          <w:tcPr>
+            <w:tcW w:type="dxa" w:w="454"/>
+            <w:tcBorders>
+              <w:top w:val="single" w:color="808080" w:sz="4"/>
+              <w:left w:val="single" w:color="808080" w:sz="4"/>
+              <w:bottom w:val="single" w:color="808080" w:sz="4"/>
+              <w:right w:val="single" w:color="808080" w:sz="4"/>
+            </w:tcBorders>
+            <w:tcMar>
+              <w:top w:type="dxa" w:w="40"/>
+              <w:left w:type="dxa" w:w="60"/>
+              <w:bottom w:type="dxa" w:w="40"/>
+              <w:right w:type="dxa" w:w="60"/>
+            </w:tcMar>
+            <w:vAlign w:val="top"/>
+          </w:tcPr>
+          <w:p>
+            <w:pPr>
+              <w:spacing w:after="0" w:before="0"/>
+              <w:jc w:val="center"/>
+            </w:pPr>
+            <w:r>
+              <w:rPr>
+                <w:rFonts w:ascii="Calibri" w:cs="Calibri" w:eastAsia="Calibri" w:hAnsi="Calibri"/>
+                <w:b w:val="false"/>
+                <w:bCs w:val="false"/>
+                <w:sz w:val="14"/>
+                <w:szCs w:val="14"/>
+              </w:rPr>
+              <w:t xml:space="preserve">7</w:t>
+            </w:r>
+          </w:p>
+        </w:tc>
+        <w:tc>
+          <w:tcPr>
+            <w:tcW w:type="dxa" w:w="1134"/>
+            <w:tcBorders>
+              <w:top w:val="single" w:color="808080" w:sz="4"/>
+              <w:left w:val="single" w:color="808080" w:sz="4"/>
+              <w:bottom w:val="single" w:color="808080" w:sz="4"/>
+              <w:right w:val="single" w:color="808080" w:sz="4"/>
+            </w:tcBorders>
+            <w:tcMar>
+              <w:top w:type="dxa" w:w="40"/>
+              <w:left w:type="dxa" w:w="60"/>
+              <w:bottom w:type="dxa" w:w="40"/>
+              <w:right w:type="dxa" w:w="60"/>
+            </w:tcMar>
+            <w:vAlign w:val="top"/>
+          </w:tcPr>
+          <w:p>
+            <w:pPr>
+              <w:spacing w:after="0" w:before="0"/>
+              <w:jc w:val="center"/>
+            </w:pPr>
+            <w:r>
+              <w:rPr>
+                <w:rFonts w:ascii="Calibri" w:cs="Calibri" w:eastAsia="Calibri" w:hAnsi="Calibri"/>
+                <w:b w:val="false"/>
+                <w:bCs w:val="false"/>
+                <w:sz w:val="14"/>
+                <w:szCs w:val="14"/>
+              </w:rPr>
+              <w:t xml:space="preserve">30.160.6102</w:t>
+            </w:r>
+          </w:p>
+        </w:tc>
+        <w:tc>
+          <w:tcPr>
+            <w:tcW w:type="dxa" w:w="5102"/>
+            <w:tcBorders>
+              <w:top w:val="single" w:color="808080" w:sz="4"/>
+              <w:left w:val="single" w:color="808080" w:sz="4"/>
+              <w:bottom w:val="single" w:color="808080" w:sz="4"/>
+              <w:right w:val="single" w:color="808080" w:sz="4"/>
+            </w:tcBorders>
+            <w:tcMar>
+              <w:top w:type="dxa" w:w="40"/>
+              <w:left w:type="dxa" w:w="60"/>
+              <w:bottom w:type="dxa" w:w="40"/>
+              <w:right w:type="dxa" w:w="60"/>
+            </w:tcMar>
+            <w:vAlign w:val="top"/>
           </w:tcPr>
           <w:p>
             <w:pPr>
@@ -4985,46 +6006,46 @@
             <w:r>
               <w:rPr>
                 <w:rFonts w:ascii="Calibri" w:cs="Calibri" w:eastAsia="Calibri" w:hAnsi="Calibri"/>
-                <w:b/>
-                <w:bCs/>
-                <w:sz w:val="14"/>
-                <w:szCs w:val="14"/>
-              </w:rPr>
-              <w:t xml:space="preserve">Elektrik tesisatı ve aydınlatma</w:t>
-            </w:r>
-          </w:p>
-        </w:tc>
-        <w:tc>
-          <w:tcPr>
-            <w:tcW w:type="dxa" w:w="454"/>
-            <w:tcBorders>
-              <w:top w:val="single" w:color="808080" w:sz="4"/>
-              <w:left w:val="single" w:color="808080" w:sz="4"/>
-              <w:bottom w:val="single" w:color="808080" w:sz="4"/>
-              <w:right w:val="single" w:color="808080" w:sz="4"/>
-            </w:tcBorders>
-            <w:tcMar>
-              <w:top w:type="dxa" w:w="40"/>
-              <w:left w:type="dxa" w:w="60"/>
-              <w:bottom w:type="dxa" w:w="40"/>
-              <w:right w:type="dxa" w:w="60"/>
-            </w:tcMar>
-            <w:vAlign w:val="top"/>
-          </w:tcPr>
-          <w:p>
-            <w:pPr>
-              <w:spacing w:after="0" w:before="0"/>
-              <w:jc w:val="center"/>
-            </w:pPr>
-            <w:r>
-              <w:rPr>
-                <w:rFonts w:ascii="Calibri" w:cs="Calibri" w:eastAsia="Calibri" w:hAnsi="Calibri"/>
-                <w:b w:val="false"/>
-                <w:bCs w:val="false"/>
-                <w:sz w:val="14"/>
-                <w:szCs w:val="14"/>
-              </w:rPr>
-              <w:t xml:space="preserve">1</w:t>
+                <w:b w:val="false"/>
+                <w:bCs w:val="false"/>
+                <w:sz w:val="14"/>
+                <w:szCs w:val="14"/>
+              </w:rPr>
+              <w:t xml:space="preserve">Boş boru döşemesi — 25-32 mm PVC boru</w:t>
+            </w:r>
+          </w:p>
+        </w:tc>
+        <w:tc>
+          <w:tcPr>
+            <w:tcW w:type="dxa" w:w="680"/>
+            <w:tcBorders>
+              <w:top w:val="single" w:color="808080" w:sz="4"/>
+              <w:left w:val="single" w:color="808080" w:sz="4"/>
+              <w:bottom w:val="single" w:color="808080" w:sz="4"/>
+              <w:right w:val="single" w:color="808080" w:sz="4"/>
+            </w:tcBorders>
+            <w:tcMar>
+              <w:top w:type="dxa" w:w="40"/>
+              <w:left w:type="dxa" w:w="60"/>
+              <w:bottom w:type="dxa" w:w="40"/>
+              <w:right w:type="dxa" w:w="60"/>
+            </w:tcMar>
+            <w:vAlign w:val="top"/>
+          </w:tcPr>
+          <w:p>
+            <w:pPr>
+              <w:spacing w:after="0" w:before="0"/>
+              <w:jc w:val="center"/>
+            </w:pPr>
+            <w:r>
+              <w:rPr>
+                <w:rFonts w:ascii="Calibri" w:cs="Calibri" w:eastAsia="Calibri" w:hAnsi="Calibri"/>
+                <w:b w:val="false"/>
+                <w:bCs w:val="false"/>
+                <w:sz w:val="14"/>
+                <w:szCs w:val="14"/>
+              </w:rPr>
+              <w:t xml:space="preserve">m</w:t>
             </w:r>
           </w:p>
         </w:tc>
@@ -5048,108 +6069,6 @@
           <w:p>
             <w:pPr>
               <w:spacing w:after="0" w:before="0"/>
-              <w:jc w:val="center"/>
-            </w:pPr>
-            <w:r>
-              <w:rPr>
-                <w:rFonts w:ascii="Calibri" w:cs="Calibri" w:eastAsia="Calibri" w:hAnsi="Calibri"/>
-                <w:b w:val="false"/>
-                <w:bCs w:val="false"/>
-                <w:sz w:val="14"/>
-                <w:szCs w:val="14"/>
-              </w:rPr>
-              <w:t xml:space="preserve">30.100.2105</w:t>
-            </w:r>
-          </w:p>
-        </w:tc>
-        <w:tc>
-          <w:tcPr>
-            <w:tcW w:type="dxa" w:w="5102"/>
-            <w:tcBorders>
-              <w:top w:val="single" w:color="808080" w:sz="4"/>
-              <w:left w:val="single" w:color="808080" w:sz="4"/>
-              <w:bottom w:val="single" w:color="808080" w:sz="4"/>
-              <w:right w:val="single" w:color="808080" w:sz="4"/>
-            </w:tcBorders>
-            <w:tcMar>
-              <w:top w:type="dxa" w:w="40"/>
-              <w:left w:type="dxa" w:w="60"/>
-              <w:bottom w:type="dxa" w:w="40"/>
-              <w:right w:type="dxa" w:w="60"/>
-            </w:tcMar>
-            <w:vAlign w:val="top"/>
-          </w:tcPr>
-          <w:p>
-            <w:pPr>
-              <w:spacing w:after="0" w:before="0"/>
-              <w:jc w:val="left"/>
-            </w:pPr>
-            <w:r>
-              <w:rPr>
-                <w:rFonts w:ascii="Calibri" w:cs="Calibri" w:eastAsia="Calibri" w:hAnsi="Calibri"/>
-                <w:b w:val="false"/>
-                <w:bCs w:val="false"/>
-                <w:sz w:val="14"/>
-                <w:szCs w:val="14"/>
-              </w:rPr>
-              <w:t xml:space="preserve">Kümes dağıtım panosu (sıva üstü galvanizli sac tablo, 0,40-0,50 m²)</w:t>
-            </w:r>
-          </w:p>
-        </w:tc>
-        <w:tc>
-          <w:tcPr>
-            <w:tcW w:type="dxa" w:w="680"/>
-            <w:tcBorders>
-              <w:top w:val="single" w:color="808080" w:sz="4"/>
-              <w:left w:val="single" w:color="808080" w:sz="4"/>
-              <w:bottom w:val="single" w:color="808080" w:sz="4"/>
-              <w:right w:val="single" w:color="808080" w:sz="4"/>
-            </w:tcBorders>
-            <w:tcMar>
-              <w:top w:type="dxa" w:w="40"/>
-              <w:left w:type="dxa" w:w="60"/>
-              <w:bottom w:type="dxa" w:w="40"/>
-              <w:right w:type="dxa" w:w="60"/>
-            </w:tcMar>
-            <w:vAlign w:val="top"/>
-          </w:tcPr>
-          <w:p>
-            <w:pPr>
-              <w:spacing w:after="0" w:before="0"/>
-              <w:jc w:val="center"/>
-            </w:pPr>
-            <w:r>
-              <w:rPr>
-                <w:rFonts w:ascii="Calibri" w:cs="Calibri" w:eastAsia="Calibri" w:hAnsi="Calibri"/>
-                <w:b w:val="false"/>
-                <w:bCs w:val="false"/>
-                <w:sz w:val="14"/>
-                <w:szCs w:val="14"/>
-              </w:rPr>
-              <w:t xml:space="preserve">ad</w:t>
-            </w:r>
-          </w:p>
-        </w:tc>
-        <w:tc>
-          <w:tcPr>
-            <w:tcW w:type="dxa" w:w="1134"/>
-            <w:tcBorders>
-              <w:top w:val="single" w:color="808080" w:sz="4"/>
-              <w:left w:val="single" w:color="808080" w:sz="4"/>
-              <w:bottom w:val="single" w:color="808080" w:sz="4"/>
-              <w:right w:val="single" w:color="808080" w:sz="4"/>
-            </w:tcBorders>
-            <w:tcMar>
-              <w:top w:type="dxa" w:w="40"/>
-              <w:left w:type="dxa" w:w="60"/>
-              <w:bottom w:type="dxa" w:w="40"/>
-              <w:right w:type="dxa" w:w="60"/>
-            </w:tcMar>
-            <w:vAlign w:val="top"/>
-          </w:tcPr>
-          <w:p>
-            <w:pPr>
-              <w:spacing w:after="0" w:before="0"/>
               <w:jc w:val="right"/>
             </w:pPr>
             <w:r>
@@ -5160,7 +6079,7 @@
                 <w:sz w:val="14"/>
                 <w:szCs w:val="14"/>
               </w:rPr>
-              <w:t xml:space="preserve">1,00</w:t>
+              <w:t xml:space="preserve">500,00</w:t>
             </w:r>
           </w:p>
         </w:tc>
@@ -5208,7 +6127,7 @@
                 <w:sz w:val="14"/>
                 <w:szCs w:val="14"/>
               </w:rPr>
-              <w:t xml:space="preserve">2</w:t>
+              <w:t xml:space="preserve">8</w:t>
             </w:r>
           </w:p>
         </w:tc>
@@ -5242,7 +6161,7 @@
                 <w:sz w:val="14"/>
                 <w:szCs w:val="14"/>
               </w:rPr>
-              <w:t xml:space="preserve">30.110.1102</w:t>
+              <w:t xml:space="preserve">30.150.1402</w:t>
             </w:r>
           </w:p>
         </w:tc>
@@ -5276,7 +6195,7 @@
                 <w:sz w:val="14"/>
                 <w:szCs w:val="14"/>
               </w:rPr>
-              <w:t xml:space="preserve">Termik-manyetik kompakt şalter 3x100 A, Icu 35 kA — kümes besleme</w:t>
+              <w:t xml:space="preserve">Halojensiz H07Z tipi iletken 1x2,5 mm² ile tesisat</w:t>
             </w:r>
           </w:p>
         </w:tc>
@@ -5310,7 +6229,7 @@
                 <w:sz w:val="14"/>
                 <w:szCs w:val="14"/>
               </w:rPr>
-              <w:t xml:space="preserve">ad</w:t>
+              <w:t xml:space="preserve">m</w:t>
             </w:r>
           </w:p>
         </w:tc>
@@ -5344,7 +6263,7 @@
                 <w:sz w:val="14"/>
                 <w:szCs w:val="14"/>
               </w:rPr>
-              <w:t xml:space="preserve">1,00</w:t>
+              <w:t xml:space="preserve">2.000,00</w:t>
             </w:r>
           </w:p>
         </w:tc>
@@ -5392,7 +6311,7 @@
                 <w:sz w:val="14"/>
                 <w:szCs w:val="14"/>
               </w:rPr>
-              <w:t xml:space="preserve">3</w:t>
+              <w:t xml:space="preserve">9</w:t>
             </w:r>
           </w:p>
         </w:tc>
@@ -5426,7 +6345,7 @@
                 <w:sz w:val="14"/>
                 <w:szCs w:val="14"/>
               </w:rPr>
-              <w:t xml:space="preserve">30.115.1003</w:t>
+              <w:t xml:space="preserve">30.150.1401</w:t>
             </w:r>
           </w:p>
         </w:tc>
@@ -5460,7 +6379,7 @@
                 <w:sz w:val="14"/>
                 <w:szCs w:val="14"/>
               </w:rPr>
-              <w:t xml:space="preserve">Kaçak akım koruma şalteri 2x63 A, 30 mA</w:t>
+              <w:t xml:space="preserve">Halojensiz H07Z tipi iletken 1x1,5 mm² ile kumanda tesisatı</w:t>
             </w:r>
           </w:p>
         </w:tc>
@@ -5494,7 +6413,7 @@
                 <w:sz w:val="14"/>
                 <w:szCs w:val="14"/>
               </w:rPr>
-              <w:t xml:space="preserve">ad</w:t>
+              <w:t xml:space="preserve">m</w:t>
             </w:r>
           </w:p>
         </w:tc>
@@ -5528,7 +6447,7 @@
                 <w:sz w:val="14"/>
                 <w:szCs w:val="14"/>
               </w:rPr>
-              <w:t xml:space="preserve">2,00</w:t>
+              <w:t xml:space="preserve">600,00</w:t>
             </w:r>
           </w:p>
         </w:tc>
@@ -5576,7 +6495,7 @@
                 <w:sz w:val="14"/>
                 <w:szCs w:val="14"/>
               </w:rPr>
-              <w:t xml:space="preserve">4</w:t>
+              <w:t xml:space="preserve">10</w:t>
             </w:r>
           </w:p>
         </w:tc>
@@ -5610,7 +6529,7 @@
                 <w:sz w:val="14"/>
                 <w:szCs w:val="14"/>
               </w:rPr>
-              <w:t xml:space="preserve">30.140.3104</w:t>
+              <w:t xml:space="preserve">30.140.1105</w:t>
             </w:r>
           </w:p>
         </w:tc>
@@ -5644,7 +6563,7 @@
                 <w:sz w:val="14"/>
                 <w:szCs w:val="14"/>
               </w:rPr>
-              <w:t xml:space="preserve">YVV (NYY) 1 kV yeraltı kablosu ile kolon hattı tesisi — 1x25 mm²</w:t>
+              <w:t xml:space="preserve">Çıplak bakır tel 25 mm² — eşpotansiyel bara ve topraklama iletkeni</w:t>
             </w:r>
           </w:p>
         </w:tc>
@@ -5712,7 +6631,7 @@
                 <w:sz w:val="14"/>
                 <w:szCs w:val="14"/>
               </w:rPr>
-              <w:t xml:space="preserve">300,00</w:t>
+              <w:t xml:space="preserve">100,00</w:t>
             </w:r>
           </w:p>
         </w:tc>
@@ -5760,7 +6679,7 @@
                 <w:sz w:val="14"/>
                 <w:szCs w:val="14"/>
               </w:rPr>
-              <w:t xml:space="preserve">5</w:t>
+              <w:t xml:space="preserve">11</w:t>
             </w:r>
           </w:p>
         </w:tc>
@@ -5794,7 +6713,7 @@
                 <w:sz w:val="14"/>
                 <w:szCs w:val="14"/>
               </w:rPr>
-              <w:t xml:space="preserve">30.170.1602</w:t>
+              <w:t xml:space="preserve">30.750.3002</w:t>
             </w:r>
           </w:p>
         </w:tc>
@@ -5828,7 +6747,7 @@
                 <w:sz w:val="14"/>
                 <w:szCs w:val="14"/>
               </w:rPr>
-              <w:t xml:space="preserve">LED sıva üstü etanj armatür (polikarbon gövdeli), ışık akısı en az 2700 lm — kümes genel aydınlatması</w:t>
+              <w:t xml:space="preserve">Bina ihata iletkeni tesisatı — 30x3,5 mm galvanizli çelik lama (temel topraklaması)</w:t>
             </w:r>
           </w:p>
         </w:tc>
@@ -5862,7 +6781,7 @@
                 <w:sz w:val="14"/>
                 <w:szCs w:val="14"/>
               </w:rPr>
-              <w:t xml:space="preserve">ad</w:t>
+              <w:t xml:space="preserve">m</w:t>
             </w:r>
           </w:p>
         </w:tc>
@@ -5896,7 +6815,7 @@
                 <w:sz w:val="14"/>
                 <w:szCs w:val="14"/>
               </w:rPr>
-              <w:t xml:space="preserve">30,00</w:t>
+              <w:t xml:space="preserve">186,00</w:t>
             </w:r>
           </w:p>
         </w:tc>
@@ -5944,7 +6863,7 @@
                 <w:sz w:val="14"/>
                 <w:szCs w:val="14"/>
               </w:rPr>
-              <w:t xml:space="preserve">6</w:t>
+              <w:t xml:space="preserve">12</w:t>
             </w:r>
           </w:p>
         </w:tc>
@@ -5978,7 +6897,7 @@
                 <w:sz w:val="14"/>
                 <w:szCs w:val="14"/>
               </w:rPr>
-              <w:t xml:space="preserve">30.170.1601</w:t>
+              <w:t xml:space="preserve">30.750.1502</w:t>
             </w:r>
           </w:p>
         </w:tc>
@@ -6012,7 +6931,7 @@
                 <w:sz w:val="14"/>
                 <w:szCs w:val="14"/>
               </w:rPr>
-              <w:t xml:space="preserve">LED sıva üstü etanj armatür (polikarbon gövdeli), ışık akısı en az 1800 lm — servis bölümü</w:t>
+              <w:t xml:space="preserve">Aktif yakalama ucu, ortalama uyarım yolu DL = 30-40 m</w:t>
             </w:r>
           </w:p>
         </w:tc>
@@ -6080,7 +6999,7 @@
                 <w:sz w:val="14"/>
                 <w:szCs w:val="14"/>
               </w:rPr>
-              <w:t xml:space="preserve">2,00</w:t>
+              <w:t xml:space="preserve">1,00</w:t>
             </w:r>
           </w:p>
         </w:tc>
@@ -6128,7 +7047,7 @@
                 <w:sz w:val="14"/>
                 <w:szCs w:val="14"/>
               </w:rPr>
-              <w:t xml:space="preserve">7</w:t>
+              <w:t xml:space="preserve">13</w:t>
             </w:r>
           </w:p>
         </w:tc>
@@ -6162,7 +7081,7 @@
                 <w:sz w:val="14"/>
                 <w:szCs w:val="14"/>
               </w:rPr>
-              <w:t xml:space="preserve">30.160.6102</w:t>
+              <w:t xml:space="preserve">30.750.2001</w:t>
             </w:r>
           </w:p>
         </w:tc>
@@ -6196,7 +7115,7 @@
                 <w:sz w:val="14"/>
                 <w:szCs w:val="14"/>
               </w:rPr>
-              <w:t xml:space="preserve">Boş boru döşemesi — 25-32 mm PVC boru</w:t>
+              <w:t xml:space="preserve">Çatı ihata ve indirme iletkeni tesisatı — 50 mm² elektrolitik bakır tel</w:t>
             </w:r>
           </w:p>
         </w:tc>
@@ -6264,7 +7183,7 @@
                 <w:sz w:val="14"/>
                 <w:szCs w:val="14"/>
               </w:rPr>
-              <w:t xml:space="preserve">500,00</w:t>
+              <w:t xml:space="preserve">16,00</w:t>
             </w:r>
           </w:p>
         </w:tc>
@@ -6312,7 +7231,7 @@
                 <w:sz w:val="14"/>
                 <w:szCs w:val="14"/>
               </w:rPr>
-              <w:t xml:space="preserve">8</w:t>
+              <w:t xml:space="preserve">14</w:t>
             </w:r>
           </w:p>
         </w:tc>
@@ -6346,7 +7265,7 @@
                 <w:sz w:val="14"/>
                 <w:szCs w:val="14"/>
               </w:rPr>
-              <w:t xml:space="preserve">30.150.1402</w:t>
+              <w:t xml:space="preserve">30.740.1106</w:t>
             </w:r>
           </w:p>
         </w:tc>
@@ -6380,7 +7299,7 @@
                 <w:sz w:val="14"/>
                 <w:szCs w:val="14"/>
               </w:rPr>
-              <w:t xml:space="preserve">Halojensiz H07Z tipi iletken 1x2,5 mm² ile tesisat</w:t>
+              <w:t xml:space="preserve">Dizel elektrojen grubu (jeneratör) 63 kVA / 50 kW — dizel motoru su veya hava ile soğuyan cinsten, 1500 d/dak</w:t>
             </w:r>
           </w:p>
         </w:tc>
@@ -6414,7 +7333,7 @@
                 <w:sz w:val="14"/>
                 <w:szCs w:val="14"/>
               </w:rPr>
-              <w:t xml:space="preserve">m</w:t>
+              <w:t xml:space="preserve">ad</w:t>
             </w:r>
           </w:p>
         </w:tc>
@@ -6448,7 +7367,7 @@
                 <w:sz w:val="14"/>
                 <w:szCs w:val="14"/>
               </w:rPr>
-              <w:t xml:space="preserve">2.000,00</w:t>
+              <w:t xml:space="preserve">1,00</w:t>
             </w:r>
           </w:p>
         </w:tc>
@@ -6496,7 +7415,7 @@
                 <w:sz w:val="14"/>
                 <w:szCs w:val="14"/>
               </w:rPr>
-              <w:t xml:space="preserve">9</w:t>
+              <w:t xml:space="preserve">15</w:t>
             </w:r>
           </w:p>
         </w:tc>
@@ -6530,7 +7449,7 @@
                 <w:sz w:val="14"/>
                 <w:szCs w:val="14"/>
               </w:rPr>
-              <w:t xml:space="preserve">30.150.1401</w:t>
+              <w:t xml:space="preserve">30.740.5406</w:t>
             </w:r>
           </w:p>
         </w:tc>
@@ -6564,1295 +7483,7 @@
                 <w:sz w:val="14"/>
                 <w:szCs w:val="14"/>
               </w:rPr>
-              <w:t xml:space="preserve">Halojensiz H07Z tipi iletken 1x1,5 mm² ile kumanda tesisatı</w:t>
-            </w:r>
-          </w:p>
-        </w:tc>
-        <w:tc>
-          <w:tcPr>
-            <w:tcW w:type="dxa" w:w="680"/>
-            <w:tcBorders>
-              <w:top w:val="single" w:color="808080" w:sz="4"/>
-              <w:left w:val="single" w:color="808080" w:sz="4"/>
-              <w:bottom w:val="single" w:color="808080" w:sz="4"/>
-              <w:right w:val="single" w:color="808080" w:sz="4"/>
-            </w:tcBorders>
-            <w:tcMar>
-              <w:top w:type="dxa" w:w="40"/>
-              <w:left w:type="dxa" w:w="60"/>
-              <w:bottom w:type="dxa" w:w="40"/>
-              <w:right w:type="dxa" w:w="60"/>
-            </w:tcMar>
-            <w:vAlign w:val="top"/>
-          </w:tcPr>
-          <w:p>
-            <w:pPr>
-              <w:spacing w:after="0" w:before="0"/>
-              <w:jc w:val="center"/>
-            </w:pPr>
-            <w:r>
-              <w:rPr>
-                <w:rFonts w:ascii="Calibri" w:cs="Calibri" w:eastAsia="Calibri" w:hAnsi="Calibri"/>
-                <w:b w:val="false"/>
-                <w:bCs w:val="false"/>
-                <w:sz w:val="14"/>
-                <w:szCs w:val="14"/>
-              </w:rPr>
-              <w:t xml:space="preserve">m</w:t>
-            </w:r>
-          </w:p>
-        </w:tc>
-        <w:tc>
-          <w:tcPr>
-            <w:tcW w:type="dxa" w:w="1134"/>
-            <w:tcBorders>
-              <w:top w:val="single" w:color="808080" w:sz="4"/>
-              <w:left w:val="single" w:color="808080" w:sz="4"/>
-              <w:bottom w:val="single" w:color="808080" w:sz="4"/>
-              <w:right w:val="single" w:color="808080" w:sz="4"/>
-            </w:tcBorders>
-            <w:tcMar>
-              <w:top w:type="dxa" w:w="40"/>
-              <w:left w:type="dxa" w:w="60"/>
-              <w:bottom w:type="dxa" w:w="40"/>
-              <w:right w:type="dxa" w:w="60"/>
-            </w:tcMar>
-            <w:vAlign w:val="top"/>
-          </w:tcPr>
-          <w:p>
-            <w:pPr>
-              <w:spacing w:after="0" w:before="0"/>
-              <w:jc w:val="right"/>
-            </w:pPr>
-            <w:r>
-              <w:rPr>
-                <w:rFonts w:ascii="Calibri" w:cs="Calibri" w:eastAsia="Calibri" w:hAnsi="Calibri"/>
-                <w:b w:val="false"/>
-                <w:bCs w:val="false"/>
-                <w:sz w:val="14"/>
-                <w:szCs w:val="14"/>
-              </w:rPr>
-              <w:t xml:space="preserve">600,00</w:t>
-            </w:r>
-          </w:p>
-        </w:tc>
-      </w:tr>
-      <w:tr>
-        <w:tc>
-          <w:tcPr>
-            <w:vMerge w:val="continue"/>
-            <w:tcBorders>
-              <w:top w:val="single" w:color="808080" w:sz="4"/>
-              <w:left w:val="single" w:color="808080" w:sz="4"/>
-              <w:bottom w:val="single" w:color="808080" w:sz="4"/>
-              <w:right w:val="single" w:color="808080" w:sz="4"/>
-            </w:tcBorders>
-          </w:tcPr>
-          <w:p/>
-        </w:tc>
-        <w:tc>
-          <w:tcPr>
-            <w:tcW w:type="dxa" w:w="454"/>
-            <w:tcBorders>
-              <w:top w:val="single" w:color="808080" w:sz="4"/>
-              <w:left w:val="single" w:color="808080" w:sz="4"/>
-              <w:bottom w:val="single" w:color="808080" w:sz="4"/>
-              <w:right w:val="single" w:color="808080" w:sz="4"/>
-            </w:tcBorders>
-            <w:tcMar>
-              <w:top w:type="dxa" w:w="40"/>
-              <w:left w:type="dxa" w:w="60"/>
-              <w:bottom w:type="dxa" w:w="40"/>
-              <w:right w:type="dxa" w:w="60"/>
-            </w:tcMar>
-            <w:vAlign w:val="top"/>
-          </w:tcPr>
-          <w:p>
-            <w:pPr>
-              <w:spacing w:after="0" w:before="0"/>
-              <w:jc w:val="center"/>
-            </w:pPr>
-            <w:r>
-              <w:rPr>
-                <w:rFonts w:ascii="Calibri" w:cs="Calibri" w:eastAsia="Calibri" w:hAnsi="Calibri"/>
-                <w:b w:val="false"/>
-                <w:bCs w:val="false"/>
-                <w:sz w:val="14"/>
-                <w:szCs w:val="14"/>
-              </w:rPr>
-              <w:t xml:space="preserve">10</w:t>
-            </w:r>
-          </w:p>
-        </w:tc>
-        <w:tc>
-          <w:tcPr>
-            <w:tcW w:type="dxa" w:w="1134"/>
-            <w:tcBorders>
-              <w:top w:val="single" w:color="808080" w:sz="4"/>
-              <w:left w:val="single" w:color="808080" w:sz="4"/>
-              <w:bottom w:val="single" w:color="808080" w:sz="4"/>
-              <w:right w:val="single" w:color="808080" w:sz="4"/>
-            </w:tcBorders>
-            <w:tcMar>
-              <w:top w:type="dxa" w:w="40"/>
-              <w:left w:type="dxa" w:w="60"/>
-              <w:bottom w:type="dxa" w:w="40"/>
-              <w:right w:type="dxa" w:w="60"/>
-            </w:tcMar>
-            <w:vAlign w:val="top"/>
-          </w:tcPr>
-          <w:p>
-            <w:pPr>
-              <w:spacing w:after="0" w:before="0"/>
-              <w:jc w:val="center"/>
-            </w:pPr>
-            <w:r>
-              <w:rPr>
-                <w:rFonts w:ascii="Calibri" w:cs="Calibri" w:eastAsia="Calibri" w:hAnsi="Calibri"/>
-                <w:b w:val="false"/>
-                <w:bCs w:val="false"/>
-                <w:sz w:val="14"/>
-                <w:szCs w:val="14"/>
-              </w:rPr>
-              <w:t xml:space="preserve">30.140.1105</w:t>
-            </w:r>
-          </w:p>
-        </w:tc>
-        <w:tc>
-          <w:tcPr>
-            <w:tcW w:type="dxa" w:w="5102"/>
-            <w:tcBorders>
-              <w:top w:val="single" w:color="808080" w:sz="4"/>
-              <w:left w:val="single" w:color="808080" w:sz="4"/>
-              <w:bottom w:val="single" w:color="808080" w:sz="4"/>
-              <w:right w:val="single" w:color="808080" w:sz="4"/>
-            </w:tcBorders>
-            <w:tcMar>
-              <w:top w:type="dxa" w:w="40"/>
-              <w:left w:type="dxa" w:w="60"/>
-              <w:bottom w:type="dxa" w:w="40"/>
-              <w:right w:type="dxa" w:w="60"/>
-            </w:tcMar>
-            <w:vAlign w:val="top"/>
-          </w:tcPr>
-          <w:p>
-            <w:pPr>
-              <w:spacing w:after="0" w:before="0"/>
-              <w:jc w:val="left"/>
-            </w:pPr>
-            <w:r>
-              <w:rPr>
-                <w:rFonts w:ascii="Calibri" w:cs="Calibri" w:eastAsia="Calibri" w:hAnsi="Calibri"/>
-                <w:b w:val="false"/>
-                <w:bCs w:val="false"/>
-                <w:sz w:val="14"/>
-                <w:szCs w:val="14"/>
-              </w:rPr>
-              <w:t xml:space="preserve">Çıplak bakır tel 25 mm² — eşpotansiyel bara ve topraklama iletkeni</w:t>
-            </w:r>
-          </w:p>
-        </w:tc>
-        <w:tc>
-          <w:tcPr>
-            <w:tcW w:type="dxa" w:w="680"/>
-            <w:tcBorders>
-              <w:top w:val="single" w:color="808080" w:sz="4"/>
-              <w:left w:val="single" w:color="808080" w:sz="4"/>
-              <w:bottom w:val="single" w:color="808080" w:sz="4"/>
-              <w:right w:val="single" w:color="808080" w:sz="4"/>
-            </w:tcBorders>
-            <w:tcMar>
-              <w:top w:type="dxa" w:w="40"/>
-              <w:left w:type="dxa" w:w="60"/>
-              <w:bottom w:type="dxa" w:w="40"/>
-              <w:right w:type="dxa" w:w="60"/>
-            </w:tcMar>
-            <w:vAlign w:val="top"/>
-          </w:tcPr>
-          <w:p>
-            <w:pPr>
-              <w:spacing w:after="0" w:before="0"/>
-              <w:jc w:val="center"/>
-            </w:pPr>
-            <w:r>
-              <w:rPr>
-                <w:rFonts w:ascii="Calibri" w:cs="Calibri" w:eastAsia="Calibri" w:hAnsi="Calibri"/>
-                <w:b w:val="false"/>
-                <w:bCs w:val="false"/>
-                <w:sz w:val="14"/>
-                <w:szCs w:val="14"/>
-              </w:rPr>
-              <w:t xml:space="preserve">m</w:t>
-            </w:r>
-          </w:p>
-        </w:tc>
-        <w:tc>
-          <w:tcPr>
-            <w:tcW w:type="dxa" w:w="1134"/>
-            <w:tcBorders>
-              <w:top w:val="single" w:color="808080" w:sz="4"/>
-              <w:left w:val="single" w:color="808080" w:sz="4"/>
-              <w:bottom w:val="single" w:color="808080" w:sz="4"/>
-              <w:right w:val="single" w:color="808080" w:sz="4"/>
-            </w:tcBorders>
-            <w:tcMar>
-              <w:top w:type="dxa" w:w="40"/>
-              <w:left w:type="dxa" w:w="60"/>
-              <w:bottom w:type="dxa" w:w="40"/>
-              <w:right w:type="dxa" w:w="60"/>
-            </w:tcMar>
-            <w:vAlign w:val="top"/>
-          </w:tcPr>
-          <w:p>
-            <w:pPr>
-              <w:spacing w:after="0" w:before="0"/>
-              <w:jc w:val="right"/>
-            </w:pPr>
-            <w:r>
-              <w:rPr>
-                <w:rFonts w:ascii="Calibri" w:cs="Calibri" w:eastAsia="Calibri" w:hAnsi="Calibri"/>
-                <w:b w:val="false"/>
-                <w:bCs w:val="false"/>
-                <w:sz w:val="14"/>
-                <w:szCs w:val="14"/>
-              </w:rPr>
-              <w:t xml:space="preserve">100,00</w:t>
-            </w:r>
-          </w:p>
-        </w:tc>
-      </w:tr>
-      <w:tr>
-        <w:tc>
-          <w:tcPr>
-            <w:vMerge w:val="continue"/>
-            <w:tcBorders>
-              <w:top w:val="single" w:color="808080" w:sz="4"/>
-              <w:left w:val="single" w:color="808080" w:sz="4"/>
-              <w:bottom w:val="single" w:color="808080" w:sz="4"/>
-              <w:right w:val="single" w:color="808080" w:sz="4"/>
-            </w:tcBorders>
-          </w:tcPr>
-          <w:p/>
-        </w:tc>
-        <w:tc>
-          <w:tcPr>
-            <w:tcW w:type="dxa" w:w="454"/>
-            <w:tcBorders>
-              <w:top w:val="single" w:color="808080" w:sz="4"/>
-              <w:left w:val="single" w:color="808080" w:sz="4"/>
-              <w:bottom w:val="single" w:color="808080" w:sz="4"/>
-              <w:right w:val="single" w:color="808080" w:sz="4"/>
-            </w:tcBorders>
-            <w:tcMar>
-              <w:top w:type="dxa" w:w="40"/>
-              <w:left w:type="dxa" w:w="60"/>
-              <w:bottom w:type="dxa" w:w="40"/>
-              <w:right w:type="dxa" w:w="60"/>
-            </w:tcMar>
-            <w:vAlign w:val="top"/>
-          </w:tcPr>
-          <w:p>
-            <w:pPr>
-              <w:spacing w:after="0" w:before="0"/>
-              <w:jc w:val="center"/>
-            </w:pPr>
-            <w:r>
-              <w:rPr>
-                <w:rFonts w:ascii="Calibri" w:cs="Calibri" w:eastAsia="Calibri" w:hAnsi="Calibri"/>
-                <w:b w:val="false"/>
-                <w:bCs w:val="false"/>
-                <w:sz w:val="14"/>
-                <w:szCs w:val="14"/>
-              </w:rPr>
-              <w:t xml:space="preserve">11</w:t>
-            </w:r>
-          </w:p>
-        </w:tc>
-        <w:tc>
-          <w:tcPr>
-            <w:tcW w:type="dxa" w:w="1134"/>
-            <w:tcBorders>
-              <w:top w:val="single" w:color="808080" w:sz="4"/>
-              <w:left w:val="single" w:color="808080" w:sz="4"/>
-              <w:bottom w:val="single" w:color="808080" w:sz="4"/>
-              <w:right w:val="single" w:color="808080" w:sz="4"/>
-            </w:tcBorders>
-            <w:tcMar>
-              <w:top w:type="dxa" w:w="40"/>
-              <w:left w:type="dxa" w:w="60"/>
-              <w:bottom w:type="dxa" w:w="40"/>
-              <w:right w:type="dxa" w:w="60"/>
-            </w:tcMar>
-            <w:vAlign w:val="top"/>
-          </w:tcPr>
-          <w:p>
-            <w:pPr>
-              <w:spacing w:after="0" w:before="0"/>
-              <w:jc w:val="center"/>
-            </w:pPr>
-            <w:r>
-              <w:rPr>
-                <w:rFonts w:ascii="Calibri" w:cs="Calibri" w:eastAsia="Calibri" w:hAnsi="Calibri"/>
-                <w:b w:val="false"/>
-                <w:bCs w:val="false"/>
-                <w:sz w:val="14"/>
-                <w:szCs w:val="14"/>
-              </w:rPr>
-              <w:t xml:space="preserve">30.750.3002</w:t>
-            </w:r>
-          </w:p>
-        </w:tc>
-        <w:tc>
-          <w:tcPr>
-            <w:tcW w:type="dxa" w:w="5102"/>
-            <w:tcBorders>
-              <w:top w:val="single" w:color="808080" w:sz="4"/>
-              <w:left w:val="single" w:color="808080" w:sz="4"/>
-              <w:bottom w:val="single" w:color="808080" w:sz="4"/>
-              <w:right w:val="single" w:color="808080" w:sz="4"/>
-            </w:tcBorders>
-            <w:tcMar>
-              <w:top w:type="dxa" w:w="40"/>
-              <w:left w:type="dxa" w:w="60"/>
-              <w:bottom w:type="dxa" w:w="40"/>
-              <w:right w:type="dxa" w:w="60"/>
-            </w:tcMar>
-            <w:vAlign w:val="top"/>
-          </w:tcPr>
-          <w:p>
-            <w:pPr>
-              <w:spacing w:after="0" w:before="0"/>
-              <w:jc w:val="left"/>
-            </w:pPr>
-            <w:r>
-              <w:rPr>
-                <w:rFonts w:ascii="Calibri" w:cs="Calibri" w:eastAsia="Calibri" w:hAnsi="Calibri"/>
-                <w:b w:val="false"/>
-                <w:bCs w:val="false"/>
-                <w:sz w:val="14"/>
-                <w:szCs w:val="14"/>
-              </w:rPr>
-              <w:t xml:space="preserve">Bina ihata iletkeni tesisatı — 30x3,5 mm galvanizli çelik lama (temel topraklaması)</w:t>
-            </w:r>
-          </w:p>
-        </w:tc>
-        <w:tc>
-          <w:tcPr>
-            <w:tcW w:type="dxa" w:w="680"/>
-            <w:tcBorders>
-              <w:top w:val="single" w:color="808080" w:sz="4"/>
-              <w:left w:val="single" w:color="808080" w:sz="4"/>
-              <w:bottom w:val="single" w:color="808080" w:sz="4"/>
-              <w:right w:val="single" w:color="808080" w:sz="4"/>
-            </w:tcBorders>
-            <w:tcMar>
-              <w:top w:type="dxa" w:w="40"/>
-              <w:left w:type="dxa" w:w="60"/>
-              <w:bottom w:type="dxa" w:w="40"/>
-              <w:right w:type="dxa" w:w="60"/>
-            </w:tcMar>
-            <w:vAlign w:val="top"/>
-          </w:tcPr>
-          <w:p>
-            <w:pPr>
-              <w:spacing w:after="0" w:before="0"/>
-              <w:jc w:val="center"/>
-            </w:pPr>
-            <w:r>
-              <w:rPr>
-                <w:rFonts w:ascii="Calibri" w:cs="Calibri" w:eastAsia="Calibri" w:hAnsi="Calibri"/>
-                <w:b w:val="false"/>
-                <w:bCs w:val="false"/>
-                <w:sz w:val="14"/>
-                <w:szCs w:val="14"/>
-              </w:rPr>
-              <w:t xml:space="preserve">m</w:t>
-            </w:r>
-          </w:p>
-        </w:tc>
-        <w:tc>
-          <w:tcPr>
-            <w:tcW w:type="dxa" w:w="1134"/>
-            <w:tcBorders>
-              <w:top w:val="single" w:color="808080" w:sz="4"/>
-              <w:left w:val="single" w:color="808080" w:sz="4"/>
-              <w:bottom w:val="single" w:color="808080" w:sz="4"/>
-              <w:right w:val="single" w:color="808080" w:sz="4"/>
-            </w:tcBorders>
-            <w:tcMar>
-              <w:top w:type="dxa" w:w="40"/>
-              <w:left w:type="dxa" w:w="60"/>
-              <w:bottom w:type="dxa" w:w="40"/>
-              <w:right w:type="dxa" w:w="60"/>
-            </w:tcMar>
-            <w:vAlign w:val="top"/>
-          </w:tcPr>
-          <w:p>
-            <w:pPr>
-              <w:spacing w:after="0" w:before="0"/>
-              <w:jc w:val="right"/>
-            </w:pPr>
-            <w:r>
-              <w:rPr>
-                <w:rFonts w:ascii="Calibri" w:cs="Calibri" w:eastAsia="Calibri" w:hAnsi="Calibri"/>
-                <w:b w:val="false"/>
-                <w:bCs w:val="false"/>
-                <w:sz w:val="14"/>
-                <w:szCs w:val="14"/>
-              </w:rPr>
-              <w:t xml:space="preserve">186,00</w:t>
-            </w:r>
-          </w:p>
-        </w:tc>
-      </w:tr>
-      <w:tr>
-        <w:tc>
-          <w:tcPr>
-            <w:vMerge w:val="continue"/>
-            <w:tcBorders>
-              <w:top w:val="single" w:color="808080" w:sz="4"/>
-              <w:left w:val="single" w:color="808080" w:sz="4"/>
-              <w:bottom w:val="single" w:color="808080" w:sz="4"/>
-              <w:right w:val="single" w:color="808080" w:sz="4"/>
-            </w:tcBorders>
-          </w:tcPr>
-          <w:p/>
-        </w:tc>
-        <w:tc>
-          <w:tcPr>
-            <w:tcW w:type="dxa" w:w="454"/>
-            <w:tcBorders>
-              <w:top w:val="single" w:color="808080" w:sz="4"/>
-              <w:left w:val="single" w:color="808080" w:sz="4"/>
-              <w:bottom w:val="single" w:color="808080" w:sz="4"/>
-              <w:right w:val="single" w:color="808080" w:sz="4"/>
-            </w:tcBorders>
-            <w:tcMar>
-              <w:top w:type="dxa" w:w="40"/>
-              <w:left w:type="dxa" w:w="60"/>
-              <w:bottom w:type="dxa" w:w="40"/>
-              <w:right w:type="dxa" w:w="60"/>
-            </w:tcMar>
-            <w:vAlign w:val="top"/>
-          </w:tcPr>
-          <w:p>
-            <w:pPr>
-              <w:spacing w:after="0" w:before="0"/>
-              <w:jc w:val="center"/>
-            </w:pPr>
-            <w:r>
-              <w:rPr>
-                <w:rFonts w:ascii="Calibri" w:cs="Calibri" w:eastAsia="Calibri" w:hAnsi="Calibri"/>
-                <w:b w:val="false"/>
-                <w:bCs w:val="false"/>
-                <w:sz w:val="14"/>
-                <w:szCs w:val="14"/>
-              </w:rPr>
-              <w:t xml:space="preserve">12</w:t>
-            </w:r>
-          </w:p>
-        </w:tc>
-        <w:tc>
-          <w:tcPr>
-            <w:tcW w:type="dxa" w:w="1134"/>
-            <w:tcBorders>
-              <w:top w:val="single" w:color="808080" w:sz="4"/>
-              <w:left w:val="single" w:color="808080" w:sz="4"/>
-              <w:bottom w:val="single" w:color="808080" w:sz="4"/>
-              <w:right w:val="single" w:color="808080" w:sz="4"/>
-            </w:tcBorders>
-            <w:tcMar>
-              <w:top w:type="dxa" w:w="40"/>
-              <w:left w:type="dxa" w:w="60"/>
-              <w:bottom w:type="dxa" w:w="40"/>
-              <w:right w:type="dxa" w:w="60"/>
-            </w:tcMar>
-            <w:vAlign w:val="top"/>
-          </w:tcPr>
-          <w:p>
-            <w:pPr>
-              <w:spacing w:after="0" w:before="0"/>
-              <w:jc w:val="center"/>
-            </w:pPr>
-            <w:r>
-              <w:rPr>
-                <w:rFonts w:ascii="Calibri" w:cs="Calibri" w:eastAsia="Calibri" w:hAnsi="Calibri"/>
-                <w:b w:val="false"/>
-                <w:bCs w:val="false"/>
-                <w:sz w:val="14"/>
-                <w:szCs w:val="14"/>
-              </w:rPr>
-              <w:t xml:space="preserve">30.750.1502</w:t>
-            </w:r>
-          </w:p>
-        </w:tc>
-        <w:tc>
-          <w:tcPr>
-            <w:tcW w:type="dxa" w:w="5102"/>
-            <w:tcBorders>
-              <w:top w:val="single" w:color="808080" w:sz="4"/>
-              <w:left w:val="single" w:color="808080" w:sz="4"/>
-              <w:bottom w:val="single" w:color="808080" w:sz="4"/>
-              <w:right w:val="single" w:color="808080" w:sz="4"/>
-            </w:tcBorders>
-            <w:tcMar>
-              <w:top w:type="dxa" w:w="40"/>
-              <w:left w:type="dxa" w:w="60"/>
-              <w:bottom w:type="dxa" w:w="40"/>
-              <w:right w:type="dxa" w:w="60"/>
-            </w:tcMar>
-            <w:vAlign w:val="top"/>
-          </w:tcPr>
-          <w:p>
-            <w:pPr>
-              <w:spacing w:after="0" w:before="0"/>
-              <w:jc w:val="left"/>
-            </w:pPr>
-            <w:r>
-              <w:rPr>
-                <w:rFonts w:ascii="Calibri" w:cs="Calibri" w:eastAsia="Calibri" w:hAnsi="Calibri"/>
-                <w:b w:val="false"/>
-                <w:bCs w:val="false"/>
-                <w:sz w:val="14"/>
-                <w:szCs w:val="14"/>
-              </w:rPr>
-              <w:t xml:space="preserve">Aktif yakalama ucu, ortalama uyarım yolu DL = 30-40 m</w:t>
-            </w:r>
-          </w:p>
-        </w:tc>
-        <w:tc>
-          <w:tcPr>
-            <w:tcW w:type="dxa" w:w="680"/>
-            <w:tcBorders>
-              <w:top w:val="single" w:color="808080" w:sz="4"/>
-              <w:left w:val="single" w:color="808080" w:sz="4"/>
-              <w:bottom w:val="single" w:color="808080" w:sz="4"/>
-              <w:right w:val="single" w:color="808080" w:sz="4"/>
-            </w:tcBorders>
-            <w:tcMar>
-              <w:top w:type="dxa" w:w="40"/>
-              <w:left w:type="dxa" w:w="60"/>
-              <w:bottom w:type="dxa" w:w="40"/>
-              <w:right w:type="dxa" w:w="60"/>
-            </w:tcMar>
-            <w:vAlign w:val="top"/>
-          </w:tcPr>
-          <w:p>
-            <w:pPr>
-              <w:spacing w:after="0" w:before="0"/>
-              <w:jc w:val="center"/>
-            </w:pPr>
-            <w:r>
-              <w:rPr>
-                <w:rFonts w:ascii="Calibri" w:cs="Calibri" w:eastAsia="Calibri" w:hAnsi="Calibri"/>
-                <w:b w:val="false"/>
-                <w:bCs w:val="false"/>
-                <w:sz w:val="14"/>
-                <w:szCs w:val="14"/>
-              </w:rPr>
-              <w:t xml:space="preserve">ad</w:t>
-            </w:r>
-          </w:p>
-        </w:tc>
-        <w:tc>
-          <w:tcPr>
-            <w:tcW w:type="dxa" w:w="1134"/>
-            <w:tcBorders>
-              <w:top w:val="single" w:color="808080" w:sz="4"/>
-              <w:left w:val="single" w:color="808080" w:sz="4"/>
-              <w:bottom w:val="single" w:color="808080" w:sz="4"/>
-              <w:right w:val="single" w:color="808080" w:sz="4"/>
-            </w:tcBorders>
-            <w:tcMar>
-              <w:top w:type="dxa" w:w="40"/>
-              <w:left w:type="dxa" w:w="60"/>
-              <w:bottom w:type="dxa" w:w="40"/>
-              <w:right w:type="dxa" w:w="60"/>
-            </w:tcMar>
-            <w:vAlign w:val="top"/>
-          </w:tcPr>
-          <w:p>
-            <w:pPr>
-              <w:spacing w:after="0" w:before="0"/>
-              <w:jc w:val="right"/>
-            </w:pPr>
-            <w:r>
-              <w:rPr>
-                <w:rFonts w:ascii="Calibri" w:cs="Calibri" w:eastAsia="Calibri" w:hAnsi="Calibri"/>
-                <w:b w:val="false"/>
-                <w:bCs w:val="false"/>
-                <w:sz w:val="14"/>
-                <w:szCs w:val="14"/>
-              </w:rPr>
-              <w:t xml:space="preserve">1,00</w:t>
-            </w:r>
-          </w:p>
-        </w:tc>
-      </w:tr>
-      <w:tr>
-        <w:tc>
-          <w:tcPr>
-            <w:vMerge w:val="continue"/>
-            <w:tcBorders>
-              <w:top w:val="single" w:color="808080" w:sz="4"/>
-              <w:left w:val="single" w:color="808080" w:sz="4"/>
-              <w:bottom w:val="single" w:color="808080" w:sz="4"/>
-              <w:right w:val="single" w:color="808080" w:sz="4"/>
-            </w:tcBorders>
-          </w:tcPr>
-          <w:p/>
-        </w:tc>
-        <w:tc>
-          <w:tcPr>
-            <w:tcW w:type="dxa" w:w="454"/>
-            <w:tcBorders>
-              <w:top w:val="single" w:color="808080" w:sz="4"/>
-              <w:left w:val="single" w:color="808080" w:sz="4"/>
-              <w:bottom w:val="single" w:color="808080" w:sz="4"/>
-              <w:right w:val="single" w:color="808080" w:sz="4"/>
-            </w:tcBorders>
-            <w:tcMar>
-              <w:top w:type="dxa" w:w="40"/>
-              <w:left w:type="dxa" w:w="60"/>
-              <w:bottom w:type="dxa" w:w="40"/>
-              <w:right w:type="dxa" w:w="60"/>
-            </w:tcMar>
-            <w:vAlign w:val="top"/>
-          </w:tcPr>
-          <w:p>
-            <w:pPr>
-              <w:spacing w:after="0" w:before="0"/>
-              <w:jc w:val="center"/>
-            </w:pPr>
-            <w:r>
-              <w:rPr>
-                <w:rFonts w:ascii="Calibri" w:cs="Calibri" w:eastAsia="Calibri" w:hAnsi="Calibri"/>
-                <w:b w:val="false"/>
-                <w:bCs w:val="false"/>
-                <w:sz w:val="14"/>
-                <w:szCs w:val="14"/>
-              </w:rPr>
-              <w:t xml:space="preserve">13</w:t>
-            </w:r>
-          </w:p>
-        </w:tc>
-        <w:tc>
-          <w:tcPr>
-            <w:tcW w:type="dxa" w:w="1134"/>
-            <w:tcBorders>
-              <w:top w:val="single" w:color="808080" w:sz="4"/>
-              <w:left w:val="single" w:color="808080" w:sz="4"/>
-              <w:bottom w:val="single" w:color="808080" w:sz="4"/>
-              <w:right w:val="single" w:color="808080" w:sz="4"/>
-            </w:tcBorders>
-            <w:tcMar>
-              <w:top w:type="dxa" w:w="40"/>
-              <w:left w:type="dxa" w:w="60"/>
-              <w:bottom w:type="dxa" w:w="40"/>
-              <w:right w:type="dxa" w:w="60"/>
-            </w:tcMar>
-            <w:vAlign w:val="top"/>
-          </w:tcPr>
-          <w:p>
-            <w:pPr>
-              <w:spacing w:after="0" w:before="0"/>
-              <w:jc w:val="center"/>
-            </w:pPr>
-            <w:r>
-              <w:rPr>
-                <w:rFonts w:ascii="Calibri" w:cs="Calibri" w:eastAsia="Calibri" w:hAnsi="Calibri"/>
-                <w:b w:val="false"/>
-                <w:bCs w:val="false"/>
-                <w:sz w:val="14"/>
-                <w:szCs w:val="14"/>
-              </w:rPr>
-              <w:t xml:space="preserve">30.750.2001</w:t>
-            </w:r>
-          </w:p>
-        </w:tc>
-        <w:tc>
-          <w:tcPr>
-            <w:tcW w:type="dxa" w:w="5102"/>
-            <w:tcBorders>
-              <w:top w:val="single" w:color="808080" w:sz="4"/>
-              <w:left w:val="single" w:color="808080" w:sz="4"/>
-              <w:bottom w:val="single" w:color="808080" w:sz="4"/>
-              <w:right w:val="single" w:color="808080" w:sz="4"/>
-            </w:tcBorders>
-            <w:tcMar>
-              <w:top w:type="dxa" w:w="40"/>
-              <w:left w:type="dxa" w:w="60"/>
-              <w:bottom w:type="dxa" w:w="40"/>
-              <w:right w:type="dxa" w:w="60"/>
-            </w:tcMar>
-            <w:vAlign w:val="top"/>
-          </w:tcPr>
-          <w:p>
-            <w:pPr>
-              <w:spacing w:after="0" w:before="0"/>
-              <w:jc w:val="left"/>
-            </w:pPr>
-            <w:r>
-              <w:rPr>
-                <w:rFonts w:ascii="Calibri" w:cs="Calibri" w:eastAsia="Calibri" w:hAnsi="Calibri"/>
-                <w:b w:val="false"/>
-                <w:bCs w:val="false"/>
-                <w:sz w:val="14"/>
-                <w:szCs w:val="14"/>
-              </w:rPr>
-              <w:t xml:space="preserve">Çatı ihata ve indirme iletkeni tesisatı — 50 mm² elektrolitik bakır tel</w:t>
-            </w:r>
-          </w:p>
-        </w:tc>
-        <w:tc>
-          <w:tcPr>
-            <w:tcW w:type="dxa" w:w="680"/>
-            <w:tcBorders>
-              <w:top w:val="single" w:color="808080" w:sz="4"/>
-              <w:left w:val="single" w:color="808080" w:sz="4"/>
-              <w:bottom w:val="single" w:color="808080" w:sz="4"/>
-              <w:right w:val="single" w:color="808080" w:sz="4"/>
-            </w:tcBorders>
-            <w:tcMar>
-              <w:top w:type="dxa" w:w="40"/>
-              <w:left w:type="dxa" w:w="60"/>
-              <w:bottom w:type="dxa" w:w="40"/>
-              <w:right w:type="dxa" w:w="60"/>
-            </w:tcMar>
-            <w:vAlign w:val="top"/>
-          </w:tcPr>
-          <w:p>
-            <w:pPr>
-              <w:spacing w:after="0" w:before="0"/>
-              <w:jc w:val="center"/>
-            </w:pPr>
-            <w:r>
-              <w:rPr>
-                <w:rFonts w:ascii="Calibri" w:cs="Calibri" w:eastAsia="Calibri" w:hAnsi="Calibri"/>
-                <w:b w:val="false"/>
-                <w:bCs w:val="false"/>
-                <w:sz w:val="14"/>
-                <w:szCs w:val="14"/>
-              </w:rPr>
-              <w:t xml:space="preserve">m</w:t>
-            </w:r>
-          </w:p>
-        </w:tc>
-        <w:tc>
-          <w:tcPr>
-            <w:tcW w:type="dxa" w:w="1134"/>
-            <w:tcBorders>
-              <w:top w:val="single" w:color="808080" w:sz="4"/>
-              <w:left w:val="single" w:color="808080" w:sz="4"/>
-              <w:bottom w:val="single" w:color="808080" w:sz="4"/>
-              <w:right w:val="single" w:color="808080" w:sz="4"/>
-            </w:tcBorders>
-            <w:tcMar>
-              <w:top w:type="dxa" w:w="40"/>
-              <w:left w:type="dxa" w:w="60"/>
-              <w:bottom w:type="dxa" w:w="40"/>
-              <w:right w:type="dxa" w:w="60"/>
-            </w:tcMar>
-            <w:vAlign w:val="top"/>
-          </w:tcPr>
-          <w:p>
-            <w:pPr>
-              <w:spacing w:after="0" w:before="0"/>
-              <w:jc w:val="right"/>
-            </w:pPr>
-            <w:r>
-              <w:rPr>
-                <w:rFonts w:ascii="Calibri" w:cs="Calibri" w:eastAsia="Calibri" w:hAnsi="Calibri"/>
-                <w:b w:val="false"/>
-                <w:bCs w:val="false"/>
-                <w:sz w:val="14"/>
-                <w:szCs w:val="14"/>
-              </w:rPr>
-              <w:t xml:space="preserve">16,00</w:t>
-            </w:r>
-          </w:p>
-        </w:tc>
-      </w:tr>
-      <w:tr>
-        <w:tc>
-          <w:tcPr>
-            <w:vMerge w:val="continue"/>
-            <w:tcBorders>
-              <w:top w:val="single" w:color="808080" w:sz="4"/>
-              <w:left w:val="single" w:color="808080" w:sz="4"/>
-              <w:bottom w:val="single" w:color="808080" w:sz="4"/>
-              <w:right w:val="single" w:color="808080" w:sz="4"/>
-            </w:tcBorders>
-          </w:tcPr>
-          <w:p/>
-        </w:tc>
-        <w:tc>
-          <w:tcPr>
-            <w:tcW w:type="dxa" w:w="454"/>
-            <w:tcBorders>
-              <w:top w:val="single" w:color="808080" w:sz="4"/>
-              <w:left w:val="single" w:color="808080" w:sz="4"/>
-              <w:bottom w:val="single" w:color="808080" w:sz="4"/>
-              <w:right w:val="single" w:color="808080" w:sz="4"/>
-            </w:tcBorders>
-            <w:tcMar>
-              <w:top w:type="dxa" w:w="40"/>
-              <w:left w:type="dxa" w:w="60"/>
-              <w:bottom w:type="dxa" w:w="40"/>
-              <w:right w:type="dxa" w:w="60"/>
-            </w:tcMar>
-            <w:vAlign w:val="top"/>
-          </w:tcPr>
-          <w:p>
-            <w:pPr>
-              <w:spacing w:after="0" w:before="0"/>
-              <w:jc w:val="center"/>
-            </w:pPr>
-            <w:r>
-              <w:rPr>
-                <w:rFonts w:ascii="Calibri" w:cs="Calibri" w:eastAsia="Calibri" w:hAnsi="Calibri"/>
-                <w:b w:val="false"/>
-                <w:bCs w:val="false"/>
-                <w:sz w:val="14"/>
-                <w:szCs w:val="14"/>
-              </w:rPr>
-              <w:t xml:space="preserve">14</w:t>
-            </w:r>
-          </w:p>
-        </w:tc>
-        <w:tc>
-          <w:tcPr>
-            <w:tcW w:type="dxa" w:w="1134"/>
-            <w:tcBorders>
-              <w:top w:val="single" w:color="808080" w:sz="4"/>
-              <w:left w:val="single" w:color="808080" w:sz="4"/>
-              <w:bottom w:val="single" w:color="808080" w:sz="4"/>
-              <w:right w:val="single" w:color="808080" w:sz="4"/>
-            </w:tcBorders>
-            <w:tcMar>
-              <w:top w:type="dxa" w:w="40"/>
-              <w:left w:type="dxa" w:w="60"/>
-              <w:bottom w:type="dxa" w:w="40"/>
-              <w:right w:type="dxa" w:w="60"/>
-            </w:tcMar>
-            <w:vAlign w:val="top"/>
-          </w:tcPr>
-          <w:p>
-            <w:pPr>
-              <w:spacing w:after="0" w:before="0"/>
-              <w:jc w:val="center"/>
-            </w:pPr>
-            <w:r>
-              <w:rPr>
-                <w:rFonts w:ascii="Calibri" w:cs="Calibri" w:eastAsia="Calibri" w:hAnsi="Calibri"/>
-                <w:b w:val="false"/>
-                <w:bCs w:val="false"/>
-                <w:sz w:val="14"/>
-                <w:szCs w:val="14"/>
-              </w:rPr>
-              <w:t xml:space="preserve">30.740.1106</w:t>
-            </w:r>
-          </w:p>
-        </w:tc>
-        <w:tc>
-          <w:tcPr>
-            <w:tcW w:type="dxa" w:w="5102"/>
-            <w:tcBorders>
-              <w:top w:val="single" w:color="808080" w:sz="4"/>
-              <w:left w:val="single" w:color="808080" w:sz="4"/>
-              <w:bottom w:val="single" w:color="808080" w:sz="4"/>
-              <w:right w:val="single" w:color="808080" w:sz="4"/>
-            </w:tcBorders>
-            <w:tcMar>
-              <w:top w:type="dxa" w:w="40"/>
-              <w:left w:type="dxa" w:w="60"/>
-              <w:bottom w:type="dxa" w:w="40"/>
-              <w:right w:type="dxa" w:w="60"/>
-            </w:tcMar>
-            <w:vAlign w:val="top"/>
-          </w:tcPr>
-          <w:p>
-            <w:pPr>
-              <w:spacing w:after="0" w:before="0"/>
-              <w:jc w:val="left"/>
-            </w:pPr>
-            <w:r>
-              <w:rPr>
-                <w:rFonts w:ascii="Calibri" w:cs="Calibri" w:eastAsia="Calibri" w:hAnsi="Calibri"/>
-                <w:b w:val="false"/>
-                <w:bCs w:val="false"/>
-                <w:sz w:val="14"/>
-                <w:szCs w:val="14"/>
-              </w:rPr>
-              <w:t xml:space="preserve">Dizel elektrojen grubu (jeneratör) 63 kVA / 50 kW — dizel motoru su veya hava ile soğuyan cinsten, 1500 d/dak</w:t>
-            </w:r>
-          </w:p>
-        </w:tc>
-        <w:tc>
-          <w:tcPr>
-            <w:tcW w:type="dxa" w:w="680"/>
-            <w:tcBorders>
-              <w:top w:val="single" w:color="808080" w:sz="4"/>
-              <w:left w:val="single" w:color="808080" w:sz="4"/>
-              <w:bottom w:val="single" w:color="808080" w:sz="4"/>
-              <w:right w:val="single" w:color="808080" w:sz="4"/>
-            </w:tcBorders>
-            <w:tcMar>
-              <w:top w:type="dxa" w:w="40"/>
-              <w:left w:type="dxa" w:w="60"/>
-              <w:bottom w:type="dxa" w:w="40"/>
-              <w:right w:type="dxa" w:w="60"/>
-            </w:tcMar>
-            <w:vAlign w:val="top"/>
-          </w:tcPr>
-          <w:p>
-            <w:pPr>
-              <w:spacing w:after="0" w:before="0"/>
-              <w:jc w:val="center"/>
-            </w:pPr>
-            <w:r>
-              <w:rPr>
-                <w:rFonts w:ascii="Calibri" w:cs="Calibri" w:eastAsia="Calibri" w:hAnsi="Calibri"/>
-                <w:b w:val="false"/>
-                <w:bCs w:val="false"/>
-                <w:sz w:val="14"/>
-                <w:szCs w:val="14"/>
-              </w:rPr>
-              <w:t xml:space="preserve">ad</w:t>
-            </w:r>
-          </w:p>
-        </w:tc>
-        <w:tc>
-          <w:tcPr>
-            <w:tcW w:type="dxa" w:w="1134"/>
-            <w:tcBorders>
-              <w:top w:val="single" w:color="808080" w:sz="4"/>
-              <w:left w:val="single" w:color="808080" w:sz="4"/>
-              <w:bottom w:val="single" w:color="808080" w:sz="4"/>
-              <w:right w:val="single" w:color="808080" w:sz="4"/>
-            </w:tcBorders>
-            <w:tcMar>
-              <w:top w:type="dxa" w:w="40"/>
-              <w:left w:type="dxa" w:w="60"/>
-              <w:bottom w:type="dxa" w:w="40"/>
-              <w:right w:type="dxa" w:w="60"/>
-            </w:tcMar>
-            <w:vAlign w:val="top"/>
-          </w:tcPr>
-          <w:p>
-            <w:pPr>
-              <w:spacing w:after="0" w:before="0"/>
-              <w:jc w:val="right"/>
-            </w:pPr>
-            <w:r>
-              <w:rPr>
-                <w:rFonts w:ascii="Calibri" w:cs="Calibri" w:eastAsia="Calibri" w:hAnsi="Calibri"/>
-                <w:b w:val="false"/>
-                <w:bCs w:val="false"/>
-                <w:sz w:val="14"/>
-                <w:szCs w:val="14"/>
-              </w:rPr>
-              <w:t xml:space="preserve">1,00</w:t>
-            </w:r>
-          </w:p>
-        </w:tc>
-      </w:tr>
-      <w:tr>
-        <w:tc>
-          <w:tcPr>
-            <w:vMerge w:val="continue"/>
-            <w:tcBorders>
-              <w:top w:val="single" w:color="808080" w:sz="4"/>
-              <w:left w:val="single" w:color="808080" w:sz="4"/>
-              <w:bottom w:val="single" w:color="808080" w:sz="4"/>
-              <w:right w:val="single" w:color="808080" w:sz="4"/>
-            </w:tcBorders>
-          </w:tcPr>
-          <w:p/>
-        </w:tc>
-        <w:tc>
-          <w:tcPr>
-            <w:tcW w:type="dxa" w:w="454"/>
-            <w:tcBorders>
-              <w:top w:val="single" w:color="808080" w:sz="4"/>
-              <w:left w:val="single" w:color="808080" w:sz="4"/>
-              <w:bottom w:val="single" w:color="808080" w:sz="4"/>
-              <w:right w:val="single" w:color="808080" w:sz="4"/>
-            </w:tcBorders>
-            <w:tcMar>
-              <w:top w:type="dxa" w:w="40"/>
-              <w:left w:type="dxa" w:w="60"/>
-              <w:bottom w:type="dxa" w:w="40"/>
-              <w:right w:type="dxa" w:w="60"/>
-            </w:tcMar>
-            <w:vAlign w:val="top"/>
-          </w:tcPr>
-          <w:p>
-            <w:pPr>
-              <w:spacing w:after="0" w:before="0"/>
-              <w:jc w:val="center"/>
-            </w:pPr>
-            <w:r>
-              <w:rPr>
-                <w:rFonts w:ascii="Calibri" w:cs="Calibri" w:eastAsia="Calibri" w:hAnsi="Calibri"/>
-                <w:b w:val="false"/>
-                <w:bCs w:val="false"/>
-                <w:sz w:val="14"/>
-                <w:szCs w:val="14"/>
-              </w:rPr>
-              <w:t xml:space="preserve">15</w:t>
-            </w:r>
-          </w:p>
-        </w:tc>
-        <w:tc>
-          <w:tcPr>
-            <w:tcW w:type="dxa" w:w="1134"/>
-            <w:tcBorders>
-              <w:top w:val="single" w:color="808080" w:sz="4"/>
-              <w:left w:val="single" w:color="808080" w:sz="4"/>
-              <w:bottom w:val="single" w:color="808080" w:sz="4"/>
-              <w:right w:val="single" w:color="808080" w:sz="4"/>
-            </w:tcBorders>
-            <w:tcMar>
-              <w:top w:type="dxa" w:w="40"/>
-              <w:left w:type="dxa" w:w="60"/>
-              <w:bottom w:type="dxa" w:w="40"/>
-              <w:right w:type="dxa" w:w="60"/>
-            </w:tcMar>
-            <w:vAlign w:val="top"/>
-          </w:tcPr>
-          <w:p>
-            <w:pPr>
-              <w:spacing w:after="0" w:before="0"/>
-              <w:jc w:val="center"/>
-            </w:pPr>
-            <w:r>
-              <w:rPr>
-                <w:rFonts w:ascii="Calibri" w:cs="Calibri" w:eastAsia="Calibri" w:hAnsi="Calibri"/>
-                <w:b w:val="false"/>
-                <w:bCs w:val="false"/>
-                <w:sz w:val="14"/>
-                <w:szCs w:val="14"/>
-              </w:rPr>
-              <w:t xml:space="preserve">30.740.5406</w:t>
-            </w:r>
-          </w:p>
-        </w:tc>
-        <w:tc>
-          <w:tcPr>
-            <w:tcW w:type="dxa" w:w="5102"/>
-            <w:tcBorders>
-              <w:top w:val="single" w:color="808080" w:sz="4"/>
-              <w:left w:val="single" w:color="808080" w:sz="4"/>
-              <w:bottom w:val="single" w:color="808080" w:sz="4"/>
-              <w:right w:val="single" w:color="808080" w:sz="4"/>
-            </w:tcBorders>
-            <w:tcMar>
-              <w:top w:type="dxa" w:w="40"/>
-              <w:left w:type="dxa" w:w="60"/>
-              <w:bottom w:type="dxa" w:w="40"/>
-              <w:right w:type="dxa" w:w="60"/>
-            </w:tcMar>
-            <w:vAlign w:val="top"/>
-          </w:tcPr>
-          <w:p>
-            <w:pPr>
-              <w:spacing w:after="0" w:before="0"/>
-              <w:jc w:val="left"/>
-            </w:pPr>
-            <w:r>
-              <w:rPr>
-                <w:rFonts w:ascii="Calibri" w:cs="Calibri" w:eastAsia="Calibri" w:hAnsi="Calibri"/>
-                <w:b w:val="false"/>
-                <w:bCs w:val="false"/>
-                <w:sz w:val="14"/>
-                <w:szCs w:val="14"/>
-              </w:rPr>
               <w:t xml:space="preserve">Jeneratör ses izolasyon kabini — 63 kVA</w:t>
-            </w:r>
-          </w:p>
-        </w:tc>
-        <w:tc>
-          <w:tcPr>
-            <w:tcW w:type="dxa" w:w="680"/>
-            <w:tcBorders>
-              <w:top w:val="single" w:color="808080" w:sz="4"/>
-              <w:left w:val="single" w:color="808080" w:sz="4"/>
-              <w:bottom w:val="single" w:color="808080" w:sz="4"/>
-              <w:right w:val="single" w:color="808080" w:sz="4"/>
-            </w:tcBorders>
-            <w:tcMar>
-              <w:top w:type="dxa" w:w="40"/>
-              <w:left w:type="dxa" w:w="60"/>
-              <w:bottom w:type="dxa" w:w="40"/>
-              <w:right w:type="dxa" w:w="60"/>
-            </w:tcMar>
-            <w:vAlign w:val="top"/>
-          </w:tcPr>
-          <w:p>
-            <w:pPr>
-              <w:spacing w:after="0" w:before="0"/>
-              <w:jc w:val="center"/>
-            </w:pPr>
-            <w:r>
-              <w:rPr>
-                <w:rFonts w:ascii="Calibri" w:cs="Calibri" w:eastAsia="Calibri" w:hAnsi="Calibri"/>
-                <w:b w:val="false"/>
-                <w:bCs w:val="false"/>
-                <w:sz w:val="14"/>
-                <w:szCs w:val="14"/>
-              </w:rPr>
-              <w:t xml:space="preserve">ad</w:t>
-            </w:r>
-          </w:p>
-        </w:tc>
-        <w:tc>
-          <w:tcPr>
-            <w:tcW w:type="dxa" w:w="1134"/>
-            <w:tcBorders>
-              <w:top w:val="single" w:color="808080" w:sz="4"/>
-              <w:left w:val="single" w:color="808080" w:sz="4"/>
-              <w:bottom w:val="single" w:color="808080" w:sz="4"/>
-              <w:right w:val="single" w:color="808080" w:sz="4"/>
-            </w:tcBorders>
-            <w:tcMar>
-              <w:top w:type="dxa" w:w="40"/>
-              <w:left w:type="dxa" w:w="60"/>
-              <w:bottom w:type="dxa" w:w="40"/>
-              <w:right w:type="dxa" w:w="60"/>
-            </w:tcMar>
-            <w:vAlign w:val="top"/>
-          </w:tcPr>
-          <w:p>
-            <w:pPr>
-              <w:spacing w:after="0" w:before="0"/>
-              <w:jc w:val="right"/>
-            </w:pPr>
-            <w:r>
-              <w:rPr>
-                <w:rFonts w:ascii="Calibri" w:cs="Calibri" w:eastAsia="Calibri" w:hAnsi="Calibri"/>
-                <w:b w:val="false"/>
-                <w:bCs w:val="false"/>
-                <w:sz w:val="14"/>
-                <w:szCs w:val="14"/>
-              </w:rPr>
-              <w:t xml:space="preserve">1,00</w:t>
-            </w:r>
-          </w:p>
-        </w:tc>
-      </w:tr>
-      <w:tr>
-        <w:tc>
-          <w:tcPr>
-            <w:vMerge w:val="continue"/>
-            <w:tcBorders>
-              <w:top w:val="single" w:color="808080" w:sz="4"/>
-              <w:left w:val="single" w:color="808080" w:sz="4"/>
-              <w:bottom w:val="single" w:color="808080" w:sz="4"/>
-              <w:right w:val="single" w:color="808080" w:sz="4"/>
-            </w:tcBorders>
-          </w:tcPr>
-          <w:p/>
-        </w:tc>
-        <w:tc>
-          <w:tcPr>
-            <w:tcW w:type="dxa" w:w="454"/>
-            <w:tcBorders>
-              <w:top w:val="single" w:color="808080" w:sz="4"/>
-              <w:left w:val="single" w:color="808080" w:sz="4"/>
-              <w:bottom w:val="single" w:color="808080" w:sz="4"/>
-              <w:right w:val="single" w:color="808080" w:sz="4"/>
-            </w:tcBorders>
-            <w:tcMar>
-              <w:top w:type="dxa" w:w="40"/>
-              <w:left w:type="dxa" w:w="60"/>
-              <w:bottom w:type="dxa" w:w="40"/>
-              <w:right w:type="dxa" w:w="60"/>
-            </w:tcMar>
-            <w:vAlign w:val="top"/>
-          </w:tcPr>
-          <w:p>
-            <w:pPr>
-              <w:spacing w:after="0" w:before="0"/>
-              <w:jc w:val="center"/>
-            </w:pPr>
-            <w:r>
-              <w:rPr>
-                <w:rFonts w:ascii="Calibri" w:cs="Calibri" w:eastAsia="Calibri" w:hAnsi="Calibri"/>
-                <w:b w:val="false"/>
-                <w:bCs w:val="false"/>
-                <w:sz w:val="14"/>
-                <w:szCs w:val="14"/>
-              </w:rPr>
-              <w:t xml:space="preserve">16</w:t>
-            </w:r>
-          </w:p>
-        </w:tc>
-        <w:tc>
-          <w:tcPr>
-            <w:tcW w:type="dxa" w:w="1134"/>
-            <w:tcBorders>
-              <w:top w:val="single" w:color="808080" w:sz="4"/>
-              <w:left w:val="single" w:color="808080" w:sz="4"/>
-              <w:bottom w:val="single" w:color="808080" w:sz="4"/>
-              <w:right w:val="single" w:color="808080" w:sz="4"/>
-            </w:tcBorders>
-            <w:tcMar>
-              <w:top w:type="dxa" w:w="40"/>
-              <w:left w:type="dxa" w:w="60"/>
-              <w:bottom w:type="dxa" w:w="40"/>
-              <w:right w:type="dxa" w:w="60"/>
-            </w:tcMar>
-            <w:vAlign w:val="top"/>
-          </w:tcPr>
-          <w:p>
-            <w:pPr>
-              <w:spacing w:after="0" w:before="0"/>
-              <w:jc w:val="center"/>
-            </w:pPr>
-            <w:r>
-              <w:rPr>
-                <w:rFonts w:ascii="Calibri" w:cs="Calibri" w:eastAsia="Calibri" w:hAnsi="Calibri"/>
-                <w:b w:val="false"/>
-                <w:bCs w:val="false"/>
-                <w:sz w:val="14"/>
-                <w:szCs w:val="14"/>
-              </w:rPr>
-              <w:t xml:space="preserve">30.120.2016</w:t>
-            </w:r>
-          </w:p>
-        </w:tc>
-        <w:tc>
-          <w:tcPr>
-            <w:tcW w:type="dxa" w:w="5102"/>
-            <w:tcBorders>
-              <w:top w:val="single" w:color="808080" w:sz="4"/>
-              <w:left w:val="single" w:color="808080" w:sz="4"/>
-              <w:bottom w:val="single" w:color="808080" w:sz="4"/>
-              <w:right w:val="single" w:color="808080" w:sz="4"/>
-            </w:tcBorders>
-            <w:tcMar>
-              <w:top w:type="dxa" w:w="40"/>
-              <w:left w:type="dxa" w:w="60"/>
-              <w:bottom w:type="dxa" w:w="40"/>
-              <w:right w:type="dxa" w:w="60"/>
-            </w:tcMar>
-            <w:vAlign w:val="top"/>
-          </w:tcPr>
-          <w:p>
-            <w:pPr>
-              <w:spacing w:after="0" w:before="0"/>
-              <w:jc w:val="left"/>
-            </w:pPr>
-            <w:r>
-              <w:rPr>
-                <w:rFonts w:ascii="Calibri" w:cs="Calibri" w:eastAsia="Calibri" w:hAnsi="Calibri"/>
-                <w:b w:val="false"/>
-                <w:bCs w:val="false"/>
-                <w:sz w:val="14"/>
-                <w:szCs w:val="14"/>
-              </w:rPr>
-              <w:t xml:space="preserve">Otomatik transfer şalteri 4 x 200 A</w:t>
             </w:r>
           </w:p>
         </w:tc>

</xml_diff>

<commit_message>
Yayın: elektrik pozlarından montaj bedeli çıkarıldı
Co-Authored-By: Claude Opus 5 <noreply@anthropic.com>
Claude-Session: https://claude.ai/code/session_01HJPp6bx7wepUX5p8fxGcjg
</commit_message>
<xml_diff>
--- a/belgeler/27_KESIF_OZETI_EK_01_KUMES_A_BLOK.docx
+++ b/belgeler/27_KESIF_OZETI_EK_01_KUMES_A_BLOK.docx
@@ -4907,7 +4907,7 @@
                 <w:sz w:val="14"/>
                 <w:szCs w:val="14"/>
               </w:rPr>
-              <w:t xml:space="preserve">Kümes dağıtım panosu (sıva üstü galvanizli sac tablo, 0,40-0,50 m²)</w:t>
+              <w:t xml:space="preserve">Kümes dağıtım panosu (sıva üstü galvanizli sac tablo, 0,40-0,50 m²) (%25 müteahhit kârı dahil)</w:t>
             </w:r>
           </w:p>
         </w:tc>
@@ -5091,7 +5091,7 @@
                 <w:sz w:val="14"/>
                 <w:szCs w:val="14"/>
               </w:rPr>
-              <w:t xml:space="preserve">Termik-manyetik kompakt şalter 3x100 A, Icu 35 kA — kümes besleme</w:t>
+              <w:t xml:space="preserve">Termik-manyetik kompakt şalter 3x100 A, Icu 35 kA — kümes besleme (%25 müteahhit kârı dahil)</w:t>
             </w:r>
           </w:p>
         </w:tc>
@@ -5275,7 +5275,7 @@
                 <w:sz w:val="14"/>
                 <w:szCs w:val="14"/>
               </w:rPr>
-              <w:t xml:space="preserve">Kaçak akım koruma şalteri 2x63 A, 30 mA</w:t>
+              <w:t xml:space="preserve">Kaçak akım koruma şalteri 2x63 A, 30 mA (%25 müteahhit kârı dahil)</w:t>
             </w:r>
           </w:p>
         </w:tc>
@@ -5459,7 +5459,7 @@
                 <w:sz w:val="14"/>
                 <w:szCs w:val="14"/>
               </w:rPr>
-              <w:t xml:space="preserve">YVV (NYY) 1 kV yeraltı kablosu ile kolon hattı tesisi — 1x25 mm²</w:t>
+              <w:t xml:space="preserve">YVV (NYY) 1 kV yeraltı kablosu ile kolon hattı tesisi — 1x25 mm² (%25 müteahhit kârı dahil)</w:t>
             </w:r>
           </w:p>
         </w:tc>
@@ -5643,7 +5643,7 @@
                 <w:sz w:val="14"/>
                 <w:szCs w:val="14"/>
               </w:rPr>
-              <w:t xml:space="preserve">LED sıva üstü etanj armatür (polikarbon gövdeli), ışık akısı en az 2700 lm — kümes genel aydınlatması</w:t>
+              <w:t xml:space="preserve">LED sıva üstü etanj armatür (polikarbon gövdeli), ışık akısı en az 2700 lm — kümes genel aydınlatması (%25 müteahhit kârı dahil)</w:t>
             </w:r>
           </w:p>
         </w:tc>
@@ -5827,7 +5827,7 @@
                 <w:sz w:val="14"/>
                 <w:szCs w:val="14"/>
               </w:rPr>
-              <w:t xml:space="preserve">LED sıva üstü etanj armatür (polikarbon gövdeli), ışık akısı en az 1800 lm — servis bölümü</w:t>
+              <w:t xml:space="preserve">LED sıva üstü etanj armatür (polikarbon gövdeli), ışık akısı en az 1800 lm — servis bölümü (%25 müteahhit kârı dahil)</w:t>
             </w:r>
           </w:p>
         </w:tc>
@@ -6011,7 +6011,7 @@
                 <w:sz w:val="14"/>
                 <w:szCs w:val="14"/>
               </w:rPr>
-              <w:t xml:space="preserve">Boş boru döşemesi — 25-32 mm PVC boru</w:t>
+              <w:t xml:space="preserve">Boş boru döşemesi — 25-32 mm PVC boru (%25 müteahhit kârı dahil)</w:t>
             </w:r>
           </w:p>
         </w:tc>
@@ -6195,7 +6195,7 @@
                 <w:sz w:val="14"/>
                 <w:szCs w:val="14"/>
               </w:rPr>
-              <w:t xml:space="preserve">Halojensiz H07Z tipi iletken 1x2,5 mm² ile tesisat</w:t>
+              <w:t xml:space="preserve">Halojensiz H07Z tipi iletken 1x2,5 mm² ile tesisat (%25 müteahhit kârı dahil)</w:t>
             </w:r>
           </w:p>
         </w:tc>
@@ -6379,7 +6379,7 @@
                 <w:sz w:val="14"/>
                 <w:szCs w:val="14"/>
               </w:rPr>
-              <w:t xml:space="preserve">Halojensiz H07Z tipi iletken 1x1,5 mm² ile kumanda tesisatı</w:t>
+              <w:t xml:space="preserve">Halojensiz H07Z tipi iletken 1x1,5 mm² ile kumanda tesisatı (%25 müteahhit kârı dahil)</w:t>
             </w:r>
           </w:p>
         </w:tc>
@@ -6563,7 +6563,7 @@
                 <w:sz w:val="14"/>
                 <w:szCs w:val="14"/>
               </w:rPr>
-              <w:t xml:space="preserve">Çıplak bakır tel 25 mm² — eşpotansiyel bara ve topraklama iletkeni</w:t>
+              <w:t xml:space="preserve">Çıplak bakır tel 25 mm² — eşpotansiyel bara ve topraklama iletkeni (%25 müteahhit kârı dahil)</w:t>
             </w:r>
           </w:p>
         </w:tc>
@@ -6747,7 +6747,7 @@
                 <w:sz w:val="14"/>
                 <w:szCs w:val="14"/>
               </w:rPr>
-              <w:t xml:space="preserve">Bina ihata iletkeni tesisatı — 30x3,5 mm galvanizli çelik lama (temel topraklaması)</w:t>
+              <w:t xml:space="preserve">Bina ihata iletkeni tesisatı — 30x3,5 mm galvanizli çelik lama (temel topraklaması) (%25 müteahhit kârı dahil)</w:t>
             </w:r>
           </w:p>
         </w:tc>
@@ -6931,7 +6931,7 @@
                 <w:sz w:val="14"/>
                 <w:szCs w:val="14"/>
               </w:rPr>
-              <w:t xml:space="preserve">Aktif yakalama ucu, ortalama uyarım yolu DL = 30-40 m</w:t>
+              <w:t xml:space="preserve">Aktif yakalama ucu, ortalama uyarım yolu DL = 30-40 m (%25 müteahhit kârı dahil)</w:t>
             </w:r>
           </w:p>
         </w:tc>
@@ -7115,7 +7115,7 @@
                 <w:sz w:val="14"/>
                 <w:szCs w:val="14"/>
               </w:rPr>
-              <w:t xml:space="preserve">Çatı ihata ve indirme iletkeni tesisatı — 50 mm² elektrolitik bakır tel</w:t>
+              <w:t xml:space="preserve">Çatı ihata ve indirme iletkeni tesisatı — 50 mm² elektrolitik bakır tel (%25 müteahhit kârı dahil)</w:t>
             </w:r>
           </w:p>
         </w:tc>
@@ -7299,7 +7299,7 @@
                 <w:sz w:val="14"/>
                 <w:szCs w:val="14"/>
               </w:rPr>
-              <w:t xml:space="preserve">Dizel elektrojen grubu (jeneratör) 63 kVA / 50 kW — dizel motoru su veya hava ile soğuyan cinsten, 1500 d/dak</w:t>
+              <w:t xml:space="preserve">Dizel elektrojen grubu (jeneratör) 63 kVA / 50 kW — dizel motoru su veya hava ile soğuyan cinsten, 1500 d/dak (%25 müteahhit kârı dahil)</w:t>
             </w:r>
           </w:p>
         </w:tc>
@@ -7483,7 +7483,7 @@
                 <w:sz w:val="14"/>
                 <w:szCs w:val="14"/>
               </w:rPr>
-              <w:t xml:space="preserve">Jeneratör ses izolasyon kabini — 63 kVA</w:t>
+              <w:t xml:space="preserve">Jeneratör ses izolasyon kabini — 63 kVA (%25 müteahhit kârı dahil)</w:t>
             </w:r>
           </w:p>
         </w:tc>

</xml_diff>

<commit_message>
Yayın: yağmur suyu iniş borusu Ø70 sert PVC
Co-Authored-By: Claude Opus 5 <noreply@anthropic.com>
Claude-Session: https://claude.ai/code/session_01HJPp6bx7wepUX5p8fxGcjg
</commit_message>
<xml_diff>
--- a/belgeler/27_KESIF_OZETI_EK_01_KUMES_A_BLOK.docx
+++ b/belgeler/27_KESIF_OZETI_EK_01_KUMES_A_BLOK.docx
@@ -2795,6 +2795,7 @@
         <w:tc>
           <w:tcPr>
             <w:tcW w:type="dxa" w:w="1928"/>
+            <w:vMerge w:val="restart"/>
             <w:tcBorders>
               <w:top w:val="single" w:color="808080" w:sz="4"/>
               <w:left w:val="single" w:color="808080" w:sz="4"/>
@@ -2993,7 +2994,191 @@
                 <w:sz w:val="14"/>
                 <w:szCs w:val="14"/>
               </w:rPr>
-              <w:t xml:space="preserve">360,16</w:t>
+              <w:t xml:space="preserve">319,20</w:t>
+            </w:r>
+          </w:p>
+        </w:tc>
+      </w:tr>
+      <w:tr>
+        <w:tc>
+          <w:tcPr>
+            <w:vMerge w:val="continue"/>
+            <w:tcBorders>
+              <w:top w:val="single" w:color="808080" w:sz="4"/>
+              <w:left w:val="single" w:color="808080" w:sz="4"/>
+              <w:bottom w:val="single" w:color="808080" w:sz="4"/>
+              <w:right w:val="single" w:color="808080" w:sz="4"/>
+            </w:tcBorders>
+          </w:tcPr>
+          <w:p/>
+        </w:tc>
+        <w:tc>
+          <w:tcPr>
+            <w:tcW w:type="dxa" w:w="454"/>
+            <w:tcBorders>
+              <w:top w:val="single" w:color="808080" w:sz="4"/>
+              <w:left w:val="single" w:color="808080" w:sz="4"/>
+              <w:bottom w:val="single" w:color="808080" w:sz="4"/>
+              <w:right w:val="single" w:color="808080" w:sz="4"/>
+            </w:tcBorders>
+            <w:tcMar>
+              <w:top w:type="dxa" w:w="40"/>
+              <w:left w:type="dxa" w:w="60"/>
+              <w:bottom w:type="dxa" w:w="40"/>
+              <w:right w:type="dxa" w:w="60"/>
+            </w:tcMar>
+            <w:vAlign w:val="top"/>
+          </w:tcPr>
+          <w:p>
+            <w:pPr>
+              <w:spacing w:after="0" w:before="0"/>
+              <w:jc w:val="center"/>
+            </w:pPr>
+            <w:r>
+              <w:rPr>
+                <w:rFonts w:ascii="Calibri" w:cs="Calibri" w:eastAsia="Calibri" w:hAnsi="Calibri"/>
+                <w:b w:val="false"/>
+                <w:bCs w:val="false"/>
+                <w:sz w:val="14"/>
+                <w:szCs w:val="14"/>
+              </w:rPr>
+              <w:t xml:space="preserve">2</w:t>
+            </w:r>
+          </w:p>
+        </w:tc>
+        <w:tc>
+          <w:tcPr>
+            <w:tcW w:type="dxa" w:w="1134"/>
+            <w:tcBorders>
+              <w:top w:val="single" w:color="808080" w:sz="4"/>
+              <w:left w:val="single" w:color="808080" w:sz="4"/>
+              <w:bottom w:val="single" w:color="808080" w:sz="4"/>
+              <w:right w:val="single" w:color="808080" w:sz="4"/>
+            </w:tcBorders>
+            <w:tcMar>
+              <w:top w:type="dxa" w:w="40"/>
+              <w:left w:type="dxa" w:w="60"/>
+              <w:bottom w:type="dxa" w:w="40"/>
+              <w:right w:type="dxa" w:w="60"/>
+            </w:tcMar>
+            <w:vAlign w:val="top"/>
+          </w:tcPr>
+          <w:p>
+            <w:pPr>
+              <w:spacing w:after="0" w:before="0"/>
+              <w:jc w:val="center"/>
+            </w:pPr>
+            <w:r>
+              <w:rPr>
+                <w:rFonts w:ascii="Calibri" w:cs="Calibri" w:eastAsia="Calibri" w:hAnsi="Calibri"/>
+                <w:b w:val="false"/>
+                <w:bCs w:val="false"/>
+                <w:sz w:val="14"/>
+                <w:szCs w:val="14"/>
+              </w:rPr>
+              <w:t xml:space="preserve">15.315.1001</w:t>
+            </w:r>
+          </w:p>
+        </w:tc>
+        <w:tc>
+          <w:tcPr>
+            <w:tcW w:type="dxa" w:w="5102"/>
+            <w:tcBorders>
+              <w:top w:val="single" w:color="808080" w:sz="4"/>
+              <w:left w:val="single" w:color="808080" w:sz="4"/>
+              <w:bottom w:val="single" w:color="808080" w:sz="4"/>
+              <w:right w:val="single" w:color="808080" w:sz="4"/>
+            </w:tcBorders>
+            <w:tcMar>
+              <w:top w:type="dxa" w:w="40"/>
+              <w:left w:type="dxa" w:w="60"/>
+              <w:bottom w:type="dxa" w:w="40"/>
+              <w:right w:type="dxa" w:w="60"/>
+            </w:tcMar>
+            <w:vAlign w:val="top"/>
+          </w:tcPr>
+          <w:p>
+            <w:pPr>
+              <w:spacing w:after="0" w:before="0"/>
+              <w:jc w:val="left"/>
+            </w:pPr>
+            <w:r>
+              <w:rPr>
+                <w:rFonts w:ascii="Calibri" w:cs="Calibri" w:eastAsia="Calibri" w:hAnsi="Calibri"/>
+                <w:b w:val="false"/>
+                <w:bCs w:val="false"/>
+                <w:sz w:val="14"/>
+                <w:szCs w:val="14"/>
+              </w:rPr>
+              <w:t xml:space="preserve">Ø 70 mm çapında bir ucu muflu sert PVC yağmur borusu temini ve yerine tesbiti</w:t>
+            </w:r>
+          </w:p>
+        </w:tc>
+        <w:tc>
+          <w:tcPr>
+            <w:tcW w:type="dxa" w:w="680"/>
+            <w:tcBorders>
+              <w:top w:val="single" w:color="808080" w:sz="4"/>
+              <w:left w:val="single" w:color="808080" w:sz="4"/>
+              <w:bottom w:val="single" w:color="808080" w:sz="4"/>
+              <w:right w:val="single" w:color="808080" w:sz="4"/>
+            </w:tcBorders>
+            <w:tcMar>
+              <w:top w:type="dxa" w:w="40"/>
+              <w:left w:type="dxa" w:w="60"/>
+              <w:bottom w:type="dxa" w:w="40"/>
+              <w:right w:type="dxa" w:w="60"/>
+            </w:tcMar>
+            <w:vAlign w:val="top"/>
+          </w:tcPr>
+          <w:p>
+            <w:pPr>
+              <w:spacing w:after="0" w:before="0"/>
+              <w:jc w:val="center"/>
+            </w:pPr>
+            <w:r>
+              <w:rPr>
+                <w:rFonts w:ascii="Calibri" w:cs="Calibri" w:eastAsia="Calibri" w:hAnsi="Calibri"/>
+                <w:b w:val="false"/>
+                <w:bCs w:val="false"/>
+                <w:sz w:val="14"/>
+                <w:szCs w:val="14"/>
+              </w:rPr>
+              <w:t xml:space="preserve">m</w:t>
+            </w:r>
+          </w:p>
+        </w:tc>
+        <w:tc>
+          <w:tcPr>
+            <w:tcW w:type="dxa" w:w="1134"/>
+            <w:tcBorders>
+              <w:top w:val="single" w:color="808080" w:sz="4"/>
+              <w:left w:val="single" w:color="808080" w:sz="4"/>
+              <w:bottom w:val="single" w:color="808080" w:sz="4"/>
+              <w:right w:val="single" w:color="808080" w:sz="4"/>
+            </w:tcBorders>
+            <w:tcMar>
+              <w:top w:type="dxa" w:w="40"/>
+              <w:left w:type="dxa" w:w="60"/>
+              <w:bottom w:type="dxa" w:w="40"/>
+              <w:right w:type="dxa" w:w="60"/>
+            </w:tcMar>
+            <w:vAlign w:val="top"/>
+          </w:tcPr>
+          <w:p>
+            <w:pPr>
+              <w:spacing w:after="0" w:before="0"/>
+              <w:jc w:val="right"/>
+            </w:pPr>
+            <w:r>
+              <w:rPr>
+                <w:rFonts w:ascii="Calibri" w:cs="Calibri" w:eastAsia="Calibri" w:hAnsi="Calibri"/>
+                <w:b w:val="false"/>
+                <w:bCs w:val="false"/>
+                <w:sz w:val="14"/>
+                <w:szCs w:val="14"/>
+              </w:rPr>
+              <w:t xml:space="preserve">51,20</w:t>
             </w:r>
           </w:p>
         </w:tc>

</xml_diff>

<commit_message>
Yayın: keşif özetlerinde miktar üç ondalık hane
Co-Authored-By: Claude Opus 5 <noreply@anthropic.com>
Claude-Session: https://claude.ai/code/session_01HJPp6bx7wepUX5p8fxGcjg
</commit_message>
<xml_diff>
--- a/belgeler/27_KESIF_OZETI_EK_01_KUMES_A_BLOK.docx
+++ b/belgeler/27_KESIF_OZETI_EK_01_KUMES_A_BLOK.docx
@@ -621,7 +621,7 @@
                 <w:sz w:val="14"/>
                 <w:szCs w:val="14"/>
               </w:rPr>
-              <w:t xml:space="preserve">1.684,39</w:t>
+              <w:t xml:space="preserve">1.684,390</w:t>
             </w:r>
           </w:p>
         </w:tc>
@@ -828,7 +828,7 @@
                 <w:sz w:val="14"/>
                 <w:szCs w:val="14"/>
               </w:rPr>
-              <w:t xml:space="preserve">31,43</w:t>
+              <w:t xml:space="preserve">31,428</w:t>
             </w:r>
           </w:p>
         </w:tc>
@@ -1035,7 +1035,7 @@
                 <w:sz w:val="14"/>
                 <w:szCs w:val="14"/>
               </w:rPr>
-              <w:t xml:space="preserve">278,34</w:t>
+              <w:t xml:space="preserve">278,340</w:t>
             </w:r>
           </w:p>
         </w:tc>
@@ -1242,7 +1242,7 @@
                 <w:sz w:val="14"/>
                 <w:szCs w:val="14"/>
               </w:rPr>
-              <w:t xml:space="preserve">551,26</w:t>
+              <w:t xml:space="preserve">551,260</w:t>
             </w:r>
           </w:p>
         </w:tc>
@@ -1450,7 +1450,7 @@
                 <w:sz w:val="14"/>
                 <w:szCs w:val="14"/>
               </w:rPr>
-              <w:t xml:space="preserve">4,16</w:t>
+              <w:t xml:space="preserve">4,160</w:t>
             </w:r>
           </w:p>
         </w:tc>
@@ -1634,7 +1634,7 @@
                 <w:sz w:val="14"/>
                 <w:szCs w:val="14"/>
               </w:rPr>
-              <w:t xml:space="preserve">7,29</w:t>
+              <w:t xml:space="preserve">7,287</w:t>
             </w:r>
           </w:p>
         </w:tc>
@@ -1818,7 +1818,7 @@
                 <w:sz w:val="14"/>
                 <w:szCs w:val="14"/>
               </w:rPr>
-              <w:t xml:space="preserve">3,64</w:t>
+              <w:t xml:space="preserve">3,637</w:t>
             </w:r>
           </w:p>
         </w:tc>
@@ -2026,7 +2026,7 @@
                 <w:sz w:val="14"/>
                 <w:szCs w:val="14"/>
               </w:rPr>
-              <w:t xml:space="preserve">44,05</w:t>
+              <w:t xml:space="preserve">44,048</w:t>
             </w:r>
           </w:p>
         </w:tc>
@@ -2210,7 +2210,7 @@
                 <w:sz w:val="14"/>
                 <w:szCs w:val="14"/>
               </w:rPr>
-              <w:t xml:space="preserve">674,00</w:t>
+              <w:t xml:space="preserve">674,000</w:t>
             </w:r>
           </w:p>
         </w:tc>
@@ -2418,7 +2418,7 @@
                 <w:sz w:val="14"/>
                 <w:szCs w:val="14"/>
               </w:rPr>
-              <w:t xml:space="preserve">507,91</w:t>
+              <w:t xml:space="preserve">507,910</w:t>
             </w:r>
           </w:p>
         </w:tc>
@@ -2602,7 +2602,7 @@
                 <w:sz w:val="14"/>
                 <w:szCs w:val="14"/>
               </w:rPr>
-              <w:t xml:space="preserve">49,85</w:t>
+              <w:t xml:space="preserve">49,850</w:t>
             </w:r>
           </w:p>
         </w:tc>
@@ -2786,7 +2786,7 @@
                 <w:sz w:val="14"/>
                 <w:szCs w:val="14"/>
               </w:rPr>
-              <w:t xml:space="preserve">45,00</w:t>
+              <w:t xml:space="preserve">45,000</w:t>
             </w:r>
           </w:p>
         </w:tc>
@@ -2994,7 +2994,7 @@
                 <w:sz w:val="14"/>
                 <w:szCs w:val="14"/>
               </w:rPr>
-              <w:t xml:space="preserve">319,20</w:t>
+              <w:t xml:space="preserve">319,200</w:t>
             </w:r>
           </w:p>
         </w:tc>
@@ -3178,7 +3178,7 @@
                 <w:sz w:val="14"/>
                 <w:szCs w:val="14"/>
               </w:rPr>
-              <w:t xml:space="preserve">51,20</w:t>
+              <w:t xml:space="preserve">51,200</w:t>
             </w:r>
           </w:p>
         </w:tc>
@@ -3386,7 +3386,7 @@
                 <w:sz w:val="14"/>
                 <w:szCs w:val="14"/>
               </w:rPr>
-              <w:t xml:space="preserve">13,40</w:t>
+              <w:t xml:space="preserve">13,400</w:t>
             </w:r>
           </w:p>
         </w:tc>
@@ -3570,7 +3570,7 @@
                 <w:sz w:val="14"/>
                 <w:szCs w:val="14"/>
               </w:rPr>
-              <w:t xml:space="preserve">5,67</w:t>
+              <w:t xml:space="preserve">5,670</w:t>
             </w:r>
           </w:p>
         </w:tc>
@@ -3754,7 +3754,7 @@
                 <w:sz w:val="14"/>
                 <w:szCs w:val="14"/>
               </w:rPr>
-              <w:t xml:space="preserve">54,31</w:t>
+              <w:t xml:space="preserve">54,315</w:t>
             </w:r>
           </w:p>
         </w:tc>
@@ -3962,7 +3962,7 @@
                 <w:sz w:val="14"/>
                 <w:szCs w:val="14"/>
               </w:rPr>
-              <w:t xml:space="preserve">557,76</w:t>
+              <w:t xml:space="preserve">557,760</w:t>
             </w:r>
           </w:p>
         </w:tc>
@@ -4146,7 +4146,7 @@
                 <w:sz w:val="14"/>
                 <w:szCs w:val="14"/>
               </w:rPr>
-              <w:t xml:space="preserve">647,76</w:t>
+              <w:t xml:space="preserve">647,760</w:t>
             </w:r>
           </w:p>
         </w:tc>
@@ -4354,7 +4354,7 @@
                 <w:sz w:val="14"/>
                 <w:szCs w:val="14"/>
               </w:rPr>
-              <w:t xml:space="preserve">557,76</w:t>
+              <w:t xml:space="preserve">557,760</w:t>
             </w:r>
           </w:p>
         </w:tc>
@@ -4538,7 +4538,7 @@
                 <w:sz w:val="14"/>
                 <w:szCs w:val="14"/>
               </w:rPr>
-              <w:t xml:space="preserve">612,76</w:t>
+              <w:t xml:space="preserve">612,760</w:t>
             </w:r>
           </w:p>
         </w:tc>
@@ -4745,7 +4745,7 @@
                 <w:sz w:val="14"/>
                 <w:szCs w:val="14"/>
               </w:rPr>
-              <w:t xml:space="preserve">60,00</w:t>
+              <w:t xml:space="preserve">60,000</w:t>
             </w:r>
           </w:p>
         </w:tc>
@@ -4952,7 +4952,7 @@
                 <w:sz w:val="14"/>
                 <w:szCs w:val="14"/>
               </w:rPr>
-              <w:t xml:space="preserve">25,00</w:t>
+              <w:t xml:space="preserve">25,000</w:t>
             </w:r>
           </w:p>
         </w:tc>
@@ -5160,7 +5160,7 @@
                 <w:sz w:val="14"/>
                 <w:szCs w:val="14"/>
               </w:rPr>
-              <w:t xml:space="preserve">1,00</w:t>
+              <w:t xml:space="preserve">1,000</w:t>
             </w:r>
           </w:p>
         </w:tc>
@@ -5344,7 +5344,7 @@
                 <w:sz w:val="14"/>
                 <w:szCs w:val="14"/>
               </w:rPr>
-              <w:t xml:space="preserve">1,00</w:t>
+              <w:t xml:space="preserve">1,000</w:t>
             </w:r>
           </w:p>
         </w:tc>
@@ -5528,7 +5528,7 @@
                 <w:sz w:val="14"/>
                 <w:szCs w:val="14"/>
               </w:rPr>
-              <w:t xml:space="preserve">2,00</w:t>
+              <w:t xml:space="preserve">2,000</w:t>
             </w:r>
           </w:p>
         </w:tc>
@@ -5712,7 +5712,7 @@
                 <w:sz w:val="14"/>
                 <w:szCs w:val="14"/>
               </w:rPr>
-              <w:t xml:space="preserve">300,00</w:t>
+              <w:t xml:space="preserve">300,000</w:t>
             </w:r>
           </w:p>
         </w:tc>
@@ -5896,7 +5896,7 @@
                 <w:sz w:val="14"/>
                 <w:szCs w:val="14"/>
               </w:rPr>
-              <w:t xml:space="preserve">30,00</w:t>
+              <w:t xml:space="preserve">30,000</w:t>
             </w:r>
           </w:p>
         </w:tc>
@@ -6080,7 +6080,7 @@
                 <w:sz w:val="14"/>
                 <w:szCs w:val="14"/>
               </w:rPr>
-              <w:t xml:space="preserve">2,00</w:t>
+              <w:t xml:space="preserve">2,000</w:t>
             </w:r>
           </w:p>
         </w:tc>
@@ -6264,7 +6264,7 @@
                 <w:sz w:val="14"/>
                 <w:szCs w:val="14"/>
               </w:rPr>
-              <w:t xml:space="preserve">500,00</w:t>
+              <w:t xml:space="preserve">500,000</w:t>
             </w:r>
           </w:p>
         </w:tc>
@@ -6448,7 +6448,7 @@
                 <w:sz w:val="14"/>
                 <w:szCs w:val="14"/>
               </w:rPr>
-              <w:t xml:space="preserve">2.000,00</w:t>
+              <w:t xml:space="preserve">2.000,000</w:t>
             </w:r>
           </w:p>
         </w:tc>
@@ -6632,7 +6632,7 @@
                 <w:sz w:val="14"/>
                 <w:szCs w:val="14"/>
               </w:rPr>
-              <w:t xml:space="preserve">600,00</w:t>
+              <w:t xml:space="preserve">600,000</w:t>
             </w:r>
           </w:p>
         </w:tc>
@@ -6816,7 +6816,7 @@
                 <w:sz w:val="14"/>
                 <w:szCs w:val="14"/>
               </w:rPr>
-              <w:t xml:space="preserve">100,00</w:t>
+              <w:t xml:space="preserve">100,000</w:t>
             </w:r>
           </w:p>
         </w:tc>
@@ -7000,7 +7000,7 @@
                 <w:sz w:val="14"/>
                 <w:szCs w:val="14"/>
               </w:rPr>
-              <w:t xml:space="preserve">186,00</w:t>
+              <w:t xml:space="preserve">186,000</w:t>
             </w:r>
           </w:p>
         </w:tc>
@@ -7184,7 +7184,7 @@
                 <w:sz w:val="14"/>
                 <w:szCs w:val="14"/>
               </w:rPr>
-              <w:t xml:space="preserve">1,00</w:t>
+              <w:t xml:space="preserve">1,000</w:t>
             </w:r>
           </w:p>
         </w:tc>
@@ -7368,7 +7368,7 @@
                 <w:sz w:val="14"/>
                 <w:szCs w:val="14"/>
               </w:rPr>
-              <w:t xml:space="preserve">16,00</w:t>
+              <w:t xml:space="preserve">16,000</w:t>
             </w:r>
           </w:p>
         </w:tc>
@@ -7552,7 +7552,7 @@
                 <w:sz w:val="14"/>
                 <w:szCs w:val="14"/>
               </w:rPr>
-              <w:t xml:space="preserve">1,00</w:t>
+              <w:t xml:space="preserve">1,000</w:t>
             </w:r>
           </w:p>
         </w:tc>
@@ -7736,7 +7736,7 @@
                 <w:sz w:val="14"/>
                 <w:szCs w:val="14"/>
               </w:rPr>
-              <w:t xml:space="preserve">1,00</w:t>
+              <w:t xml:space="preserve">1,000</w:t>
             </w:r>
           </w:p>
         </w:tc>

</xml_diff>

<commit_message>
Yayın: jeneratör tesisatı hibe dışına alındı
Jeneratör grubu, ses izolasyon kabini ve otomatik transfer şalteri
MARFEN proformasına (36) girdi. Uygun harcama 290.859'dan 270.123
Avro'ya indi; kriter 1 kademesi ve 5 puan aynı, eşiğe kalan pay
29.877 Avro.

Co-Authored-By: Claude Opus 5 <noreply@anthropic.com>
Claude-Session: https://claude.ai/code/session_01HJPp6bx7wepUX5p8fxGcjg
</commit_message>
<xml_diff>
--- a/belgeler/27_KESIF_OZETI_EK_01_KUMES_A_BLOK.docx
+++ b/belgeler/27_KESIF_OZETI_EK_01_KUMES_A_BLOK.docx
@@ -7369,374 +7369,6 @@
                 <w:szCs w:val="14"/>
               </w:rPr>
               <w:t xml:space="preserve">16,000</w:t>
-            </w:r>
-          </w:p>
-        </w:tc>
-      </w:tr>
-      <w:tr>
-        <w:tc>
-          <w:tcPr>
-            <w:vMerge w:val="continue"/>
-            <w:tcBorders>
-              <w:top w:val="single" w:color="808080" w:sz="4"/>
-              <w:left w:val="single" w:color="808080" w:sz="4"/>
-              <w:bottom w:val="single" w:color="808080" w:sz="4"/>
-              <w:right w:val="single" w:color="808080" w:sz="4"/>
-            </w:tcBorders>
-          </w:tcPr>
-          <w:p/>
-        </w:tc>
-        <w:tc>
-          <w:tcPr>
-            <w:tcW w:type="dxa" w:w="454"/>
-            <w:tcBorders>
-              <w:top w:val="single" w:color="808080" w:sz="4"/>
-              <w:left w:val="single" w:color="808080" w:sz="4"/>
-              <w:bottom w:val="single" w:color="808080" w:sz="4"/>
-              <w:right w:val="single" w:color="808080" w:sz="4"/>
-            </w:tcBorders>
-            <w:tcMar>
-              <w:top w:type="dxa" w:w="40"/>
-              <w:left w:type="dxa" w:w="60"/>
-              <w:bottom w:type="dxa" w:w="40"/>
-              <w:right w:type="dxa" w:w="60"/>
-            </w:tcMar>
-            <w:vAlign w:val="top"/>
-          </w:tcPr>
-          <w:p>
-            <w:pPr>
-              <w:spacing w:after="0" w:before="0"/>
-              <w:jc w:val="center"/>
-            </w:pPr>
-            <w:r>
-              <w:rPr>
-                <w:rFonts w:ascii="Calibri" w:cs="Calibri" w:eastAsia="Calibri" w:hAnsi="Calibri"/>
-                <w:b w:val="false"/>
-                <w:bCs w:val="false"/>
-                <w:sz w:val="14"/>
-                <w:szCs w:val="14"/>
-              </w:rPr>
-              <w:t xml:space="preserve">14</w:t>
-            </w:r>
-          </w:p>
-        </w:tc>
-        <w:tc>
-          <w:tcPr>
-            <w:tcW w:type="dxa" w:w="1134"/>
-            <w:tcBorders>
-              <w:top w:val="single" w:color="808080" w:sz="4"/>
-              <w:left w:val="single" w:color="808080" w:sz="4"/>
-              <w:bottom w:val="single" w:color="808080" w:sz="4"/>
-              <w:right w:val="single" w:color="808080" w:sz="4"/>
-            </w:tcBorders>
-            <w:tcMar>
-              <w:top w:type="dxa" w:w="40"/>
-              <w:left w:type="dxa" w:w="60"/>
-              <w:bottom w:type="dxa" w:w="40"/>
-              <w:right w:type="dxa" w:w="60"/>
-            </w:tcMar>
-            <w:vAlign w:val="top"/>
-          </w:tcPr>
-          <w:p>
-            <w:pPr>
-              <w:spacing w:after="0" w:before="0"/>
-              <w:jc w:val="center"/>
-            </w:pPr>
-            <w:r>
-              <w:rPr>
-                <w:rFonts w:ascii="Calibri" w:cs="Calibri" w:eastAsia="Calibri" w:hAnsi="Calibri"/>
-                <w:b w:val="false"/>
-                <w:bCs w:val="false"/>
-                <w:sz w:val="14"/>
-                <w:szCs w:val="14"/>
-              </w:rPr>
-              <w:t xml:space="preserve">30.740.1106</w:t>
-            </w:r>
-          </w:p>
-        </w:tc>
-        <w:tc>
-          <w:tcPr>
-            <w:tcW w:type="dxa" w:w="5102"/>
-            <w:tcBorders>
-              <w:top w:val="single" w:color="808080" w:sz="4"/>
-              <w:left w:val="single" w:color="808080" w:sz="4"/>
-              <w:bottom w:val="single" w:color="808080" w:sz="4"/>
-              <w:right w:val="single" w:color="808080" w:sz="4"/>
-            </w:tcBorders>
-            <w:tcMar>
-              <w:top w:type="dxa" w:w="40"/>
-              <w:left w:type="dxa" w:w="60"/>
-              <w:bottom w:type="dxa" w:w="40"/>
-              <w:right w:type="dxa" w:w="60"/>
-            </w:tcMar>
-            <w:vAlign w:val="top"/>
-          </w:tcPr>
-          <w:p>
-            <w:pPr>
-              <w:spacing w:after="0" w:before="0"/>
-              <w:jc w:val="left"/>
-            </w:pPr>
-            <w:r>
-              <w:rPr>
-                <w:rFonts w:ascii="Calibri" w:cs="Calibri" w:eastAsia="Calibri" w:hAnsi="Calibri"/>
-                <w:b w:val="false"/>
-                <w:bCs w:val="false"/>
-                <w:sz w:val="14"/>
-                <w:szCs w:val="14"/>
-              </w:rPr>
-              <w:t xml:space="preserve">Dizel elektrojen grubu (jeneratör) 63 kVA / 50 kW — dizel motoru su veya hava ile soğuyan cinsten, 1500 d/dak (%25 müteahhit kârı dahil)</w:t>
-            </w:r>
-          </w:p>
-        </w:tc>
-        <w:tc>
-          <w:tcPr>
-            <w:tcW w:type="dxa" w:w="680"/>
-            <w:tcBorders>
-              <w:top w:val="single" w:color="808080" w:sz="4"/>
-              <w:left w:val="single" w:color="808080" w:sz="4"/>
-              <w:bottom w:val="single" w:color="808080" w:sz="4"/>
-              <w:right w:val="single" w:color="808080" w:sz="4"/>
-            </w:tcBorders>
-            <w:tcMar>
-              <w:top w:type="dxa" w:w="40"/>
-              <w:left w:type="dxa" w:w="60"/>
-              <w:bottom w:type="dxa" w:w="40"/>
-              <w:right w:type="dxa" w:w="60"/>
-            </w:tcMar>
-            <w:vAlign w:val="top"/>
-          </w:tcPr>
-          <w:p>
-            <w:pPr>
-              <w:spacing w:after="0" w:before="0"/>
-              <w:jc w:val="center"/>
-            </w:pPr>
-            <w:r>
-              <w:rPr>
-                <w:rFonts w:ascii="Calibri" w:cs="Calibri" w:eastAsia="Calibri" w:hAnsi="Calibri"/>
-                <w:b w:val="false"/>
-                <w:bCs w:val="false"/>
-                <w:sz w:val="14"/>
-                <w:szCs w:val="14"/>
-              </w:rPr>
-              <w:t xml:space="preserve">ad</w:t>
-            </w:r>
-          </w:p>
-        </w:tc>
-        <w:tc>
-          <w:tcPr>
-            <w:tcW w:type="dxa" w:w="1134"/>
-            <w:tcBorders>
-              <w:top w:val="single" w:color="808080" w:sz="4"/>
-              <w:left w:val="single" w:color="808080" w:sz="4"/>
-              <w:bottom w:val="single" w:color="808080" w:sz="4"/>
-              <w:right w:val="single" w:color="808080" w:sz="4"/>
-            </w:tcBorders>
-            <w:tcMar>
-              <w:top w:type="dxa" w:w="40"/>
-              <w:left w:type="dxa" w:w="60"/>
-              <w:bottom w:type="dxa" w:w="40"/>
-              <w:right w:type="dxa" w:w="60"/>
-            </w:tcMar>
-            <w:vAlign w:val="top"/>
-          </w:tcPr>
-          <w:p>
-            <w:pPr>
-              <w:spacing w:after="0" w:before="0"/>
-              <w:jc w:val="right"/>
-            </w:pPr>
-            <w:r>
-              <w:rPr>
-                <w:rFonts w:ascii="Calibri" w:cs="Calibri" w:eastAsia="Calibri" w:hAnsi="Calibri"/>
-                <w:b w:val="false"/>
-                <w:bCs w:val="false"/>
-                <w:sz w:val="14"/>
-                <w:szCs w:val="14"/>
-              </w:rPr>
-              <w:t xml:space="preserve">1,000</w:t>
-            </w:r>
-          </w:p>
-        </w:tc>
-      </w:tr>
-      <w:tr>
-        <w:tc>
-          <w:tcPr>
-            <w:vMerge w:val="continue"/>
-            <w:tcBorders>
-              <w:top w:val="single" w:color="808080" w:sz="4"/>
-              <w:left w:val="single" w:color="808080" w:sz="4"/>
-              <w:bottom w:val="single" w:color="808080" w:sz="4"/>
-              <w:right w:val="single" w:color="808080" w:sz="4"/>
-            </w:tcBorders>
-          </w:tcPr>
-          <w:p/>
-        </w:tc>
-        <w:tc>
-          <w:tcPr>
-            <w:tcW w:type="dxa" w:w="454"/>
-            <w:tcBorders>
-              <w:top w:val="single" w:color="808080" w:sz="4"/>
-              <w:left w:val="single" w:color="808080" w:sz="4"/>
-              <w:bottom w:val="single" w:color="808080" w:sz="4"/>
-              <w:right w:val="single" w:color="808080" w:sz="4"/>
-            </w:tcBorders>
-            <w:tcMar>
-              <w:top w:type="dxa" w:w="40"/>
-              <w:left w:type="dxa" w:w="60"/>
-              <w:bottom w:type="dxa" w:w="40"/>
-              <w:right w:type="dxa" w:w="60"/>
-            </w:tcMar>
-            <w:vAlign w:val="top"/>
-          </w:tcPr>
-          <w:p>
-            <w:pPr>
-              <w:spacing w:after="0" w:before="0"/>
-              <w:jc w:val="center"/>
-            </w:pPr>
-            <w:r>
-              <w:rPr>
-                <w:rFonts w:ascii="Calibri" w:cs="Calibri" w:eastAsia="Calibri" w:hAnsi="Calibri"/>
-                <w:b w:val="false"/>
-                <w:bCs w:val="false"/>
-                <w:sz w:val="14"/>
-                <w:szCs w:val="14"/>
-              </w:rPr>
-              <w:t xml:space="preserve">15</w:t>
-            </w:r>
-          </w:p>
-        </w:tc>
-        <w:tc>
-          <w:tcPr>
-            <w:tcW w:type="dxa" w:w="1134"/>
-            <w:tcBorders>
-              <w:top w:val="single" w:color="808080" w:sz="4"/>
-              <w:left w:val="single" w:color="808080" w:sz="4"/>
-              <w:bottom w:val="single" w:color="808080" w:sz="4"/>
-              <w:right w:val="single" w:color="808080" w:sz="4"/>
-            </w:tcBorders>
-            <w:tcMar>
-              <w:top w:type="dxa" w:w="40"/>
-              <w:left w:type="dxa" w:w="60"/>
-              <w:bottom w:type="dxa" w:w="40"/>
-              <w:right w:type="dxa" w:w="60"/>
-            </w:tcMar>
-            <w:vAlign w:val="top"/>
-          </w:tcPr>
-          <w:p>
-            <w:pPr>
-              <w:spacing w:after="0" w:before="0"/>
-              <w:jc w:val="center"/>
-            </w:pPr>
-            <w:r>
-              <w:rPr>
-                <w:rFonts w:ascii="Calibri" w:cs="Calibri" w:eastAsia="Calibri" w:hAnsi="Calibri"/>
-                <w:b w:val="false"/>
-                <w:bCs w:val="false"/>
-                <w:sz w:val="14"/>
-                <w:szCs w:val="14"/>
-              </w:rPr>
-              <w:t xml:space="preserve">30.740.5406</w:t>
-            </w:r>
-          </w:p>
-        </w:tc>
-        <w:tc>
-          <w:tcPr>
-            <w:tcW w:type="dxa" w:w="5102"/>
-            <w:tcBorders>
-              <w:top w:val="single" w:color="808080" w:sz="4"/>
-              <w:left w:val="single" w:color="808080" w:sz="4"/>
-              <w:bottom w:val="single" w:color="808080" w:sz="4"/>
-              <w:right w:val="single" w:color="808080" w:sz="4"/>
-            </w:tcBorders>
-            <w:tcMar>
-              <w:top w:type="dxa" w:w="40"/>
-              <w:left w:type="dxa" w:w="60"/>
-              <w:bottom w:type="dxa" w:w="40"/>
-              <w:right w:type="dxa" w:w="60"/>
-            </w:tcMar>
-            <w:vAlign w:val="top"/>
-          </w:tcPr>
-          <w:p>
-            <w:pPr>
-              <w:spacing w:after="0" w:before="0"/>
-              <w:jc w:val="left"/>
-            </w:pPr>
-            <w:r>
-              <w:rPr>
-                <w:rFonts w:ascii="Calibri" w:cs="Calibri" w:eastAsia="Calibri" w:hAnsi="Calibri"/>
-                <w:b w:val="false"/>
-                <w:bCs w:val="false"/>
-                <w:sz w:val="14"/>
-                <w:szCs w:val="14"/>
-              </w:rPr>
-              <w:t xml:space="preserve">Jeneratör ses izolasyon kabini — 63 kVA (%25 müteahhit kârı dahil)</w:t>
-            </w:r>
-          </w:p>
-        </w:tc>
-        <w:tc>
-          <w:tcPr>
-            <w:tcW w:type="dxa" w:w="680"/>
-            <w:tcBorders>
-              <w:top w:val="single" w:color="808080" w:sz="4"/>
-              <w:left w:val="single" w:color="808080" w:sz="4"/>
-              <w:bottom w:val="single" w:color="808080" w:sz="4"/>
-              <w:right w:val="single" w:color="808080" w:sz="4"/>
-            </w:tcBorders>
-            <w:tcMar>
-              <w:top w:type="dxa" w:w="40"/>
-              <w:left w:type="dxa" w:w="60"/>
-              <w:bottom w:type="dxa" w:w="40"/>
-              <w:right w:type="dxa" w:w="60"/>
-            </w:tcMar>
-            <w:vAlign w:val="top"/>
-          </w:tcPr>
-          <w:p>
-            <w:pPr>
-              <w:spacing w:after="0" w:before="0"/>
-              <w:jc w:val="center"/>
-            </w:pPr>
-            <w:r>
-              <w:rPr>
-                <w:rFonts w:ascii="Calibri" w:cs="Calibri" w:eastAsia="Calibri" w:hAnsi="Calibri"/>
-                <w:b w:val="false"/>
-                <w:bCs w:val="false"/>
-                <w:sz w:val="14"/>
-                <w:szCs w:val="14"/>
-              </w:rPr>
-              <w:t xml:space="preserve">ad</w:t>
-            </w:r>
-          </w:p>
-        </w:tc>
-        <w:tc>
-          <w:tcPr>
-            <w:tcW w:type="dxa" w:w="1134"/>
-            <w:tcBorders>
-              <w:top w:val="single" w:color="808080" w:sz="4"/>
-              <w:left w:val="single" w:color="808080" w:sz="4"/>
-              <w:bottom w:val="single" w:color="808080" w:sz="4"/>
-              <w:right w:val="single" w:color="808080" w:sz="4"/>
-            </w:tcBorders>
-            <w:tcMar>
-              <w:top w:type="dxa" w:w="40"/>
-              <w:left w:type="dxa" w:w="60"/>
-              <w:bottom w:type="dxa" w:w="40"/>
-              <w:right w:type="dxa" w:w="60"/>
-            </w:tcMar>
-            <w:vAlign w:val="top"/>
-          </w:tcPr>
-          <w:p>
-            <w:pPr>
-              <w:spacing w:after="0" w:before="0"/>
-              <w:jc w:val="right"/>
-            </w:pPr>
-            <w:r>
-              <w:rPr>
-                <w:rFonts w:ascii="Calibri" w:cs="Calibri" w:eastAsia="Calibri" w:hAnsi="Calibri"/>
-                <w:b w:val="false"/>
-                <w:bCs w:val="false"/>
-                <w:sz w:val="14"/>
-                <w:szCs w:val="14"/>
-              </w:rPr>
-              <w:t xml:space="preserve">1,000</w:t>
             </w:r>
           </w:p>
         </w:tc>

</xml_diff>

<commit_message>
Yayın: jeneratör grubu ve kabini hibe kapsamına geri alındı
Uygun harcama 270.122 -> 290.858 Avro; 300.000 kademesi altında, 5 puan
duruyor. Transfer şalteri hibe dışında kalmaya devam ediyor.

Co-Authored-By: Claude Opus 5 <noreply@anthropic.com>
Claude-Session: https://claude.ai/code/session_01HJPp6bx7wepUX5p8fxGcjg
</commit_message>
<xml_diff>
--- a/belgeler/27_KESIF_OZETI_EK_01_KUMES_A_BLOK.docx
+++ b/belgeler/27_KESIF_OZETI_EK_01_KUMES_A_BLOK.docx
@@ -7369,6 +7369,374 @@
                 <w:szCs w:val="14"/>
               </w:rPr>
               <w:t xml:space="preserve">16,000</w:t>
+            </w:r>
+          </w:p>
+        </w:tc>
+      </w:tr>
+      <w:tr>
+        <w:tc>
+          <w:tcPr>
+            <w:vMerge w:val="continue"/>
+            <w:tcBorders>
+              <w:top w:val="single" w:color="808080" w:sz="4"/>
+              <w:left w:val="single" w:color="808080" w:sz="4"/>
+              <w:bottom w:val="single" w:color="808080" w:sz="4"/>
+              <w:right w:val="single" w:color="808080" w:sz="4"/>
+            </w:tcBorders>
+          </w:tcPr>
+          <w:p/>
+        </w:tc>
+        <w:tc>
+          <w:tcPr>
+            <w:tcW w:type="dxa" w:w="454"/>
+            <w:tcBorders>
+              <w:top w:val="single" w:color="808080" w:sz="4"/>
+              <w:left w:val="single" w:color="808080" w:sz="4"/>
+              <w:bottom w:val="single" w:color="808080" w:sz="4"/>
+              <w:right w:val="single" w:color="808080" w:sz="4"/>
+            </w:tcBorders>
+            <w:tcMar>
+              <w:top w:type="dxa" w:w="40"/>
+              <w:left w:type="dxa" w:w="60"/>
+              <w:bottom w:type="dxa" w:w="40"/>
+              <w:right w:type="dxa" w:w="60"/>
+            </w:tcMar>
+            <w:vAlign w:val="top"/>
+          </w:tcPr>
+          <w:p>
+            <w:pPr>
+              <w:spacing w:after="0" w:before="0"/>
+              <w:jc w:val="center"/>
+            </w:pPr>
+            <w:r>
+              <w:rPr>
+                <w:rFonts w:ascii="Calibri" w:cs="Calibri" w:eastAsia="Calibri" w:hAnsi="Calibri"/>
+                <w:b w:val="false"/>
+                <w:bCs w:val="false"/>
+                <w:sz w:val="14"/>
+                <w:szCs w:val="14"/>
+              </w:rPr>
+              <w:t xml:space="preserve">14</w:t>
+            </w:r>
+          </w:p>
+        </w:tc>
+        <w:tc>
+          <w:tcPr>
+            <w:tcW w:type="dxa" w:w="1134"/>
+            <w:tcBorders>
+              <w:top w:val="single" w:color="808080" w:sz="4"/>
+              <w:left w:val="single" w:color="808080" w:sz="4"/>
+              <w:bottom w:val="single" w:color="808080" w:sz="4"/>
+              <w:right w:val="single" w:color="808080" w:sz="4"/>
+            </w:tcBorders>
+            <w:tcMar>
+              <w:top w:type="dxa" w:w="40"/>
+              <w:left w:type="dxa" w:w="60"/>
+              <w:bottom w:type="dxa" w:w="40"/>
+              <w:right w:type="dxa" w:w="60"/>
+            </w:tcMar>
+            <w:vAlign w:val="top"/>
+          </w:tcPr>
+          <w:p>
+            <w:pPr>
+              <w:spacing w:after="0" w:before="0"/>
+              <w:jc w:val="center"/>
+            </w:pPr>
+            <w:r>
+              <w:rPr>
+                <w:rFonts w:ascii="Calibri" w:cs="Calibri" w:eastAsia="Calibri" w:hAnsi="Calibri"/>
+                <w:b w:val="false"/>
+                <w:bCs w:val="false"/>
+                <w:sz w:val="14"/>
+                <w:szCs w:val="14"/>
+              </w:rPr>
+              <w:t xml:space="preserve">30.740.1106</w:t>
+            </w:r>
+          </w:p>
+        </w:tc>
+        <w:tc>
+          <w:tcPr>
+            <w:tcW w:type="dxa" w:w="5102"/>
+            <w:tcBorders>
+              <w:top w:val="single" w:color="808080" w:sz="4"/>
+              <w:left w:val="single" w:color="808080" w:sz="4"/>
+              <w:bottom w:val="single" w:color="808080" w:sz="4"/>
+              <w:right w:val="single" w:color="808080" w:sz="4"/>
+            </w:tcBorders>
+            <w:tcMar>
+              <w:top w:type="dxa" w:w="40"/>
+              <w:left w:type="dxa" w:w="60"/>
+              <w:bottom w:type="dxa" w:w="40"/>
+              <w:right w:type="dxa" w:w="60"/>
+            </w:tcMar>
+            <w:vAlign w:val="top"/>
+          </w:tcPr>
+          <w:p>
+            <w:pPr>
+              <w:spacing w:after="0" w:before="0"/>
+              <w:jc w:val="left"/>
+            </w:pPr>
+            <w:r>
+              <w:rPr>
+                <w:rFonts w:ascii="Calibri" w:cs="Calibri" w:eastAsia="Calibri" w:hAnsi="Calibri"/>
+                <w:b w:val="false"/>
+                <w:bCs w:val="false"/>
+                <w:sz w:val="14"/>
+                <w:szCs w:val="14"/>
+              </w:rPr>
+              <w:t xml:space="preserve">Dizel elektrojen grubu (jeneratör) 63 kVA / 50 kW — dizel motoru su veya hava ile soğuyan cinsten, 1500 d/dak (%25 müteahhit kârı dahil)</w:t>
+            </w:r>
+          </w:p>
+        </w:tc>
+        <w:tc>
+          <w:tcPr>
+            <w:tcW w:type="dxa" w:w="680"/>
+            <w:tcBorders>
+              <w:top w:val="single" w:color="808080" w:sz="4"/>
+              <w:left w:val="single" w:color="808080" w:sz="4"/>
+              <w:bottom w:val="single" w:color="808080" w:sz="4"/>
+              <w:right w:val="single" w:color="808080" w:sz="4"/>
+            </w:tcBorders>
+            <w:tcMar>
+              <w:top w:type="dxa" w:w="40"/>
+              <w:left w:type="dxa" w:w="60"/>
+              <w:bottom w:type="dxa" w:w="40"/>
+              <w:right w:type="dxa" w:w="60"/>
+            </w:tcMar>
+            <w:vAlign w:val="top"/>
+          </w:tcPr>
+          <w:p>
+            <w:pPr>
+              <w:spacing w:after="0" w:before="0"/>
+              <w:jc w:val="center"/>
+            </w:pPr>
+            <w:r>
+              <w:rPr>
+                <w:rFonts w:ascii="Calibri" w:cs="Calibri" w:eastAsia="Calibri" w:hAnsi="Calibri"/>
+                <w:b w:val="false"/>
+                <w:bCs w:val="false"/>
+                <w:sz w:val="14"/>
+                <w:szCs w:val="14"/>
+              </w:rPr>
+              <w:t xml:space="preserve">ad</w:t>
+            </w:r>
+          </w:p>
+        </w:tc>
+        <w:tc>
+          <w:tcPr>
+            <w:tcW w:type="dxa" w:w="1134"/>
+            <w:tcBorders>
+              <w:top w:val="single" w:color="808080" w:sz="4"/>
+              <w:left w:val="single" w:color="808080" w:sz="4"/>
+              <w:bottom w:val="single" w:color="808080" w:sz="4"/>
+              <w:right w:val="single" w:color="808080" w:sz="4"/>
+            </w:tcBorders>
+            <w:tcMar>
+              <w:top w:type="dxa" w:w="40"/>
+              <w:left w:type="dxa" w:w="60"/>
+              <w:bottom w:type="dxa" w:w="40"/>
+              <w:right w:type="dxa" w:w="60"/>
+            </w:tcMar>
+            <w:vAlign w:val="top"/>
+          </w:tcPr>
+          <w:p>
+            <w:pPr>
+              <w:spacing w:after="0" w:before="0"/>
+              <w:jc w:val="right"/>
+            </w:pPr>
+            <w:r>
+              <w:rPr>
+                <w:rFonts w:ascii="Calibri" w:cs="Calibri" w:eastAsia="Calibri" w:hAnsi="Calibri"/>
+                <w:b w:val="false"/>
+                <w:bCs w:val="false"/>
+                <w:sz w:val="14"/>
+                <w:szCs w:val="14"/>
+              </w:rPr>
+              <w:t xml:space="preserve">1,000</w:t>
+            </w:r>
+          </w:p>
+        </w:tc>
+      </w:tr>
+      <w:tr>
+        <w:tc>
+          <w:tcPr>
+            <w:vMerge w:val="continue"/>
+            <w:tcBorders>
+              <w:top w:val="single" w:color="808080" w:sz="4"/>
+              <w:left w:val="single" w:color="808080" w:sz="4"/>
+              <w:bottom w:val="single" w:color="808080" w:sz="4"/>
+              <w:right w:val="single" w:color="808080" w:sz="4"/>
+            </w:tcBorders>
+          </w:tcPr>
+          <w:p/>
+        </w:tc>
+        <w:tc>
+          <w:tcPr>
+            <w:tcW w:type="dxa" w:w="454"/>
+            <w:tcBorders>
+              <w:top w:val="single" w:color="808080" w:sz="4"/>
+              <w:left w:val="single" w:color="808080" w:sz="4"/>
+              <w:bottom w:val="single" w:color="808080" w:sz="4"/>
+              <w:right w:val="single" w:color="808080" w:sz="4"/>
+            </w:tcBorders>
+            <w:tcMar>
+              <w:top w:type="dxa" w:w="40"/>
+              <w:left w:type="dxa" w:w="60"/>
+              <w:bottom w:type="dxa" w:w="40"/>
+              <w:right w:type="dxa" w:w="60"/>
+            </w:tcMar>
+            <w:vAlign w:val="top"/>
+          </w:tcPr>
+          <w:p>
+            <w:pPr>
+              <w:spacing w:after="0" w:before="0"/>
+              <w:jc w:val="center"/>
+            </w:pPr>
+            <w:r>
+              <w:rPr>
+                <w:rFonts w:ascii="Calibri" w:cs="Calibri" w:eastAsia="Calibri" w:hAnsi="Calibri"/>
+                <w:b w:val="false"/>
+                <w:bCs w:val="false"/>
+                <w:sz w:val="14"/>
+                <w:szCs w:val="14"/>
+              </w:rPr>
+              <w:t xml:space="preserve">15</w:t>
+            </w:r>
+          </w:p>
+        </w:tc>
+        <w:tc>
+          <w:tcPr>
+            <w:tcW w:type="dxa" w:w="1134"/>
+            <w:tcBorders>
+              <w:top w:val="single" w:color="808080" w:sz="4"/>
+              <w:left w:val="single" w:color="808080" w:sz="4"/>
+              <w:bottom w:val="single" w:color="808080" w:sz="4"/>
+              <w:right w:val="single" w:color="808080" w:sz="4"/>
+            </w:tcBorders>
+            <w:tcMar>
+              <w:top w:type="dxa" w:w="40"/>
+              <w:left w:type="dxa" w:w="60"/>
+              <w:bottom w:type="dxa" w:w="40"/>
+              <w:right w:type="dxa" w:w="60"/>
+            </w:tcMar>
+            <w:vAlign w:val="top"/>
+          </w:tcPr>
+          <w:p>
+            <w:pPr>
+              <w:spacing w:after="0" w:before="0"/>
+              <w:jc w:val="center"/>
+            </w:pPr>
+            <w:r>
+              <w:rPr>
+                <w:rFonts w:ascii="Calibri" w:cs="Calibri" w:eastAsia="Calibri" w:hAnsi="Calibri"/>
+                <w:b w:val="false"/>
+                <w:bCs w:val="false"/>
+                <w:sz w:val="14"/>
+                <w:szCs w:val="14"/>
+              </w:rPr>
+              <w:t xml:space="preserve">30.740.5406</w:t>
+            </w:r>
+          </w:p>
+        </w:tc>
+        <w:tc>
+          <w:tcPr>
+            <w:tcW w:type="dxa" w:w="5102"/>
+            <w:tcBorders>
+              <w:top w:val="single" w:color="808080" w:sz="4"/>
+              <w:left w:val="single" w:color="808080" w:sz="4"/>
+              <w:bottom w:val="single" w:color="808080" w:sz="4"/>
+              <w:right w:val="single" w:color="808080" w:sz="4"/>
+            </w:tcBorders>
+            <w:tcMar>
+              <w:top w:type="dxa" w:w="40"/>
+              <w:left w:type="dxa" w:w="60"/>
+              <w:bottom w:type="dxa" w:w="40"/>
+              <w:right w:type="dxa" w:w="60"/>
+            </w:tcMar>
+            <w:vAlign w:val="top"/>
+          </w:tcPr>
+          <w:p>
+            <w:pPr>
+              <w:spacing w:after="0" w:before="0"/>
+              <w:jc w:val="left"/>
+            </w:pPr>
+            <w:r>
+              <w:rPr>
+                <w:rFonts w:ascii="Calibri" w:cs="Calibri" w:eastAsia="Calibri" w:hAnsi="Calibri"/>
+                <w:b w:val="false"/>
+                <w:bCs w:val="false"/>
+                <w:sz w:val="14"/>
+                <w:szCs w:val="14"/>
+              </w:rPr>
+              <w:t xml:space="preserve">Jeneratör ses izolasyon kabini — 63 kVA (%25 müteahhit kârı dahil)</w:t>
+            </w:r>
+          </w:p>
+        </w:tc>
+        <w:tc>
+          <w:tcPr>
+            <w:tcW w:type="dxa" w:w="680"/>
+            <w:tcBorders>
+              <w:top w:val="single" w:color="808080" w:sz="4"/>
+              <w:left w:val="single" w:color="808080" w:sz="4"/>
+              <w:bottom w:val="single" w:color="808080" w:sz="4"/>
+              <w:right w:val="single" w:color="808080" w:sz="4"/>
+            </w:tcBorders>
+            <w:tcMar>
+              <w:top w:type="dxa" w:w="40"/>
+              <w:left w:type="dxa" w:w="60"/>
+              <w:bottom w:type="dxa" w:w="40"/>
+              <w:right w:type="dxa" w:w="60"/>
+            </w:tcMar>
+            <w:vAlign w:val="top"/>
+          </w:tcPr>
+          <w:p>
+            <w:pPr>
+              <w:spacing w:after="0" w:before="0"/>
+              <w:jc w:val="center"/>
+            </w:pPr>
+            <w:r>
+              <w:rPr>
+                <w:rFonts w:ascii="Calibri" w:cs="Calibri" w:eastAsia="Calibri" w:hAnsi="Calibri"/>
+                <w:b w:val="false"/>
+                <w:bCs w:val="false"/>
+                <w:sz w:val="14"/>
+                <w:szCs w:val="14"/>
+              </w:rPr>
+              <w:t xml:space="preserve">ad</w:t>
+            </w:r>
+          </w:p>
+        </w:tc>
+        <w:tc>
+          <w:tcPr>
+            <w:tcW w:type="dxa" w:w="1134"/>
+            <w:tcBorders>
+              <w:top w:val="single" w:color="808080" w:sz="4"/>
+              <w:left w:val="single" w:color="808080" w:sz="4"/>
+              <w:bottom w:val="single" w:color="808080" w:sz="4"/>
+              <w:right w:val="single" w:color="808080" w:sz="4"/>
+            </w:tcBorders>
+            <w:tcMar>
+              <w:top w:type="dxa" w:w="40"/>
+              <w:left w:type="dxa" w:w="60"/>
+              <w:bottom w:type="dxa" w:w="40"/>
+              <w:right w:type="dxa" w:w="60"/>
+            </w:tcMar>
+            <w:vAlign w:val="top"/>
+          </w:tcPr>
+          <w:p>
+            <w:pPr>
+              <w:spacing w:after="0" w:before="0"/>
+              <w:jc w:val="right"/>
+            </w:pPr>
+            <w:r>
+              <w:rPr>
+                <w:rFonts w:ascii="Calibri" w:cs="Calibri" w:eastAsia="Calibri" w:hAnsi="Calibri"/>
+                <w:b w:val="false"/>
+                <w:bCs w:val="false"/>
+                <w:sz w:val="14"/>
+                <w:szCs w:val="14"/>
+              </w:rPr>
+              <w:t xml:space="preserve">1,000</w:t>
             </w:r>
           </w:p>
         </w:tc>

</xml_diff>

<commit_message>
Yayın: metraj yuvarlaması yarım değerde yukarı
31,4285 -> 31,429 ve 7,2875 -> 7,288. Uygun harcama 290.859 Avro;
kademe, puan ve pay değişmedi.

Co-Authored-By: Claude Opus 5 <noreply@anthropic.com>
Claude-Session: https://claude.ai/code/session_01HJPp6bx7wepUX5p8fxGcjg
</commit_message>
<xml_diff>
--- a/belgeler/27_KESIF_OZETI_EK_01_KUMES_A_BLOK.docx
+++ b/belgeler/27_KESIF_OZETI_EK_01_KUMES_A_BLOK.docx
@@ -828,7 +828,7 @@
                 <w:sz w:val="14"/>
                 <w:szCs w:val="14"/>
               </w:rPr>
-              <w:t xml:space="preserve">31,428</w:t>
+              <w:t xml:space="preserve">31,429</w:t>
             </w:r>
           </w:p>
         </w:tc>
@@ -1634,7 +1634,7 @@
                 <w:sz w:val="14"/>
                 <w:szCs w:val="14"/>
               </w:rPr>
-              <w:t xml:space="preserve">7,287</w:t>
+              <w:t xml:space="preserve">7,288</w:t>
             </w:r>
           </w:p>
         </w:tc>

</xml_diff>

<commit_message>
Yayın: kümes başına 200 m kablo tavası (ÇŞB 35.190.1100)
Malzeme ve montaj ayrı poz satırı. Uygun harcama 295.391 Avro, eşiğe
kalan pay 4.609 Avro.

Co-Authored-By: Claude Opus 5 <noreply@anthropic.com>
Claude-Session: https://claude.ai/code/session_01HJPp6bx7wepUX5p8fxGcjg
</commit_message>
<xml_diff>
--- a/belgeler/27_KESIF_OZETI_EK_01_KUMES_A_BLOK.docx
+++ b/belgeler/27_KESIF_OZETI_EK_01_KUMES_A_BLOK.docx
@@ -7737,6 +7737,374 @@
                 <w:szCs w:val="14"/>
               </w:rPr>
               <w:t xml:space="preserve">1,000</w:t>
+            </w:r>
+          </w:p>
+        </w:tc>
+      </w:tr>
+      <w:tr>
+        <w:tc>
+          <w:tcPr>
+            <w:vMerge w:val="continue"/>
+            <w:tcBorders>
+              <w:top w:val="single" w:color="808080" w:sz="4"/>
+              <w:left w:val="single" w:color="808080" w:sz="4"/>
+              <w:bottom w:val="single" w:color="808080" w:sz="4"/>
+              <w:right w:val="single" w:color="808080" w:sz="4"/>
+            </w:tcBorders>
+          </w:tcPr>
+          <w:p/>
+        </w:tc>
+        <w:tc>
+          <w:tcPr>
+            <w:tcW w:type="dxa" w:w="454"/>
+            <w:tcBorders>
+              <w:top w:val="single" w:color="808080" w:sz="4"/>
+              <w:left w:val="single" w:color="808080" w:sz="4"/>
+              <w:bottom w:val="single" w:color="808080" w:sz="4"/>
+              <w:right w:val="single" w:color="808080" w:sz="4"/>
+            </w:tcBorders>
+            <w:tcMar>
+              <w:top w:type="dxa" w:w="40"/>
+              <w:left w:type="dxa" w:w="60"/>
+              <w:bottom w:type="dxa" w:w="40"/>
+              <w:right w:type="dxa" w:w="60"/>
+            </w:tcMar>
+            <w:vAlign w:val="top"/>
+          </w:tcPr>
+          <w:p>
+            <w:pPr>
+              <w:spacing w:after="0" w:before="0"/>
+              <w:jc w:val="center"/>
+            </w:pPr>
+            <w:r>
+              <w:rPr>
+                <w:rFonts w:ascii="Calibri" w:cs="Calibri" w:eastAsia="Calibri" w:hAnsi="Calibri"/>
+                <w:b w:val="false"/>
+                <w:bCs w:val="false"/>
+                <w:sz w:val="14"/>
+                <w:szCs w:val="14"/>
+              </w:rPr>
+              <w:t xml:space="preserve">16</w:t>
+            </w:r>
+          </w:p>
+        </w:tc>
+        <w:tc>
+          <w:tcPr>
+            <w:tcW w:type="dxa" w:w="1134"/>
+            <w:tcBorders>
+              <w:top w:val="single" w:color="808080" w:sz="4"/>
+              <w:left w:val="single" w:color="808080" w:sz="4"/>
+              <w:bottom w:val="single" w:color="808080" w:sz="4"/>
+              <w:right w:val="single" w:color="808080" w:sz="4"/>
+            </w:tcBorders>
+            <w:tcMar>
+              <w:top w:type="dxa" w:w="40"/>
+              <w:left w:type="dxa" w:w="60"/>
+              <w:bottom w:type="dxa" w:w="40"/>
+              <w:right w:type="dxa" w:w="60"/>
+            </w:tcMar>
+            <w:vAlign w:val="top"/>
+          </w:tcPr>
+          <w:p>
+            <w:pPr>
+              <w:spacing w:after="0" w:before="0"/>
+              <w:jc w:val="center"/>
+            </w:pPr>
+            <w:r>
+              <w:rPr>
+                <w:rFonts w:ascii="Calibri" w:cs="Calibri" w:eastAsia="Calibri" w:hAnsi="Calibri"/>
+                <w:b w:val="false"/>
+                <w:bCs w:val="false"/>
+                <w:sz w:val="14"/>
+                <w:szCs w:val="14"/>
+              </w:rPr>
+              <w:t xml:space="preserve">35.190.1100</w:t>
+            </w:r>
+          </w:p>
+        </w:tc>
+        <w:tc>
+          <w:tcPr>
+            <w:tcW w:type="dxa" w:w="5102"/>
+            <w:tcBorders>
+              <w:top w:val="single" w:color="808080" w:sz="4"/>
+              <w:left w:val="single" w:color="808080" w:sz="4"/>
+              <w:bottom w:val="single" w:color="808080" w:sz="4"/>
+              <w:right w:val="single" w:color="808080" w:sz="4"/>
+            </w:tcBorders>
+            <w:tcMar>
+              <w:top w:type="dxa" w:w="40"/>
+              <w:left w:type="dxa" w:w="60"/>
+              <w:bottom w:type="dxa" w:w="40"/>
+              <w:right w:type="dxa" w:w="60"/>
+            </w:tcMar>
+            <w:vAlign w:val="top"/>
+          </w:tcPr>
+          <w:p>
+            <w:pPr>
+              <w:spacing w:after="0" w:before="0"/>
+              <w:jc w:val="left"/>
+            </w:pPr>
+            <w:r>
+              <w:rPr>
+                <w:rFonts w:ascii="Calibri" w:cs="Calibri" w:eastAsia="Calibri" w:hAnsi="Calibri"/>
+                <w:b w:val="false"/>
+                <w:bCs w:val="false"/>
+                <w:sz w:val="14"/>
+                <w:szCs w:val="14"/>
+              </w:rPr>
+              <w:t xml:space="preserve">Kablo tava sistemleri — 200x60x1,0 mm sıcak daldırma galvanizli perfore kablo tavası (malzeme) (%25 müteahhit kârı dahil)</w:t>
+            </w:r>
+          </w:p>
+        </w:tc>
+        <w:tc>
+          <w:tcPr>
+            <w:tcW w:type="dxa" w:w="680"/>
+            <w:tcBorders>
+              <w:top w:val="single" w:color="808080" w:sz="4"/>
+              <w:left w:val="single" w:color="808080" w:sz="4"/>
+              <w:bottom w:val="single" w:color="808080" w:sz="4"/>
+              <w:right w:val="single" w:color="808080" w:sz="4"/>
+            </w:tcBorders>
+            <w:tcMar>
+              <w:top w:type="dxa" w:w="40"/>
+              <w:left w:type="dxa" w:w="60"/>
+              <w:bottom w:type="dxa" w:w="40"/>
+              <w:right w:type="dxa" w:w="60"/>
+            </w:tcMar>
+            <w:vAlign w:val="top"/>
+          </w:tcPr>
+          <w:p>
+            <w:pPr>
+              <w:spacing w:after="0" w:before="0"/>
+              <w:jc w:val="center"/>
+            </w:pPr>
+            <w:r>
+              <w:rPr>
+                <w:rFonts w:ascii="Calibri" w:cs="Calibri" w:eastAsia="Calibri" w:hAnsi="Calibri"/>
+                <w:b w:val="false"/>
+                <w:bCs w:val="false"/>
+                <w:sz w:val="14"/>
+                <w:szCs w:val="14"/>
+              </w:rPr>
+              <w:t xml:space="preserve">kg</w:t>
+            </w:r>
+          </w:p>
+        </w:tc>
+        <w:tc>
+          <w:tcPr>
+            <w:tcW w:type="dxa" w:w="1134"/>
+            <w:tcBorders>
+              <w:top w:val="single" w:color="808080" w:sz="4"/>
+              <w:left w:val="single" w:color="808080" w:sz="4"/>
+              <w:bottom w:val="single" w:color="808080" w:sz="4"/>
+              <w:right w:val="single" w:color="808080" w:sz="4"/>
+            </w:tcBorders>
+            <w:tcMar>
+              <w:top w:type="dxa" w:w="40"/>
+              <w:left w:type="dxa" w:w="60"/>
+              <w:bottom w:type="dxa" w:w="40"/>
+              <w:right w:type="dxa" w:w="60"/>
+            </w:tcMar>
+            <w:vAlign w:val="top"/>
+          </w:tcPr>
+          <w:p>
+            <w:pPr>
+              <w:spacing w:after="0" w:before="0"/>
+              <w:jc w:val="right"/>
+            </w:pPr>
+            <w:r>
+              <w:rPr>
+                <w:rFonts w:ascii="Calibri" w:cs="Calibri" w:eastAsia="Calibri" w:hAnsi="Calibri"/>
+                <w:b w:val="false"/>
+                <w:bCs w:val="false"/>
+                <w:sz w:val="14"/>
+                <w:szCs w:val="14"/>
+              </w:rPr>
+              <w:t xml:space="preserve">502,000</w:t>
+            </w:r>
+          </w:p>
+        </w:tc>
+      </w:tr>
+      <w:tr>
+        <w:tc>
+          <w:tcPr>
+            <w:vMerge w:val="continue"/>
+            <w:tcBorders>
+              <w:top w:val="single" w:color="808080" w:sz="4"/>
+              <w:left w:val="single" w:color="808080" w:sz="4"/>
+              <w:bottom w:val="single" w:color="808080" w:sz="4"/>
+              <w:right w:val="single" w:color="808080" w:sz="4"/>
+            </w:tcBorders>
+          </w:tcPr>
+          <w:p/>
+        </w:tc>
+        <w:tc>
+          <w:tcPr>
+            <w:tcW w:type="dxa" w:w="454"/>
+            <w:tcBorders>
+              <w:top w:val="single" w:color="808080" w:sz="4"/>
+              <w:left w:val="single" w:color="808080" w:sz="4"/>
+              <w:bottom w:val="single" w:color="808080" w:sz="4"/>
+              <w:right w:val="single" w:color="808080" w:sz="4"/>
+            </w:tcBorders>
+            <w:tcMar>
+              <w:top w:type="dxa" w:w="40"/>
+              <w:left w:type="dxa" w:w="60"/>
+              <w:bottom w:type="dxa" w:w="40"/>
+              <w:right w:type="dxa" w:w="60"/>
+            </w:tcMar>
+            <w:vAlign w:val="top"/>
+          </w:tcPr>
+          <w:p>
+            <w:pPr>
+              <w:spacing w:after="0" w:before="0"/>
+              <w:jc w:val="center"/>
+            </w:pPr>
+            <w:r>
+              <w:rPr>
+                <w:rFonts w:ascii="Calibri" w:cs="Calibri" w:eastAsia="Calibri" w:hAnsi="Calibri"/>
+                <w:b w:val="false"/>
+                <w:bCs w:val="false"/>
+                <w:sz w:val="14"/>
+                <w:szCs w:val="14"/>
+              </w:rPr>
+              <w:t xml:space="preserve">17</w:t>
+            </w:r>
+          </w:p>
+        </w:tc>
+        <w:tc>
+          <w:tcPr>
+            <w:tcW w:type="dxa" w:w="1134"/>
+            <w:tcBorders>
+              <w:top w:val="single" w:color="808080" w:sz="4"/>
+              <w:left w:val="single" w:color="808080" w:sz="4"/>
+              <w:bottom w:val="single" w:color="808080" w:sz="4"/>
+              <w:right w:val="single" w:color="808080" w:sz="4"/>
+            </w:tcBorders>
+            <w:tcMar>
+              <w:top w:type="dxa" w:w="40"/>
+              <w:left w:type="dxa" w:w="60"/>
+              <w:bottom w:type="dxa" w:w="40"/>
+              <w:right w:type="dxa" w:w="60"/>
+            </w:tcMar>
+            <w:vAlign w:val="top"/>
+          </w:tcPr>
+          <w:p>
+            <w:pPr>
+              <w:spacing w:after="0" w:before="0"/>
+              <w:jc w:val="center"/>
+            </w:pPr>
+            <w:r>
+              <w:rPr>
+                <w:rFonts w:ascii="Calibri" w:cs="Calibri" w:eastAsia="Calibri" w:hAnsi="Calibri"/>
+                <w:b w:val="false"/>
+                <w:bCs w:val="false"/>
+                <w:sz w:val="14"/>
+                <w:szCs w:val="14"/>
+              </w:rPr>
+              <w:t xml:space="preserve">35.190.1100 (montaj)</w:t>
+            </w:r>
+          </w:p>
+        </w:tc>
+        <w:tc>
+          <w:tcPr>
+            <w:tcW w:type="dxa" w:w="5102"/>
+            <w:tcBorders>
+              <w:top w:val="single" w:color="808080" w:sz="4"/>
+              <w:left w:val="single" w:color="808080" w:sz="4"/>
+              <w:bottom w:val="single" w:color="808080" w:sz="4"/>
+              <w:right w:val="single" w:color="808080" w:sz="4"/>
+            </w:tcBorders>
+            <w:tcMar>
+              <w:top w:type="dxa" w:w="40"/>
+              <w:left w:type="dxa" w:w="60"/>
+              <w:bottom w:type="dxa" w:w="40"/>
+              <w:right w:type="dxa" w:w="60"/>
+            </w:tcMar>
+            <w:vAlign w:val="top"/>
+          </w:tcPr>
+          <w:p>
+            <w:pPr>
+              <w:spacing w:after="0" w:before="0"/>
+              <w:jc w:val="left"/>
+            </w:pPr>
+            <w:r>
+              <w:rPr>
+                <w:rFonts w:ascii="Calibri" w:cs="Calibri" w:eastAsia="Calibri" w:hAnsi="Calibri"/>
+                <w:b w:val="false"/>
+                <w:bCs w:val="false"/>
+                <w:sz w:val="14"/>
+                <w:szCs w:val="14"/>
+              </w:rPr>
+              <w:t xml:space="preserve">Kablo tava sistemlerinin montajı — askı ve konsollarla tavana veya duvara tespiti; ek parça, konsol, askı tiji, vida ve somun bedelleri dâhildir, ayrıca ödenmez</w:t>
+            </w:r>
+          </w:p>
+        </w:tc>
+        <w:tc>
+          <w:tcPr>
+            <w:tcW w:type="dxa" w:w="680"/>
+            <w:tcBorders>
+              <w:top w:val="single" w:color="808080" w:sz="4"/>
+              <w:left w:val="single" w:color="808080" w:sz="4"/>
+              <w:bottom w:val="single" w:color="808080" w:sz="4"/>
+              <w:right w:val="single" w:color="808080" w:sz="4"/>
+            </w:tcBorders>
+            <w:tcMar>
+              <w:top w:type="dxa" w:w="40"/>
+              <w:left w:type="dxa" w:w="60"/>
+              <w:bottom w:type="dxa" w:w="40"/>
+              <w:right w:type="dxa" w:w="60"/>
+            </w:tcMar>
+            <w:vAlign w:val="top"/>
+          </w:tcPr>
+          <w:p>
+            <w:pPr>
+              <w:spacing w:after="0" w:before="0"/>
+              <w:jc w:val="center"/>
+            </w:pPr>
+            <w:r>
+              <w:rPr>
+                <w:rFonts w:ascii="Calibri" w:cs="Calibri" w:eastAsia="Calibri" w:hAnsi="Calibri"/>
+                <w:b w:val="false"/>
+                <w:bCs w:val="false"/>
+                <w:sz w:val="14"/>
+                <w:szCs w:val="14"/>
+              </w:rPr>
+              <w:t xml:space="preserve">kg</w:t>
+            </w:r>
+          </w:p>
+        </w:tc>
+        <w:tc>
+          <w:tcPr>
+            <w:tcW w:type="dxa" w:w="1134"/>
+            <w:tcBorders>
+              <w:top w:val="single" w:color="808080" w:sz="4"/>
+              <w:left w:val="single" w:color="808080" w:sz="4"/>
+              <w:bottom w:val="single" w:color="808080" w:sz="4"/>
+              <w:right w:val="single" w:color="808080" w:sz="4"/>
+            </w:tcBorders>
+            <w:tcMar>
+              <w:top w:type="dxa" w:w="40"/>
+              <w:left w:type="dxa" w:w="60"/>
+              <w:bottom w:type="dxa" w:w="40"/>
+              <w:right w:type="dxa" w:w="60"/>
+            </w:tcMar>
+            <w:vAlign w:val="top"/>
+          </w:tcPr>
+          <w:p>
+            <w:pPr>
+              <w:spacing w:after="0" w:before="0"/>
+              <w:jc w:val="right"/>
+            </w:pPr>
+            <w:r>
+              <w:rPr>
+                <w:rFonts w:ascii="Calibri" w:cs="Calibri" w:eastAsia="Calibri" w:hAnsi="Calibri"/>
+                <w:b w:val="false"/>
+                <w:bCs w:val="false"/>
+                <w:sz w:val="14"/>
+                <w:szCs w:val="14"/>
+              </w:rPr>
+              <w:t xml:space="preserve">502,000</w:t>
             </w:r>
           </w:p>
         </w:tc>

</xml_diff>

<commit_message>
Yayın: kablo tavası kapak sacı (ÇŞB 35.190.1101)
Malzeme 193,30 + montaj 25,36 = 218,66 TL/kg, blok başına 361,200 kg.
Uygun harcama 297.906 Avro; eşiğe kalan pay 2.094 Avro.

Co-Authored-By: Claude Opus 5 <noreply@anthropic.com>
Claude-Session: https://claude.ai/code/session_01HJPp6bx7wepUX5p8fxGcjg
</commit_message>
<xml_diff>
--- a/belgeler/27_KESIF_OZETI_EK_01_KUMES_A_BLOK.docx
+++ b/belgeler/27_KESIF_OZETI_EK_01_KUMES_A_BLOK.docx
@@ -8105,6 +8105,374 @@
                 <w:szCs w:val="14"/>
               </w:rPr>
               <w:t xml:space="preserve">502,000</w:t>
+            </w:r>
+          </w:p>
+        </w:tc>
+      </w:tr>
+      <w:tr>
+        <w:tc>
+          <w:tcPr>
+            <w:vMerge w:val="continue"/>
+            <w:tcBorders>
+              <w:top w:val="single" w:color="808080" w:sz="4"/>
+              <w:left w:val="single" w:color="808080" w:sz="4"/>
+              <w:bottom w:val="single" w:color="808080" w:sz="4"/>
+              <w:right w:val="single" w:color="808080" w:sz="4"/>
+            </w:tcBorders>
+          </w:tcPr>
+          <w:p/>
+        </w:tc>
+        <w:tc>
+          <w:tcPr>
+            <w:tcW w:type="dxa" w:w="454"/>
+            <w:tcBorders>
+              <w:top w:val="single" w:color="808080" w:sz="4"/>
+              <w:left w:val="single" w:color="808080" w:sz="4"/>
+              <w:bottom w:val="single" w:color="808080" w:sz="4"/>
+              <w:right w:val="single" w:color="808080" w:sz="4"/>
+            </w:tcBorders>
+            <w:tcMar>
+              <w:top w:type="dxa" w:w="40"/>
+              <w:left w:type="dxa" w:w="60"/>
+              <w:bottom w:type="dxa" w:w="40"/>
+              <w:right w:type="dxa" w:w="60"/>
+            </w:tcMar>
+            <w:vAlign w:val="top"/>
+          </w:tcPr>
+          <w:p>
+            <w:pPr>
+              <w:spacing w:after="0" w:before="0"/>
+              <w:jc w:val="center"/>
+            </w:pPr>
+            <w:r>
+              <w:rPr>
+                <w:rFonts w:ascii="Calibri" w:cs="Calibri" w:eastAsia="Calibri" w:hAnsi="Calibri"/>
+                <w:b w:val="false"/>
+                <w:bCs w:val="false"/>
+                <w:sz w:val="14"/>
+                <w:szCs w:val="14"/>
+              </w:rPr>
+              <w:t xml:space="preserve">18</w:t>
+            </w:r>
+          </w:p>
+        </w:tc>
+        <w:tc>
+          <w:tcPr>
+            <w:tcW w:type="dxa" w:w="1134"/>
+            <w:tcBorders>
+              <w:top w:val="single" w:color="808080" w:sz="4"/>
+              <w:left w:val="single" w:color="808080" w:sz="4"/>
+              <w:bottom w:val="single" w:color="808080" w:sz="4"/>
+              <w:right w:val="single" w:color="808080" w:sz="4"/>
+            </w:tcBorders>
+            <w:tcMar>
+              <w:top w:type="dxa" w:w="40"/>
+              <w:left w:type="dxa" w:w="60"/>
+              <w:bottom w:type="dxa" w:w="40"/>
+              <w:right w:type="dxa" w:w="60"/>
+            </w:tcMar>
+            <w:vAlign w:val="top"/>
+          </w:tcPr>
+          <w:p>
+            <w:pPr>
+              <w:spacing w:after="0" w:before="0"/>
+              <w:jc w:val="center"/>
+            </w:pPr>
+            <w:r>
+              <w:rPr>
+                <w:rFonts w:ascii="Calibri" w:cs="Calibri" w:eastAsia="Calibri" w:hAnsi="Calibri"/>
+                <w:b w:val="false"/>
+                <w:bCs w:val="false"/>
+                <w:sz w:val="14"/>
+                <w:szCs w:val="14"/>
+              </w:rPr>
+              <w:t xml:space="preserve">35.190.1101</w:t>
+            </w:r>
+          </w:p>
+        </w:tc>
+        <w:tc>
+          <w:tcPr>
+            <w:tcW w:type="dxa" w:w="5102"/>
+            <w:tcBorders>
+              <w:top w:val="single" w:color="808080" w:sz="4"/>
+              <w:left w:val="single" w:color="808080" w:sz="4"/>
+              <w:bottom w:val="single" w:color="808080" w:sz="4"/>
+              <w:right w:val="single" w:color="808080" w:sz="4"/>
+            </w:tcBorders>
+            <w:tcMar>
+              <w:top w:type="dxa" w:w="40"/>
+              <w:left w:type="dxa" w:w="60"/>
+              <w:bottom w:type="dxa" w:w="40"/>
+              <w:right w:type="dxa" w:w="60"/>
+            </w:tcMar>
+            <w:vAlign w:val="top"/>
+          </w:tcPr>
+          <w:p>
+            <w:pPr>
+              <w:spacing w:after="0" w:before="0"/>
+              <w:jc w:val="left"/>
+            </w:pPr>
+            <w:r>
+              <w:rPr>
+                <w:rFonts w:ascii="Calibri" w:cs="Calibri" w:eastAsia="Calibri" w:hAnsi="Calibri"/>
+                <w:b w:val="false"/>
+                <w:bCs w:val="false"/>
+                <w:sz w:val="14"/>
+                <w:szCs w:val="14"/>
+              </w:rPr>
+              <w:t xml:space="preserve">Kablo tava sistemleri kapak sacı — 35.190.1100 pozuna uygun özellikte, 1,0 mm sıcak daldırma galvanizli (malzeme) (%25 müteahhit kârı dahil)</w:t>
+            </w:r>
+          </w:p>
+        </w:tc>
+        <w:tc>
+          <w:tcPr>
+            <w:tcW w:type="dxa" w:w="680"/>
+            <w:tcBorders>
+              <w:top w:val="single" w:color="808080" w:sz="4"/>
+              <w:left w:val="single" w:color="808080" w:sz="4"/>
+              <w:bottom w:val="single" w:color="808080" w:sz="4"/>
+              <w:right w:val="single" w:color="808080" w:sz="4"/>
+            </w:tcBorders>
+            <w:tcMar>
+              <w:top w:type="dxa" w:w="40"/>
+              <w:left w:type="dxa" w:w="60"/>
+              <w:bottom w:type="dxa" w:w="40"/>
+              <w:right w:type="dxa" w:w="60"/>
+            </w:tcMar>
+            <w:vAlign w:val="top"/>
+          </w:tcPr>
+          <w:p>
+            <w:pPr>
+              <w:spacing w:after="0" w:before="0"/>
+              <w:jc w:val="center"/>
+            </w:pPr>
+            <w:r>
+              <w:rPr>
+                <w:rFonts w:ascii="Calibri" w:cs="Calibri" w:eastAsia="Calibri" w:hAnsi="Calibri"/>
+                <w:b w:val="false"/>
+                <w:bCs w:val="false"/>
+                <w:sz w:val="14"/>
+                <w:szCs w:val="14"/>
+              </w:rPr>
+              <w:t xml:space="preserve">kg</w:t>
+            </w:r>
+          </w:p>
+        </w:tc>
+        <w:tc>
+          <w:tcPr>
+            <w:tcW w:type="dxa" w:w="1134"/>
+            <w:tcBorders>
+              <w:top w:val="single" w:color="808080" w:sz="4"/>
+              <w:left w:val="single" w:color="808080" w:sz="4"/>
+              <w:bottom w:val="single" w:color="808080" w:sz="4"/>
+              <w:right w:val="single" w:color="808080" w:sz="4"/>
+            </w:tcBorders>
+            <w:tcMar>
+              <w:top w:type="dxa" w:w="40"/>
+              <w:left w:type="dxa" w:w="60"/>
+              <w:bottom w:type="dxa" w:w="40"/>
+              <w:right w:type="dxa" w:w="60"/>
+            </w:tcMar>
+            <w:vAlign w:val="top"/>
+          </w:tcPr>
+          <w:p>
+            <w:pPr>
+              <w:spacing w:after="0" w:before="0"/>
+              <w:jc w:val="right"/>
+            </w:pPr>
+            <w:r>
+              <w:rPr>
+                <w:rFonts w:ascii="Calibri" w:cs="Calibri" w:eastAsia="Calibri" w:hAnsi="Calibri"/>
+                <w:b w:val="false"/>
+                <w:bCs w:val="false"/>
+                <w:sz w:val="14"/>
+                <w:szCs w:val="14"/>
+              </w:rPr>
+              <w:t xml:space="preserve">361,200</w:t>
+            </w:r>
+          </w:p>
+        </w:tc>
+      </w:tr>
+      <w:tr>
+        <w:tc>
+          <w:tcPr>
+            <w:vMerge w:val="continue"/>
+            <w:tcBorders>
+              <w:top w:val="single" w:color="808080" w:sz="4"/>
+              <w:left w:val="single" w:color="808080" w:sz="4"/>
+              <w:bottom w:val="single" w:color="808080" w:sz="4"/>
+              <w:right w:val="single" w:color="808080" w:sz="4"/>
+            </w:tcBorders>
+          </w:tcPr>
+          <w:p/>
+        </w:tc>
+        <w:tc>
+          <w:tcPr>
+            <w:tcW w:type="dxa" w:w="454"/>
+            <w:tcBorders>
+              <w:top w:val="single" w:color="808080" w:sz="4"/>
+              <w:left w:val="single" w:color="808080" w:sz="4"/>
+              <w:bottom w:val="single" w:color="808080" w:sz="4"/>
+              <w:right w:val="single" w:color="808080" w:sz="4"/>
+            </w:tcBorders>
+            <w:tcMar>
+              <w:top w:type="dxa" w:w="40"/>
+              <w:left w:type="dxa" w:w="60"/>
+              <w:bottom w:type="dxa" w:w="40"/>
+              <w:right w:type="dxa" w:w="60"/>
+            </w:tcMar>
+            <w:vAlign w:val="top"/>
+          </w:tcPr>
+          <w:p>
+            <w:pPr>
+              <w:spacing w:after="0" w:before="0"/>
+              <w:jc w:val="center"/>
+            </w:pPr>
+            <w:r>
+              <w:rPr>
+                <w:rFonts w:ascii="Calibri" w:cs="Calibri" w:eastAsia="Calibri" w:hAnsi="Calibri"/>
+                <w:b w:val="false"/>
+                <w:bCs w:val="false"/>
+                <w:sz w:val="14"/>
+                <w:szCs w:val="14"/>
+              </w:rPr>
+              <w:t xml:space="preserve">19</w:t>
+            </w:r>
+          </w:p>
+        </w:tc>
+        <w:tc>
+          <w:tcPr>
+            <w:tcW w:type="dxa" w:w="1134"/>
+            <w:tcBorders>
+              <w:top w:val="single" w:color="808080" w:sz="4"/>
+              <w:left w:val="single" w:color="808080" w:sz="4"/>
+              <w:bottom w:val="single" w:color="808080" w:sz="4"/>
+              <w:right w:val="single" w:color="808080" w:sz="4"/>
+            </w:tcBorders>
+            <w:tcMar>
+              <w:top w:type="dxa" w:w="40"/>
+              <w:left w:type="dxa" w:w="60"/>
+              <w:bottom w:type="dxa" w:w="40"/>
+              <w:right w:type="dxa" w:w="60"/>
+            </w:tcMar>
+            <w:vAlign w:val="top"/>
+          </w:tcPr>
+          <w:p>
+            <w:pPr>
+              <w:spacing w:after="0" w:before="0"/>
+              <w:jc w:val="center"/>
+            </w:pPr>
+            <w:r>
+              <w:rPr>
+                <w:rFonts w:ascii="Calibri" w:cs="Calibri" w:eastAsia="Calibri" w:hAnsi="Calibri"/>
+                <w:b w:val="false"/>
+                <w:bCs w:val="false"/>
+                <w:sz w:val="14"/>
+                <w:szCs w:val="14"/>
+              </w:rPr>
+              <w:t xml:space="preserve">35.190.1101 (montaj)</w:t>
+            </w:r>
+          </w:p>
+        </w:tc>
+        <w:tc>
+          <w:tcPr>
+            <w:tcW w:type="dxa" w:w="5102"/>
+            <w:tcBorders>
+              <w:top w:val="single" w:color="808080" w:sz="4"/>
+              <w:left w:val="single" w:color="808080" w:sz="4"/>
+              <w:bottom w:val="single" w:color="808080" w:sz="4"/>
+              <w:right w:val="single" w:color="808080" w:sz="4"/>
+            </w:tcBorders>
+            <w:tcMar>
+              <w:top w:type="dxa" w:w="40"/>
+              <w:left w:type="dxa" w:w="60"/>
+              <w:bottom w:type="dxa" w:w="40"/>
+              <w:right w:type="dxa" w:w="60"/>
+            </w:tcMar>
+            <w:vAlign w:val="top"/>
+          </w:tcPr>
+          <w:p>
+            <w:pPr>
+              <w:spacing w:after="0" w:before="0"/>
+              <w:jc w:val="left"/>
+            </w:pPr>
+            <w:r>
+              <w:rPr>
+                <w:rFonts w:ascii="Calibri" w:cs="Calibri" w:eastAsia="Calibri" w:hAnsi="Calibri"/>
+                <w:b w:val="false"/>
+                <w:bCs w:val="false"/>
+                <w:sz w:val="14"/>
+                <w:szCs w:val="14"/>
+              </w:rPr>
+              <w:t xml:space="preserve">Kablo tava sistemleri kapak sacının montajı — onaylı projesinde belirtilen kanalların kapatılması; her türlü işçilik ve malzeme dâhil, işler hâlde teslim</w:t>
+            </w:r>
+          </w:p>
+        </w:tc>
+        <w:tc>
+          <w:tcPr>
+            <w:tcW w:type="dxa" w:w="680"/>
+            <w:tcBorders>
+              <w:top w:val="single" w:color="808080" w:sz="4"/>
+              <w:left w:val="single" w:color="808080" w:sz="4"/>
+              <w:bottom w:val="single" w:color="808080" w:sz="4"/>
+              <w:right w:val="single" w:color="808080" w:sz="4"/>
+            </w:tcBorders>
+            <w:tcMar>
+              <w:top w:type="dxa" w:w="40"/>
+              <w:left w:type="dxa" w:w="60"/>
+              <w:bottom w:type="dxa" w:w="40"/>
+              <w:right w:type="dxa" w:w="60"/>
+            </w:tcMar>
+            <w:vAlign w:val="top"/>
+          </w:tcPr>
+          <w:p>
+            <w:pPr>
+              <w:spacing w:after="0" w:before="0"/>
+              <w:jc w:val="center"/>
+            </w:pPr>
+            <w:r>
+              <w:rPr>
+                <w:rFonts w:ascii="Calibri" w:cs="Calibri" w:eastAsia="Calibri" w:hAnsi="Calibri"/>
+                <w:b w:val="false"/>
+                <w:bCs w:val="false"/>
+                <w:sz w:val="14"/>
+                <w:szCs w:val="14"/>
+              </w:rPr>
+              <w:t xml:space="preserve">kg</w:t>
+            </w:r>
+          </w:p>
+        </w:tc>
+        <w:tc>
+          <w:tcPr>
+            <w:tcW w:type="dxa" w:w="1134"/>
+            <w:tcBorders>
+              <w:top w:val="single" w:color="808080" w:sz="4"/>
+              <w:left w:val="single" w:color="808080" w:sz="4"/>
+              <w:bottom w:val="single" w:color="808080" w:sz="4"/>
+              <w:right w:val="single" w:color="808080" w:sz="4"/>
+            </w:tcBorders>
+            <w:tcMar>
+              <w:top w:type="dxa" w:w="40"/>
+              <w:left w:type="dxa" w:w="60"/>
+              <w:bottom w:type="dxa" w:w="40"/>
+              <w:right w:type="dxa" w:w="60"/>
+            </w:tcMar>
+            <w:vAlign w:val="top"/>
+          </w:tcPr>
+          <w:p>
+            <w:pPr>
+              <w:spacing w:after="0" w:before="0"/>
+              <w:jc w:val="right"/>
+            </w:pPr>
+            <w:r>
+              <w:rPr>
+                <w:rFonts w:ascii="Calibri" w:cs="Calibri" w:eastAsia="Calibri" w:hAnsi="Calibri"/>
+                <w:b w:val="false"/>
+                <w:bCs w:val="false"/>
+                <w:sz w:val="14"/>
+                <w:szCs w:val="14"/>
+              </w:rPr>
+              <w:t xml:space="preserve">361,200</w:t>
             </w:r>
           </w:p>
         </w:tc>

</xml_diff>

<commit_message>
Yayın: kablo tava sistemi hibe dışına alındı
Uygun harcama 290.859 Avro, eşiğe kalan pay 9.141 Avro (%3,05).
Tava projede duruyor, proforma 36 ile beyan ediliyor.

Co-Authored-By: Claude Opus 5 <noreply@anthropic.com>
Claude-Session: https://claude.ai/code/session_01HJPp6bx7wepUX5p8fxGcjg
</commit_message>
<xml_diff>
--- a/belgeler/27_KESIF_OZETI_EK_01_KUMES_A_BLOK.docx
+++ b/belgeler/27_KESIF_OZETI_EK_01_KUMES_A_BLOK.docx
@@ -7737,742 +7737,6 @@
                 <w:szCs w:val="14"/>
               </w:rPr>
               <w:t xml:space="preserve">1,000</w:t>
-            </w:r>
-          </w:p>
-        </w:tc>
-      </w:tr>
-      <w:tr>
-        <w:tc>
-          <w:tcPr>
-            <w:vMerge w:val="continue"/>
-            <w:tcBorders>
-              <w:top w:val="single" w:color="808080" w:sz="4"/>
-              <w:left w:val="single" w:color="808080" w:sz="4"/>
-              <w:bottom w:val="single" w:color="808080" w:sz="4"/>
-              <w:right w:val="single" w:color="808080" w:sz="4"/>
-            </w:tcBorders>
-          </w:tcPr>
-          <w:p/>
-        </w:tc>
-        <w:tc>
-          <w:tcPr>
-            <w:tcW w:type="dxa" w:w="454"/>
-            <w:tcBorders>
-              <w:top w:val="single" w:color="808080" w:sz="4"/>
-              <w:left w:val="single" w:color="808080" w:sz="4"/>
-              <w:bottom w:val="single" w:color="808080" w:sz="4"/>
-              <w:right w:val="single" w:color="808080" w:sz="4"/>
-            </w:tcBorders>
-            <w:tcMar>
-              <w:top w:type="dxa" w:w="40"/>
-              <w:left w:type="dxa" w:w="60"/>
-              <w:bottom w:type="dxa" w:w="40"/>
-              <w:right w:type="dxa" w:w="60"/>
-            </w:tcMar>
-            <w:vAlign w:val="top"/>
-          </w:tcPr>
-          <w:p>
-            <w:pPr>
-              <w:spacing w:after="0" w:before="0"/>
-              <w:jc w:val="center"/>
-            </w:pPr>
-            <w:r>
-              <w:rPr>
-                <w:rFonts w:ascii="Calibri" w:cs="Calibri" w:eastAsia="Calibri" w:hAnsi="Calibri"/>
-                <w:b w:val="false"/>
-                <w:bCs w:val="false"/>
-                <w:sz w:val="14"/>
-                <w:szCs w:val="14"/>
-              </w:rPr>
-              <w:t xml:space="preserve">16</w:t>
-            </w:r>
-          </w:p>
-        </w:tc>
-        <w:tc>
-          <w:tcPr>
-            <w:tcW w:type="dxa" w:w="1134"/>
-            <w:tcBorders>
-              <w:top w:val="single" w:color="808080" w:sz="4"/>
-              <w:left w:val="single" w:color="808080" w:sz="4"/>
-              <w:bottom w:val="single" w:color="808080" w:sz="4"/>
-              <w:right w:val="single" w:color="808080" w:sz="4"/>
-            </w:tcBorders>
-            <w:tcMar>
-              <w:top w:type="dxa" w:w="40"/>
-              <w:left w:type="dxa" w:w="60"/>
-              <w:bottom w:type="dxa" w:w="40"/>
-              <w:right w:type="dxa" w:w="60"/>
-            </w:tcMar>
-            <w:vAlign w:val="top"/>
-          </w:tcPr>
-          <w:p>
-            <w:pPr>
-              <w:spacing w:after="0" w:before="0"/>
-              <w:jc w:val="center"/>
-            </w:pPr>
-            <w:r>
-              <w:rPr>
-                <w:rFonts w:ascii="Calibri" w:cs="Calibri" w:eastAsia="Calibri" w:hAnsi="Calibri"/>
-                <w:b w:val="false"/>
-                <w:bCs w:val="false"/>
-                <w:sz w:val="14"/>
-                <w:szCs w:val="14"/>
-              </w:rPr>
-              <w:t xml:space="preserve">35.190.1100</w:t>
-            </w:r>
-          </w:p>
-        </w:tc>
-        <w:tc>
-          <w:tcPr>
-            <w:tcW w:type="dxa" w:w="5102"/>
-            <w:tcBorders>
-              <w:top w:val="single" w:color="808080" w:sz="4"/>
-              <w:left w:val="single" w:color="808080" w:sz="4"/>
-              <w:bottom w:val="single" w:color="808080" w:sz="4"/>
-              <w:right w:val="single" w:color="808080" w:sz="4"/>
-            </w:tcBorders>
-            <w:tcMar>
-              <w:top w:type="dxa" w:w="40"/>
-              <w:left w:type="dxa" w:w="60"/>
-              <w:bottom w:type="dxa" w:w="40"/>
-              <w:right w:type="dxa" w:w="60"/>
-            </w:tcMar>
-            <w:vAlign w:val="top"/>
-          </w:tcPr>
-          <w:p>
-            <w:pPr>
-              <w:spacing w:after="0" w:before="0"/>
-              <w:jc w:val="left"/>
-            </w:pPr>
-            <w:r>
-              <w:rPr>
-                <w:rFonts w:ascii="Calibri" w:cs="Calibri" w:eastAsia="Calibri" w:hAnsi="Calibri"/>
-                <w:b w:val="false"/>
-                <w:bCs w:val="false"/>
-                <w:sz w:val="14"/>
-                <w:szCs w:val="14"/>
-              </w:rPr>
-              <w:t xml:space="preserve">Kablo tava sistemleri — 200x60x1,0 mm sıcak daldırma galvanizli perfore kablo tavası (malzeme) (%25 müteahhit kârı dahil)</w:t>
-            </w:r>
-          </w:p>
-        </w:tc>
-        <w:tc>
-          <w:tcPr>
-            <w:tcW w:type="dxa" w:w="680"/>
-            <w:tcBorders>
-              <w:top w:val="single" w:color="808080" w:sz="4"/>
-              <w:left w:val="single" w:color="808080" w:sz="4"/>
-              <w:bottom w:val="single" w:color="808080" w:sz="4"/>
-              <w:right w:val="single" w:color="808080" w:sz="4"/>
-            </w:tcBorders>
-            <w:tcMar>
-              <w:top w:type="dxa" w:w="40"/>
-              <w:left w:type="dxa" w:w="60"/>
-              <w:bottom w:type="dxa" w:w="40"/>
-              <w:right w:type="dxa" w:w="60"/>
-            </w:tcMar>
-            <w:vAlign w:val="top"/>
-          </w:tcPr>
-          <w:p>
-            <w:pPr>
-              <w:spacing w:after="0" w:before="0"/>
-              <w:jc w:val="center"/>
-            </w:pPr>
-            <w:r>
-              <w:rPr>
-                <w:rFonts w:ascii="Calibri" w:cs="Calibri" w:eastAsia="Calibri" w:hAnsi="Calibri"/>
-                <w:b w:val="false"/>
-                <w:bCs w:val="false"/>
-                <w:sz w:val="14"/>
-                <w:szCs w:val="14"/>
-              </w:rPr>
-              <w:t xml:space="preserve">kg</w:t>
-            </w:r>
-          </w:p>
-        </w:tc>
-        <w:tc>
-          <w:tcPr>
-            <w:tcW w:type="dxa" w:w="1134"/>
-            <w:tcBorders>
-              <w:top w:val="single" w:color="808080" w:sz="4"/>
-              <w:left w:val="single" w:color="808080" w:sz="4"/>
-              <w:bottom w:val="single" w:color="808080" w:sz="4"/>
-              <w:right w:val="single" w:color="808080" w:sz="4"/>
-            </w:tcBorders>
-            <w:tcMar>
-              <w:top w:type="dxa" w:w="40"/>
-              <w:left w:type="dxa" w:w="60"/>
-              <w:bottom w:type="dxa" w:w="40"/>
-              <w:right w:type="dxa" w:w="60"/>
-            </w:tcMar>
-            <w:vAlign w:val="top"/>
-          </w:tcPr>
-          <w:p>
-            <w:pPr>
-              <w:spacing w:after="0" w:before="0"/>
-              <w:jc w:val="right"/>
-            </w:pPr>
-            <w:r>
-              <w:rPr>
-                <w:rFonts w:ascii="Calibri" w:cs="Calibri" w:eastAsia="Calibri" w:hAnsi="Calibri"/>
-                <w:b w:val="false"/>
-                <w:bCs w:val="false"/>
-                <w:sz w:val="14"/>
-                <w:szCs w:val="14"/>
-              </w:rPr>
-              <w:t xml:space="preserve">502,000</w:t>
-            </w:r>
-          </w:p>
-        </w:tc>
-      </w:tr>
-      <w:tr>
-        <w:tc>
-          <w:tcPr>
-            <w:vMerge w:val="continue"/>
-            <w:tcBorders>
-              <w:top w:val="single" w:color="808080" w:sz="4"/>
-              <w:left w:val="single" w:color="808080" w:sz="4"/>
-              <w:bottom w:val="single" w:color="808080" w:sz="4"/>
-              <w:right w:val="single" w:color="808080" w:sz="4"/>
-            </w:tcBorders>
-          </w:tcPr>
-          <w:p/>
-        </w:tc>
-        <w:tc>
-          <w:tcPr>
-            <w:tcW w:type="dxa" w:w="454"/>
-            <w:tcBorders>
-              <w:top w:val="single" w:color="808080" w:sz="4"/>
-              <w:left w:val="single" w:color="808080" w:sz="4"/>
-              <w:bottom w:val="single" w:color="808080" w:sz="4"/>
-              <w:right w:val="single" w:color="808080" w:sz="4"/>
-            </w:tcBorders>
-            <w:tcMar>
-              <w:top w:type="dxa" w:w="40"/>
-              <w:left w:type="dxa" w:w="60"/>
-              <w:bottom w:type="dxa" w:w="40"/>
-              <w:right w:type="dxa" w:w="60"/>
-            </w:tcMar>
-            <w:vAlign w:val="top"/>
-          </w:tcPr>
-          <w:p>
-            <w:pPr>
-              <w:spacing w:after="0" w:before="0"/>
-              <w:jc w:val="center"/>
-            </w:pPr>
-            <w:r>
-              <w:rPr>
-                <w:rFonts w:ascii="Calibri" w:cs="Calibri" w:eastAsia="Calibri" w:hAnsi="Calibri"/>
-                <w:b w:val="false"/>
-                <w:bCs w:val="false"/>
-                <w:sz w:val="14"/>
-                <w:szCs w:val="14"/>
-              </w:rPr>
-              <w:t xml:space="preserve">17</w:t>
-            </w:r>
-          </w:p>
-        </w:tc>
-        <w:tc>
-          <w:tcPr>
-            <w:tcW w:type="dxa" w:w="1134"/>
-            <w:tcBorders>
-              <w:top w:val="single" w:color="808080" w:sz="4"/>
-              <w:left w:val="single" w:color="808080" w:sz="4"/>
-              <w:bottom w:val="single" w:color="808080" w:sz="4"/>
-              <w:right w:val="single" w:color="808080" w:sz="4"/>
-            </w:tcBorders>
-            <w:tcMar>
-              <w:top w:type="dxa" w:w="40"/>
-              <w:left w:type="dxa" w:w="60"/>
-              <w:bottom w:type="dxa" w:w="40"/>
-              <w:right w:type="dxa" w:w="60"/>
-            </w:tcMar>
-            <w:vAlign w:val="top"/>
-          </w:tcPr>
-          <w:p>
-            <w:pPr>
-              <w:spacing w:after="0" w:before="0"/>
-              <w:jc w:val="center"/>
-            </w:pPr>
-            <w:r>
-              <w:rPr>
-                <w:rFonts w:ascii="Calibri" w:cs="Calibri" w:eastAsia="Calibri" w:hAnsi="Calibri"/>
-                <w:b w:val="false"/>
-                <w:bCs w:val="false"/>
-                <w:sz w:val="14"/>
-                <w:szCs w:val="14"/>
-              </w:rPr>
-              <w:t xml:space="preserve">35.190.1100 (montaj)</w:t>
-            </w:r>
-          </w:p>
-        </w:tc>
-        <w:tc>
-          <w:tcPr>
-            <w:tcW w:type="dxa" w:w="5102"/>
-            <w:tcBorders>
-              <w:top w:val="single" w:color="808080" w:sz="4"/>
-              <w:left w:val="single" w:color="808080" w:sz="4"/>
-              <w:bottom w:val="single" w:color="808080" w:sz="4"/>
-              <w:right w:val="single" w:color="808080" w:sz="4"/>
-            </w:tcBorders>
-            <w:tcMar>
-              <w:top w:type="dxa" w:w="40"/>
-              <w:left w:type="dxa" w:w="60"/>
-              <w:bottom w:type="dxa" w:w="40"/>
-              <w:right w:type="dxa" w:w="60"/>
-            </w:tcMar>
-            <w:vAlign w:val="top"/>
-          </w:tcPr>
-          <w:p>
-            <w:pPr>
-              <w:spacing w:after="0" w:before="0"/>
-              <w:jc w:val="left"/>
-            </w:pPr>
-            <w:r>
-              <w:rPr>
-                <w:rFonts w:ascii="Calibri" w:cs="Calibri" w:eastAsia="Calibri" w:hAnsi="Calibri"/>
-                <w:b w:val="false"/>
-                <w:bCs w:val="false"/>
-                <w:sz w:val="14"/>
-                <w:szCs w:val="14"/>
-              </w:rPr>
-              <w:t xml:space="preserve">Kablo tava sistemlerinin montajı — askı ve konsollarla tavana veya duvara tespiti; ek parça, konsol, askı tiji, vida ve somun bedelleri dâhildir, ayrıca ödenmez</w:t>
-            </w:r>
-          </w:p>
-        </w:tc>
-        <w:tc>
-          <w:tcPr>
-            <w:tcW w:type="dxa" w:w="680"/>
-            <w:tcBorders>
-              <w:top w:val="single" w:color="808080" w:sz="4"/>
-              <w:left w:val="single" w:color="808080" w:sz="4"/>
-              <w:bottom w:val="single" w:color="808080" w:sz="4"/>
-              <w:right w:val="single" w:color="808080" w:sz="4"/>
-            </w:tcBorders>
-            <w:tcMar>
-              <w:top w:type="dxa" w:w="40"/>
-              <w:left w:type="dxa" w:w="60"/>
-              <w:bottom w:type="dxa" w:w="40"/>
-              <w:right w:type="dxa" w:w="60"/>
-            </w:tcMar>
-            <w:vAlign w:val="top"/>
-          </w:tcPr>
-          <w:p>
-            <w:pPr>
-              <w:spacing w:after="0" w:before="0"/>
-              <w:jc w:val="center"/>
-            </w:pPr>
-            <w:r>
-              <w:rPr>
-                <w:rFonts w:ascii="Calibri" w:cs="Calibri" w:eastAsia="Calibri" w:hAnsi="Calibri"/>
-                <w:b w:val="false"/>
-                <w:bCs w:val="false"/>
-                <w:sz w:val="14"/>
-                <w:szCs w:val="14"/>
-              </w:rPr>
-              <w:t xml:space="preserve">kg</w:t>
-            </w:r>
-          </w:p>
-        </w:tc>
-        <w:tc>
-          <w:tcPr>
-            <w:tcW w:type="dxa" w:w="1134"/>
-            <w:tcBorders>
-              <w:top w:val="single" w:color="808080" w:sz="4"/>
-              <w:left w:val="single" w:color="808080" w:sz="4"/>
-              <w:bottom w:val="single" w:color="808080" w:sz="4"/>
-              <w:right w:val="single" w:color="808080" w:sz="4"/>
-            </w:tcBorders>
-            <w:tcMar>
-              <w:top w:type="dxa" w:w="40"/>
-              <w:left w:type="dxa" w:w="60"/>
-              <w:bottom w:type="dxa" w:w="40"/>
-              <w:right w:type="dxa" w:w="60"/>
-            </w:tcMar>
-            <w:vAlign w:val="top"/>
-          </w:tcPr>
-          <w:p>
-            <w:pPr>
-              <w:spacing w:after="0" w:before="0"/>
-              <w:jc w:val="right"/>
-            </w:pPr>
-            <w:r>
-              <w:rPr>
-                <w:rFonts w:ascii="Calibri" w:cs="Calibri" w:eastAsia="Calibri" w:hAnsi="Calibri"/>
-                <w:b w:val="false"/>
-                <w:bCs w:val="false"/>
-                <w:sz w:val="14"/>
-                <w:szCs w:val="14"/>
-              </w:rPr>
-              <w:t xml:space="preserve">502,000</w:t>
-            </w:r>
-          </w:p>
-        </w:tc>
-      </w:tr>
-      <w:tr>
-        <w:tc>
-          <w:tcPr>
-            <w:vMerge w:val="continue"/>
-            <w:tcBorders>
-              <w:top w:val="single" w:color="808080" w:sz="4"/>
-              <w:left w:val="single" w:color="808080" w:sz="4"/>
-              <w:bottom w:val="single" w:color="808080" w:sz="4"/>
-              <w:right w:val="single" w:color="808080" w:sz="4"/>
-            </w:tcBorders>
-          </w:tcPr>
-          <w:p/>
-        </w:tc>
-        <w:tc>
-          <w:tcPr>
-            <w:tcW w:type="dxa" w:w="454"/>
-            <w:tcBorders>
-              <w:top w:val="single" w:color="808080" w:sz="4"/>
-              <w:left w:val="single" w:color="808080" w:sz="4"/>
-              <w:bottom w:val="single" w:color="808080" w:sz="4"/>
-              <w:right w:val="single" w:color="808080" w:sz="4"/>
-            </w:tcBorders>
-            <w:tcMar>
-              <w:top w:type="dxa" w:w="40"/>
-              <w:left w:type="dxa" w:w="60"/>
-              <w:bottom w:type="dxa" w:w="40"/>
-              <w:right w:type="dxa" w:w="60"/>
-            </w:tcMar>
-            <w:vAlign w:val="top"/>
-          </w:tcPr>
-          <w:p>
-            <w:pPr>
-              <w:spacing w:after="0" w:before="0"/>
-              <w:jc w:val="center"/>
-            </w:pPr>
-            <w:r>
-              <w:rPr>
-                <w:rFonts w:ascii="Calibri" w:cs="Calibri" w:eastAsia="Calibri" w:hAnsi="Calibri"/>
-                <w:b w:val="false"/>
-                <w:bCs w:val="false"/>
-                <w:sz w:val="14"/>
-                <w:szCs w:val="14"/>
-              </w:rPr>
-              <w:t xml:space="preserve">18</w:t>
-            </w:r>
-          </w:p>
-        </w:tc>
-        <w:tc>
-          <w:tcPr>
-            <w:tcW w:type="dxa" w:w="1134"/>
-            <w:tcBorders>
-              <w:top w:val="single" w:color="808080" w:sz="4"/>
-              <w:left w:val="single" w:color="808080" w:sz="4"/>
-              <w:bottom w:val="single" w:color="808080" w:sz="4"/>
-              <w:right w:val="single" w:color="808080" w:sz="4"/>
-            </w:tcBorders>
-            <w:tcMar>
-              <w:top w:type="dxa" w:w="40"/>
-              <w:left w:type="dxa" w:w="60"/>
-              <w:bottom w:type="dxa" w:w="40"/>
-              <w:right w:type="dxa" w:w="60"/>
-            </w:tcMar>
-            <w:vAlign w:val="top"/>
-          </w:tcPr>
-          <w:p>
-            <w:pPr>
-              <w:spacing w:after="0" w:before="0"/>
-              <w:jc w:val="center"/>
-            </w:pPr>
-            <w:r>
-              <w:rPr>
-                <w:rFonts w:ascii="Calibri" w:cs="Calibri" w:eastAsia="Calibri" w:hAnsi="Calibri"/>
-                <w:b w:val="false"/>
-                <w:bCs w:val="false"/>
-                <w:sz w:val="14"/>
-                <w:szCs w:val="14"/>
-              </w:rPr>
-              <w:t xml:space="preserve">35.190.1101</w:t>
-            </w:r>
-          </w:p>
-        </w:tc>
-        <w:tc>
-          <w:tcPr>
-            <w:tcW w:type="dxa" w:w="5102"/>
-            <w:tcBorders>
-              <w:top w:val="single" w:color="808080" w:sz="4"/>
-              <w:left w:val="single" w:color="808080" w:sz="4"/>
-              <w:bottom w:val="single" w:color="808080" w:sz="4"/>
-              <w:right w:val="single" w:color="808080" w:sz="4"/>
-            </w:tcBorders>
-            <w:tcMar>
-              <w:top w:type="dxa" w:w="40"/>
-              <w:left w:type="dxa" w:w="60"/>
-              <w:bottom w:type="dxa" w:w="40"/>
-              <w:right w:type="dxa" w:w="60"/>
-            </w:tcMar>
-            <w:vAlign w:val="top"/>
-          </w:tcPr>
-          <w:p>
-            <w:pPr>
-              <w:spacing w:after="0" w:before="0"/>
-              <w:jc w:val="left"/>
-            </w:pPr>
-            <w:r>
-              <w:rPr>
-                <w:rFonts w:ascii="Calibri" w:cs="Calibri" w:eastAsia="Calibri" w:hAnsi="Calibri"/>
-                <w:b w:val="false"/>
-                <w:bCs w:val="false"/>
-                <w:sz w:val="14"/>
-                <w:szCs w:val="14"/>
-              </w:rPr>
-              <w:t xml:space="preserve">Kablo tava sistemleri kapak sacı — 35.190.1100 pozuna uygun özellikte, 1,0 mm sıcak daldırma galvanizli (malzeme) (%25 müteahhit kârı dahil)</w:t>
-            </w:r>
-          </w:p>
-        </w:tc>
-        <w:tc>
-          <w:tcPr>
-            <w:tcW w:type="dxa" w:w="680"/>
-            <w:tcBorders>
-              <w:top w:val="single" w:color="808080" w:sz="4"/>
-              <w:left w:val="single" w:color="808080" w:sz="4"/>
-              <w:bottom w:val="single" w:color="808080" w:sz="4"/>
-              <w:right w:val="single" w:color="808080" w:sz="4"/>
-            </w:tcBorders>
-            <w:tcMar>
-              <w:top w:type="dxa" w:w="40"/>
-              <w:left w:type="dxa" w:w="60"/>
-              <w:bottom w:type="dxa" w:w="40"/>
-              <w:right w:type="dxa" w:w="60"/>
-            </w:tcMar>
-            <w:vAlign w:val="top"/>
-          </w:tcPr>
-          <w:p>
-            <w:pPr>
-              <w:spacing w:after="0" w:before="0"/>
-              <w:jc w:val="center"/>
-            </w:pPr>
-            <w:r>
-              <w:rPr>
-                <w:rFonts w:ascii="Calibri" w:cs="Calibri" w:eastAsia="Calibri" w:hAnsi="Calibri"/>
-                <w:b w:val="false"/>
-                <w:bCs w:val="false"/>
-                <w:sz w:val="14"/>
-                <w:szCs w:val="14"/>
-              </w:rPr>
-              <w:t xml:space="preserve">kg</w:t>
-            </w:r>
-          </w:p>
-        </w:tc>
-        <w:tc>
-          <w:tcPr>
-            <w:tcW w:type="dxa" w:w="1134"/>
-            <w:tcBorders>
-              <w:top w:val="single" w:color="808080" w:sz="4"/>
-              <w:left w:val="single" w:color="808080" w:sz="4"/>
-              <w:bottom w:val="single" w:color="808080" w:sz="4"/>
-              <w:right w:val="single" w:color="808080" w:sz="4"/>
-            </w:tcBorders>
-            <w:tcMar>
-              <w:top w:type="dxa" w:w="40"/>
-              <w:left w:type="dxa" w:w="60"/>
-              <w:bottom w:type="dxa" w:w="40"/>
-              <w:right w:type="dxa" w:w="60"/>
-            </w:tcMar>
-            <w:vAlign w:val="top"/>
-          </w:tcPr>
-          <w:p>
-            <w:pPr>
-              <w:spacing w:after="0" w:before="0"/>
-              <w:jc w:val="right"/>
-            </w:pPr>
-            <w:r>
-              <w:rPr>
-                <w:rFonts w:ascii="Calibri" w:cs="Calibri" w:eastAsia="Calibri" w:hAnsi="Calibri"/>
-                <w:b w:val="false"/>
-                <w:bCs w:val="false"/>
-                <w:sz w:val="14"/>
-                <w:szCs w:val="14"/>
-              </w:rPr>
-              <w:t xml:space="preserve">361,200</w:t>
-            </w:r>
-          </w:p>
-        </w:tc>
-      </w:tr>
-      <w:tr>
-        <w:tc>
-          <w:tcPr>
-            <w:vMerge w:val="continue"/>
-            <w:tcBorders>
-              <w:top w:val="single" w:color="808080" w:sz="4"/>
-              <w:left w:val="single" w:color="808080" w:sz="4"/>
-              <w:bottom w:val="single" w:color="808080" w:sz="4"/>
-              <w:right w:val="single" w:color="808080" w:sz="4"/>
-            </w:tcBorders>
-          </w:tcPr>
-          <w:p/>
-        </w:tc>
-        <w:tc>
-          <w:tcPr>
-            <w:tcW w:type="dxa" w:w="454"/>
-            <w:tcBorders>
-              <w:top w:val="single" w:color="808080" w:sz="4"/>
-              <w:left w:val="single" w:color="808080" w:sz="4"/>
-              <w:bottom w:val="single" w:color="808080" w:sz="4"/>
-              <w:right w:val="single" w:color="808080" w:sz="4"/>
-            </w:tcBorders>
-            <w:tcMar>
-              <w:top w:type="dxa" w:w="40"/>
-              <w:left w:type="dxa" w:w="60"/>
-              <w:bottom w:type="dxa" w:w="40"/>
-              <w:right w:type="dxa" w:w="60"/>
-            </w:tcMar>
-            <w:vAlign w:val="top"/>
-          </w:tcPr>
-          <w:p>
-            <w:pPr>
-              <w:spacing w:after="0" w:before="0"/>
-              <w:jc w:val="center"/>
-            </w:pPr>
-            <w:r>
-              <w:rPr>
-                <w:rFonts w:ascii="Calibri" w:cs="Calibri" w:eastAsia="Calibri" w:hAnsi="Calibri"/>
-                <w:b w:val="false"/>
-                <w:bCs w:val="false"/>
-                <w:sz w:val="14"/>
-                <w:szCs w:val="14"/>
-              </w:rPr>
-              <w:t xml:space="preserve">19</w:t>
-            </w:r>
-          </w:p>
-        </w:tc>
-        <w:tc>
-          <w:tcPr>
-            <w:tcW w:type="dxa" w:w="1134"/>
-            <w:tcBorders>
-              <w:top w:val="single" w:color="808080" w:sz="4"/>
-              <w:left w:val="single" w:color="808080" w:sz="4"/>
-              <w:bottom w:val="single" w:color="808080" w:sz="4"/>
-              <w:right w:val="single" w:color="808080" w:sz="4"/>
-            </w:tcBorders>
-            <w:tcMar>
-              <w:top w:type="dxa" w:w="40"/>
-              <w:left w:type="dxa" w:w="60"/>
-              <w:bottom w:type="dxa" w:w="40"/>
-              <w:right w:type="dxa" w:w="60"/>
-            </w:tcMar>
-            <w:vAlign w:val="top"/>
-          </w:tcPr>
-          <w:p>
-            <w:pPr>
-              <w:spacing w:after="0" w:before="0"/>
-              <w:jc w:val="center"/>
-            </w:pPr>
-            <w:r>
-              <w:rPr>
-                <w:rFonts w:ascii="Calibri" w:cs="Calibri" w:eastAsia="Calibri" w:hAnsi="Calibri"/>
-                <w:b w:val="false"/>
-                <w:bCs w:val="false"/>
-                <w:sz w:val="14"/>
-                <w:szCs w:val="14"/>
-              </w:rPr>
-              <w:t xml:space="preserve">35.190.1101 (montaj)</w:t>
-            </w:r>
-          </w:p>
-        </w:tc>
-        <w:tc>
-          <w:tcPr>
-            <w:tcW w:type="dxa" w:w="5102"/>
-            <w:tcBorders>
-              <w:top w:val="single" w:color="808080" w:sz="4"/>
-              <w:left w:val="single" w:color="808080" w:sz="4"/>
-              <w:bottom w:val="single" w:color="808080" w:sz="4"/>
-              <w:right w:val="single" w:color="808080" w:sz="4"/>
-            </w:tcBorders>
-            <w:tcMar>
-              <w:top w:type="dxa" w:w="40"/>
-              <w:left w:type="dxa" w:w="60"/>
-              <w:bottom w:type="dxa" w:w="40"/>
-              <w:right w:type="dxa" w:w="60"/>
-            </w:tcMar>
-            <w:vAlign w:val="top"/>
-          </w:tcPr>
-          <w:p>
-            <w:pPr>
-              <w:spacing w:after="0" w:before="0"/>
-              <w:jc w:val="left"/>
-            </w:pPr>
-            <w:r>
-              <w:rPr>
-                <w:rFonts w:ascii="Calibri" w:cs="Calibri" w:eastAsia="Calibri" w:hAnsi="Calibri"/>
-                <w:b w:val="false"/>
-                <w:bCs w:val="false"/>
-                <w:sz w:val="14"/>
-                <w:szCs w:val="14"/>
-              </w:rPr>
-              <w:t xml:space="preserve">Kablo tava sistemleri kapak sacının montajı — onaylı projesinde belirtilen kanalların kapatılması; her türlü işçilik ve malzeme dâhil, işler hâlde teslim</w:t>
-            </w:r>
-          </w:p>
-        </w:tc>
-        <w:tc>
-          <w:tcPr>
-            <w:tcW w:type="dxa" w:w="680"/>
-            <w:tcBorders>
-              <w:top w:val="single" w:color="808080" w:sz="4"/>
-              <w:left w:val="single" w:color="808080" w:sz="4"/>
-              <w:bottom w:val="single" w:color="808080" w:sz="4"/>
-              <w:right w:val="single" w:color="808080" w:sz="4"/>
-            </w:tcBorders>
-            <w:tcMar>
-              <w:top w:type="dxa" w:w="40"/>
-              <w:left w:type="dxa" w:w="60"/>
-              <w:bottom w:type="dxa" w:w="40"/>
-              <w:right w:type="dxa" w:w="60"/>
-            </w:tcMar>
-            <w:vAlign w:val="top"/>
-          </w:tcPr>
-          <w:p>
-            <w:pPr>
-              <w:spacing w:after="0" w:before="0"/>
-              <w:jc w:val="center"/>
-            </w:pPr>
-            <w:r>
-              <w:rPr>
-                <w:rFonts w:ascii="Calibri" w:cs="Calibri" w:eastAsia="Calibri" w:hAnsi="Calibri"/>
-                <w:b w:val="false"/>
-                <w:bCs w:val="false"/>
-                <w:sz w:val="14"/>
-                <w:szCs w:val="14"/>
-              </w:rPr>
-              <w:t xml:space="preserve">kg</w:t>
-            </w:r>
-          </w:p>
-        </w:tc>
-        <w:tc>
-          <w:tcPr>
-            <w:tcW w:type="dxa" w:w="1134"/>
-            <w:tcBorders>
-              <w:top w:val="single" w:color="808080" w:sz="4"/>
-              <w:left w:val="single" w:color="808080" w:sz="4"/>
-              <w:bottom w:val="single" w:color="808080" w:sz="4"/>
-              <w:right w:val="single" w:color="808080" w:sz="4"/>
-            </w:tcBorders>
-            <w:tcMar>
-              <w:top w:type="dxa" w:w="40"/>
-              <w:left w:type="dxa" w:w="60"/>
-              <w:bottom w:type="dxa" w:w="40"/>
-              <w:right w:type="dxa" w:w="60"/>
-            </w:tcMar>
-            <w:vAlign w:val="top"/>
-          </w:tcPr>
-          <w:p>
-            <w:pPr>
-              <w:spacing w:after="0" w:before="0"/>
-              <w:jc w:val="right"/>
-            </w:pPr>
-            <w:r>
-              <w:rPr>
-                <w:rFonts w:ascii="Calibri" w:cs="Calibri" w:eastAsia="Calibri" w:hAnsi="Calibri"/>
-                <w:b w:val="false"/>
-                <w:bCs w:val="false"/>
-                <w:sz w:val="14"/>
-                <w:szCs w:val="14"/>
-              </w:rPr>
-              <w:t xml:space="preserve">361,200</w:t>
             </w:r>
           </w:p>
         </w:tc>

</xml_diff>

<commit_message>
Yayın: uygun harcama 298.994 Avro — kablo kanalı eklendi
Tava sistemi kapsama geri alındı, sıva üstü PVC kablo kanalı
(30.190.1304, 123 m/blok) eklendi. Eşiğe kalan pay 1.006 Avro.

Co-Authored-By: Claude Opus 5 <noreply@anthropic.com>
Claude-Session: https://claude.ai/code/session_01HJPp6bx7wepUX5p8fxGcjg
</commit_message>
<xml_diff>
--- a/belgeler/27_KESIF_OZETI_EK_01_KUMES_A_BLOK.docx
+++ b/belgeler/27_KESIF_OZETI_EK_01_KUMES_A_BLOK.docx
@@ -7737,6 +7737,926 @@
                 <w:szCs w:val="14"/>
               </w:rPr>
               <w:t xml:space="preserve">1,000</w:t>
+            </w:r>
+          </w:p>
+        </w:tc>
+      </w:tr>
+      <w:tr>
+        <w:tc>
+          <w:tcPr>
+            <w:vMerge w:val="continue"/>
+            <w:tcBorders>
+              <w:top w:val="single" w:color="808080" w:sz="4"/>
+              <w:left w:val="single" w:color="808080" w:sz="4"/>
+              <w:bottom w:val="single" w:color="808080" w:sz="4"/>
+              <w:right w:val="single" w:color="808080" w:sz="4"/>
+            </w:tcBorders>
+          </w:tcPr>
+          <w:p/>
+        </w:tc>
+        <w:tc>
+          <w:tcPr>
+            <w:tcW w:type="dxa" w:w="454"/>
+            <w:tcBorders>
+              <w:top w:val="single" w:color="808080" w:sz="4"/>
+              <w:left w:val="single" w:color="808080" w:sz="4"/>
+              <w:bottom w:val="single" w:color="808080" w:sz="4"/>
+              <w:right w:val="single" w:color="808080" w:sz="4"/>
+            </w:tcBorders>
+            <w:tcMar>
+              <w:top w:type="dxa" w:w="40"/>
+              <w:left w:type="dxa" w:w="60"/>
+              <w:bottom w:type="dxa" w:w="40"/>
+              <w:right w:type="dxa" w:w="60"/>
+            </w:tcMar>
+            <w:vAlign w:val="top"/>
+          </w:tcPr>
+          <w:p>
+            <w:pPr>
+              <w:spacing w:after="0" w:before="0"/>
+              <w:jc w:val="center"/>
+            </w:pPr>
+            <w:r>
+              <w:rPr>
+                <w:rFonts w:ascii="Calibri" w:cs="Calibri" w:eastAsia="Calibri" w:hAnsi="Calibri"/>
+                <w:b w:val="false"/>
+                <w:bCs w:val="false"/>
+                <w:sz w:val="14"/>
+                <w:szCs w:val="14"/>
+              </w:rPr>
+              <w:t xml:space="preserve">16</w:t>
+            </w:r>
+          </w:p>
+        </w:tc>
+        <w:tc>
+          <w:tcPr>
+            <w:tcW w:type="dxa" w:w="1134"/>
+            <w:tcBorders>
+              <w:top w:val="single" w:color="808080" w:sz="4"/>
+              <w:left w:val="single" w:color="808080" w:sz="4"/>
+              <w:bottom w:val="single" w:color="808080" w:sz="4"/>
+              <w:right w:val="single" w:color="808080" w:sz="4"/>
+            </w:tcBorders>
+            <w:tcMar>
+              <w:top w:type="dxa" w:w="40"/>
+              <w:left w:type="dxa" w:w="60"/>
+              <w:bottom w:type="dxa" w:w="40"/>
+              <w:right w:type="dxa" w:w="60"/>
+            </w:tcMar>
+            <w:vAlign w:val="top"/>
+          </w:tcPr>
+          <w:p>
+            <w:pPr>
+              <w:spacing w:after="0" w:before="0"/>
+              <w:jc w:val="center"/>
+            </w:pPr>
+            <w:r>
+              <w:rPr>
+                <w:rFonts w:ascii="Calibri" w:cs="Calibri" w:eastAsia="Calibri" w:hAnsi="Calibri"/>
+                <w:b w:val="false"/>
+                <w:bCs w:val="false"/>
+                <w:sz w:val="14"/>
+                <w:szCs w:val="14"/>
+              </w:rPr>
+              <w:t xml:space="preserve">35.190.1100</w:t>
+            </w:r>
+          </w:p>
+        </w:tc>
+        <w:tc>
+          <w:tcPr>
+            <w:tcW w:type="dxa" w:w="5102"/>
+            <w:tcBorders>
+              <w:top w:val="single" w:color="808080" w:sz="4"/>
+              <w:left w:val="single" w:color="808080" w:sz="4"/>
+              <w:bottom w:val="single" w:color="808080" w:sz="4"/>
+              <w:right w:val="single" w:color="808080" w:sz="4"/>
+            </w:tcBorders>
+            <w:tcMar>
+              <w:top w:type="dxa" w:w="40"/>
+              <w:left w:type="dxa" w:w="60"/>
+              <w:bottom w:type="dxa" w:w="40"/>
+              <w:right w:type="dxa" w:w="60"/>
+            </w:tcMar>
+            <w:vAlign w:val="top"/>
+          </w:tcPr>
+          <w:p>
+            <w:pPr>
+              <w:spacing w:after="0" w:before="0"/>
+              <w:jc w:val="left"/>
+            </w:pPr>
+            <w:r>
+              <w:rPr>
+                <w:rFonts w:ascii="Calibri" w:cs="Calibri" w:eastAsia="Calibri" w:hAnsi="Calibri"/>
+                <w:b w:val="false"/>
+                <w:bCs w:val="false"/>
+                <w:sz w:val="14"/>
+                <w:szCs w:val="14"/>
+              </w:rPr>
+              <w:t xml:space="preserve">Kablo tava sistemleri — 200x60x1,0 mm sıcak daldırma galvanizli perfore kablo tavası (malzeme) (%25 müteahhit kârı dahil)</w:t>
+            </w:r>
+          </w:p>
+        </w:tc>
+        <w:tc>
+          <w:tcPr>
+            <w:tcW w:type="dxa" w:w="680"/>
+            <w:tcBorders>
+              <w:top w:val="single" w:color="808080" w:sz="4"/>
+              <w:left w:val="single" w:color="808080" w:sz="4"/>
+              <w:bottom w:val="single" w:color="808080" w:sz="4"/>
+              <w:right w:val="single" w:color="808080" w:sz="4"/>
+            </w:tcBorders>
+            <w:tcMar>
+              <w:top w:type="dxa" w:w="40"/>
+              <w:left w:type="dxa" w:w="60"/>
+              <w:bottom w:type="dxa" w:w="40"/>
+              <w:right w:type="dxa" w:w="60"/>
+            </w:tcMar>
+            <w:vAlign w:val="top"/>
+          </w:tcPr>
+          <w:p>
+            <w:pPr>
+              <w:spacing w:after="0" w:before="0"/>
+              <w:jc w:val="center"/>
+            </w:pPr>
+            <w:r>
+              <w:rPr>
+                <w:rFonts w:ascii="Calibri" w:cs="Calibri" w:eastAsia="Calibri" w:hAnsi="Calibri"/>
+                <w:b w:val="false"/>
+                <w:bCs w:val="false"/>
+                <w:sz w:val="14"/>
+                <w:szCs w:val="14"/>
+              </w:rPr>
+              <w:t xml:space="preserve">kg</w:t>
+            </w:r>
+          </w:p>
+        </w:tc>
+        <w:tc>
+          <w:tcPr>
+            <w:tcW w:type="dxa" w:w="1134"/>
+            <w:tcBorders>
+              <w:top w:val="single" w:color="808080" w:sz="4"/>
+              <w:left w:val="single" w:color="808080" w:sz="4"/>
+              <w:bottom w:val="single" w:color="808080" w:sz="4"/>
+              <w:right w:val="single" w:color="808080" w:sz="4"/>
+            </w:tcBorders>
+            <w:tcMar>
+              <w:top w:type="dxa" w:w="40"/>
+              <w:left w:type="dxa" w:w="60"/>
+              <w:bottom w:type="dxa" w:w="40"/>
+              <w:right w:type="dxa" w:w="60"/>
+            </w:tcMar>
+            <w:vAlign w:val="top"/>
+          </w:tcPr>
+          <w:p>
+            <w:pPr>
+              <w:spacing w:after="0" w:before="0"/>
+              <w:jc w:val="right"/>
+            </w:pPr>
+            <w:r>
+              <w:rPr>
+                <w:rFonts w:ascii="Calibri" w:cs="Calibri" w:eastAsia="Calibri" w:hAnsi="Calibri"/>
+                <w:b w:val="false"/>
+                <w:bCs w:val="false"/>
+                <w:sz w:val="14"/>
+                <w:szCs w:val="14"/>
+              </w:rPr>
+              <w:t xml:space="preserve">502,000</w:t>
+            </w:r>
+          </w:p>
+        </w:tc>
+      </w:tr>
+      <w:tr>
+        <w:tc>
+          <w:tcPr>
+            <w:vMerge w:val="continue"/>
+            <w:tcBorders>
+              <w:top w:val="single" w:color="808080" w:sz="4"/>
+              <w:left w:val="single" w:color="808080" w:sz="4"/>
+              <w:bottom w:val="single" w:color="808080" w:sz="4"/>
+              <w:right w:val="single" w:color="808080" w:sz="4"/>
+            </w:tcBorders>
+          </w:tcPr>
+          <w:p/>
+        </w:tc>
+        <w:tc>
+          <w:tcPr>
+            <w:tcW w:type="dxa" w:w="454"/>
+            <w:tcBorders>
+              <w:top w:val="single" w:color="808080" w:sz="4"/>
+              <w:left w:val="single" w:color="808080" w:sz="4"/>
+              <w:bottom w:val="single" w:color="808080" w:sz="4"/>
+              <w:right w:val="single" w:color="808080" w:sz="4"/>
+            </w:tcBorders>
+            <w:tcMar>
+              <w:top w:type="dxa" w:w="40"/>
+              <w:left w:type="dxa" w:w="60"/>
+              <w:bottom w:type="dxa" w:w="40"/>
+              <w:right w:type="dxa" w:w="60"/>
+            </w:tcMar>
+            <w:vAlign w:val="top"/>
+          </w:tcPr>
+          <w:p>
+            <w:pPr>
+              <w:spacing w:after="0" w:before="0"/>
+              <w:jc w:val="center"/>
+            </w:pPr>
+            <w:r>
+              <w:rPr>
+                <w:rFonts w:ascii="Calibri" w:cs="Calibri" w:eastAsia="Calibri" w:hAnsi="Calibri"/>
+                <w:b w:val="false"/>
+                <w:bCs w:val="false"/>
+                <w:sz w:val="14"/>
+                <w:szCs w:val="14"/>
+              </w:rPr>
+              <w:t xml:space="preserve">17</w:t>
+            </w:r>
+          </w:p>
+        </w:tc>
+        <w:tc>
+          <w:tcPr>
+            <w:tcW w:type="dxa" w:w="1134"/>
+            <w:tcBorders>
+              <w:top w:val="single" w:color="808080" w:sz="4"/>
+              <w:left w:val="single" w:color="808080" w:sz="4"/>
+              <w:bottom w:val="single" w:color="808080" w:sz="4"/>
+              <w:right w:val="single" w:color="808080" w:sz="4"/>
+            </w:tcBorders>
+            <w:tcMar>
+              <w:top w:type="dxa" w:w="40"/>
+              <w:left w:type="dxa" w:w="60"/>
+              <w:bottom w:type="dxa" w:w="40"/>
+              <w:right w:type="dxa" w:w="60"/>
+            </w:tcMar>
+            <w:vAlign w:val="top"/>
+          </w:tcPr>
+          <w:p>
+            <w:pPr>
+              <w:spacing w:after="0" w:before="0"/>
+              <w:jc w:val="center"/>
+            </w:pPr>
+            <w:r>
+              <w:rPr>
+                <w:rFonts w:ascii="Calibri" w:cs="Calibri" w:eastAsia="Calibri" w:hAnsi="Calibri"/>
+                <w:b w:val="false"/>
+                <w:bCs w:val="false"/>
+                <w:sz w:val="14"/>
+                <w:szCs w:val="14"/>
+              </w:rPr>
+              <w:t xml:space="preserve">35.190.1100 (montaj)</w:t>
+            </w:r>
+          </w:p>
+        </w:tc>
+        <w:tc>
+          <w:tcPr>
+            <w:tcW w:type="dxa" w:w="5102"/>
+            <w:tcBorders>
+              <w:top w:val="single" w:color="808080" w:sz="4"/>
+              <w:left w:val="single" w:color="808080" w:sz="4"/>
+              <w:bottom w:val="single" w:color="808080" w:sz="4"/>
+              <w:right w:val="single" w:color="808080" w:sz="4"/>
+            </w:tcBorders>
+            <w:tcMar>
+              <w:top w:type="dxa" w:w="40"/>
+              <w:left w:type="dxa" w:w="60"/>
+              <w:bottom w:type="dxa" w:w="40"/>
+              <w:right w:type="dxa" w:w="60"/>
+            </w:tcMar>
+            <w:vAlign w:val="top"/>
+          </w:tcPr>
+          <w:p>
+            <w:pPr>
+              <w:spacing w:after="0" w:before="0"/>
+              <w:jc w:val="left"/>
+            </w:pPr>
+            <w:r>
+              <w:rPr>
+                <w:rFonts w:ascii="Calibri" w:cs="Calibri" w:eastAsia="Calibri" w:hAnsi="Calibri"/>
+                <w:b w:val="false"/>
+                <w:bCs w:val="false"/>
+                <w:sz w:val="14"/>
+                <w:szCs w:val="14"/>
+              </w:rPr>
+              <w:t xml:space="preserve">Kablo tava sistemlerinin montajı — askı ve konsollarla tavana veya duvara tespiti; ek parça, konsol, askı tiji, vida ve somun bedelleri dâhildir, ayrıca ödenmez</w:t>
+            </w:r>
+          </w:p>
+        </w:tc>
+        <w:tc>
+          <w:tcPr>
+            <w:tcW w:type="dxa" w:w="680"/>
+            <w:tcBorders>
+              <w:top w:val="single" w:color="808080" w:sz="4"/>
+              <w:left w:val="single" w:color="808080" w:sz="4"/>
+              <w:bottom w:val="single" w:color="808080" w:sz="4"/>
+              <w:right w:val="single" w:color="808080" w:sz="4"/>
+            </w:tcBorders>
+            <w:tcMar>
+              <w:top w:type="dxa" w:w="40"/>
+              <w:left w:type="dxa" w:w="60"/>
+              <w:bottom w:type="dxa" w:w="40"/>
+              <w:right w:type="dxa" w:w="60"/>
+            </w:tcMar>
+            <w:vAlign w:val="top"/>
+          </w:tcPr>
+          <w:p>
+            <w:pPr>
+              <w:spacing w:after="0" w:before="0"/>
+              <w:jc w:val="center"/>
+            </w:pPr>
+            <w:r>
+              <w:rPr>
+                <w:rFonts w:ascii="Calibri" w:cs="Calibri" w:eastAsia="Calibri" w:hAnsi="Calibri"/>
+                <w:b w:val="false"/>
+                <w:bCs w:val="false"/>
+                <w:sz w:val="14"/>
+                <w:szCs w:val="14"/>
+              </w:rPr>
+              <w:t xml:space="preserve">kg</w:t>
+            </w:r>
+          </w:p>
+        </w:tc>
+        <w:tc>
+          <w:tcPr>
+            <w:tcW w:type="dxa" w:w="1134"/>
+            <w:tcBorders>
+              <w:top w:val="single" w:color="808080" w:sz="4"/>
+              <w:left w:val="single" w:color="808080" w:sz="4"/>
+              <w:bottom w:val="single" w:color="808080" w:sz="4"/>
+              <w:right w:val="single" w:color="808080" w:sz="4"/>
+            </w:tcBorders>
+            <w:tcMar>
+              <w:top w:type="dxa" w:w="40"/>
+              <w:left w:type="dxa" w:w="60"/>
+              <w:bottom w:type="dxa" w:w="40"/>
+              <w:right w:type="dxa" w:w="60"/>
+            </w:tcMar>
+            <w:vAlign w:val="top"/>
+          </w:tcPr>
+          <w:p>
+            <w:pPr>
+              <w:spacing w:after="0" w:before="0"/>
+              <w:jc w:val="right"/>
+            </w:pPr>
+            <w:r>
+              <w:rPr>
+                <w:rFonts w:ascii="Calibri" w:cs="Calibri" w:eastAsia="Calibri" w:hAnsi="Calibri"/>
+                <w:b w:val="false"/>
+                <w:bCs w:val="false"/>
+                <w:sz w:val="14"/>
+                <w:szCs w:val="14"/>
+              </w:rPr>
+              <w:t xml:space="preserve">502,000</w:t>
+            </w:r>
+          </w:p>
+        </w:tc>
+      </w:tr>
+      <w:tr>
+        <w:tc>
+          <w:tcPr>
+            <w:vMerge w:val="continue"/>
+            <w:tcBorders>
+              <w:top w:val="single" w:color="808080" w:sz="4"/>
+              <w:left w:val="single" w:color="808080" w:sz="4"/>
+              <w:bottom w:val="single" w:color="808080" w:sz="4"/>
+              <w:right w:val="single" w:color="808080" w:sz="4"/>
+            </w:tcBorders>
+          </w:tcPr>
+          <w:p/>
+        </w:tc>
+        <w:tc>
+          <w:tcPr>
+            <w:tcW w:type="dxa" w:w="454"/>
+            <w:tcBorders>
+              <w:top w:val="single" w:color="808080" w:sz="4"/>
+              <w:left w:val="single" w:color="808080" w:sz="4"/>
+              <w:bottom w:val="single" w:color="808080" w:sz="4"/>
+              <w:right w:val="single" w:color="808080" w:sz="4"/>
+            </w:tcBorders>
+            <w:tcMar>
+              <w:top w:type="dxa" w:w="40"/>
+              <w:left w:type="dxa" w:w="60"/>
+              <w:bottom w:type="dxa" w:w="40"/>
+              <w:right w:type="dxa" w:w="60"/>
+            </w:tcMar>
+            <w:vAlign w:val="top"/>
+          </w:tcPr>
+          <w:p>
+            <w:pPr>
+              <w:spacing w:after="0" w:before="0"/>
+              <w:jc w:val="center"/>
+            </w:pPr>
+            <w:r>
+              <w:rPr>
+                <w:rFonts w:ascii="Calibri" w:cs="Calibri" w:eastAsia="Calibri" w:hAnsi="Calibri"/>
+                <w:b w:val="false"/>
+                <w:bCs w:val="false"/>
+                <w:sz w:val="14"/>
+                <w:szCs w:val="14"/>
+              </w:rPr>
+              <w:t xml:space="preserve">18</w:t>
+            </w:r>
+          </w:p>
+        </w:tc>
+        <w:tc>
+          <w:tcPr>
+            <w:tcW w:type="dxa" w:w="1134"/>
+            <w:tcBorders>
+              <w:top w:val="single" w:color="808080" w:sz="4"/>
+              <w:left w:val="single" w:color="808080" w:sz="4"/>
+              <w:bottom w:val="single" w:color="808080" w:sz="4"/>
+              <w:right w:val="single" w:color="808080" w:sz="4"/>
+            </w:tcBorders>
+            <w:tcMar>
+              <w:top w:type="dxa" w:w="40"/>
+              <w:left w:type="dxa" w:w="60"/>
+              <w:bottom w:type="dxa" w:w="40"/>
+              <w:right w:type="dxa" w:w="60"/>
+            </w:tcMar>
+            <w:vAlign w:val="top"/>
+          </w:tcPr>
+          <w:p>
+            <w:pPr>
+              <w:spacing w:after="0" w:before="0"/>
+              <w:jc w:val="center"/>
+            </w:pPr>
+            <w:r>
+              <w:rPr>
+                <w:rFonts w:ascii="Calibri" w:cs="Calibri" w:eastAsia="Calibri" w:hAnsi="Calibri"/>
+                <w:b w:val="false"/>
+                <w:bCs w:val="false"/>
+                <w:sz w:val="14"/>
+                <w:szCs w:val="14"/>
+              </w:rPr>
+              <w:t xml:space="preserve">35.190.1101</w:t>
+            </w:r>
+          </w:p>
+        </w:tc>
+        <w:tc>
+          <w:tcPr>
+            <w:tcW w:type="dxa" w:w="5102"/>
+            <w:tcBorders>
+              <w:top w:val="single" w:color="808080" w:sz="4"/>
+              <w:left w:val="single" w:color="808080" w:sz="4"/>
+              <w:bottom w:val="single" w:color="808080" w:sz="4"/>
+              <w:right w:val="single" w:color="808080" w:sz="4"/>
+            </w:tcBorders>
+            <w:tcMar>
+              <w:top w:type="dxa" w:w="40"/>
+              <w:left w:type="dxa" w:w="60"/>
+              <w:bottom w:type="dxa" w:w="40"/>
+              <w:right w:type="dxa" w:w="60"/>
+            </w:tcMar>
+            <w:vAlign w:val="top"/>
+          </w:tcPr>
+          <w:p>
+            <w:pPr>
+              <w:spacing w:after="0" w:before="0"/>
+              <w:jc w:val="left"/>
+            </w:pPr>
+            <w:r>
+              <w:rPr>
+                <w:rFonts w:ascii="Calibri" w:cs="Calibri" w:eastAsia="Calibri" w:hAnsi="Calibri"/>
+                <w:b w:val="false"/>
+                <w:bCs w:val="false"/>
+                <w:sz w:val="14"/>
+                <w:szCs w:val="14"/>
+              </w:rPr>
+              <w:t xml:space="preserve">Kablo tava sistemleri kapak sacı — 35.190.1100 pozuna uygun özellikte, 1,0 mm sıcak daldırma galvanizli (malzeme) (%25 müteahhit kârı dahil)</w:t>
+            </w:r>
+          </w:p>
+        </w:tc>
+        <w:tc>
+          <w:tcPr>
+            <w:tcW w:type="dxa" w:w="680"/>
+            <w:tcBorders>
+              <w:top w:val="single" w:color="808080" w:sz="4"/>
+              <w:left w:val="single" w:color="808080" w:sz="4"/>
+              <w:bottom w:val="single" w:color="808080" w:sz="4"/>
+              <w:right w:val="single" w:color="808080" w:sz="4"/>
+            </w:tcBorders>
+            <w:tcMar>
+              <w:top w:type="dxa" w:w="40"/>
+              <w:left w:type="dxa" w:w="60"/>
+              <w:bottom w:type="dxa" w:w="40"/>
+              <w:right w:type="dxa" w:w="60"/>
+            </w:tcMar>
+            <w:vAlign w:val="top"/>
+          </w:tcPr>
+          <w:p>
+            <w:pPr>
+              <w:spacing w:after="0" w:before="0"/>
+              <w:jc w:val="center"/>
+            </w:pPr>
+            <w:r>
+              <w:rPr>
+                <w:rFonts w:ascii="Calibri" w:cs="Calibri" w:eastAsia="Calibri" w:hAnsi="Calibri"/>
+                <w:b w:val="false"/>
+                <w:bCs w:val="false"/>
+                <w:sz w:val="14"/>
+                <w:szCs w:val="14"/>
+              </w:rPr>
+              <w:t xml:space="preserve">kg</w:t>
+            </w:r>
+          </w:p>
+        </w:tc>
+        <w:tc>
+          <w:tcPr>
+            <w:tcW w:type="dxa" w:w="1134"/>
+            <w:tcBorders>
+              <w:top w:val="single" w:color="808080" w:sz="4"/>
+              <w:left w:val="single" w:color="808080" w:sz="4"/>
+              <w:bottom w:val="single" w:color="808080" w:sz="4"/>
+              <w:right w:val="single" w:color="808080" w:sz="4"/>
+            </w:tcBorders>
+            <w:tcMar>
+              <w:top w:type="dxa" w:w="40"/>
+              <w:left w:type="dxa" w:w="60"/>
+              <w:bottom w:type="dxa" w:w="40"/>
+              <w:right w:type="dxa" w:w="60"/>
+            </w:tcMar>
+            <w:vAlign w:val="top"/>
+          </w:tcPr>
+          <w:p>
+            <w:pPr>
+              <w:spacing w:after="0" w:before="0"/>
+              <w:jc w:val="right"/>
+            </w:pPr>
+            <w:r>
+              <w:rPr>
+                <w:rFonts w:ascii="Calibri" w:cs="Calibri" w:eastAsia="Calibri" w:hAnsi="Calibri"/>
+                <w:b w:val="false"/>
+                <w:bCs w:val="false"/>
+                <w:sz w:val="14"/>
+                <w:szCs w:val="14"/>
+              </w:rPr>
+              <w:t xml:space="preserve">361,200</w:t>
+            </w:r>
+          </w:p>
+        </w:tc>
+      </w:tr>
+      <w:tr>
+        <w:tc>
+          <w:tcPr>
+            <w:vMerge w:val="continue"/>
+            <w:tcBorders>
+              <w:top w:val="single" w:color="808080" w:sz="4"/>
+              <w:left w:val="single" w:color="808080" w:sz="4"/>
+              <w:bottom w:val="single" w:color="808080" w:sz="4"/>
+              <w:right w:val="single" w:color="808080" w:sz="4"/>
+            </w:tcBorders>
+          </w:tcPr>
+          <w:p/>
+        </w:tc>
+        <w:tc>
+          <w:tcPr>
+            <w:tcW w:type="dxa" w:w="454"/>
+            <w:tcBorders>
+              <w:top w:val="single" w:color="808080" w:sz="4"/>
+              <w:left w:val="single" w:color="808080" w:sz="4"/>
+              <w:bottom w:val="single" w:color="808080" w:sz="4"/>
+              <w:right w:val="single" w:color="808080" w:sz="4"/>
+            </w:tcBorders>
+            <w:tcMar>
+              <w:top w:type="dxa" w:w="40"/>
+              <w:left w:type="dxa" w:w="60"/>
+              <w:bottom w:type="dxa" w:w="40"/>
+              <w:right w:type="dxa" w:w="60"/>
+            </w:tcMar>
+            <w:vAlign w:val="top"/>
+          </w:tcPr>
+          <w:p>
+            <w:pPr>
+              <w:spacing w:after="0" w:before="0"/>
+              <w:jc w:val="center"/>
+            </w:pPr>
+            <w:r>
+              <w:rPr>
+                <w:rFonts w:ascii="Calibri" w:cs="Calibri" w:eastAsia="Calibri" w:hAnsi="Calibri"/>
+                <w:b w:val="false"/>
+                <w:bCs w:val="false"/>
+                <w:sz w:val="14"/>
+                <w:szCs w:val="14"/>
+              </w:rPr>
+              <w:t xml:space="preserve">19</w:t>
+            </w:r>
+          </w:p>
+        </w:tc>
+        <w:tc>
+          <w:tcPr>
+            <w:tcW w:type="dxa" w:w="1134"/>
+            <w:tcBorders>
+              <w:top w:val="single" w:color="808080" w:sz="4"/>
+              <w:left w:val="single" w:color="808080" w:sz="4"/>
+              <w:bottom w:val="single" w:color="808080" w:sz="4"/>
+              <w:right w:val="single" w:color="808080" w:sz="4"/>
+            </w:tcBorders>
+            <w:tcMar>
+              <w:top w:type="dxa" w:w="40"/>
+              <w:left w:type="dxa" w:w="60"/>
+              <w:bottom w:type="dxa" w:w="40"/>
+              <w:right w:type="dxa" w:w="60"/>
+            </w:tcMar>
+            <w:vAlign w:val="top"/>
+          </w:tcPr>
+          <w:p>
+            <w:pPr>
+              <w:spacing w:after="0" w:before="0"/>
+              <w:jc w:val="center"/>
+            </w:pPr>
+            <w:r>
+              <w:rPr>
+                <w:rFonts w:ascii="Calibri" w:cs="Calibri" w:eastAsia="Calibri" w:hAnsi="Calibri"/>
+                <w:b w:val="false"/>
+                <w:bCs w:val="false"/>
+                <w:sz w:val="14"/>
+                <w:szCs w:val="14"/>
+              </w:rPr>
+              <w:t xml:space="preserve">35.190.1101 (montaj)</w:t>
+            </w:r>
+          </w:p>
+        </w:tc>
+        <w:tc>
+          <w:tcPr>
+            <w:tcW w:type="dxa" w:w="5102"/>
+            <w:tcBorders>
+              <w:top w:val="single" w:color="808080" w:sz="4"/>
+              <w:left w:val="single" w:color="808080" w:sz="4"/>
+              <w:bottom w:val="single" w:color="808080" w:sz="4"/>
+              <w:right w:val="single" w:color="808080" w:sz="4"/>
+            </w:tcBorders>
+            <w:tcMar>
+              <w:top w:type="dxa" w:w="40"/>
+              <w:left w:type="dxa" w:w="60"/>
+              <w:bottom w:type="dxa" w:w="40"/>
+              <w:right w:type="dxa" w:w="60"/>
+            </w:tcMar>
+            <w:vAlign w:val="top"/>
+          </w:tcPr>
+          <w:p>
+            <w:pPr>
+              <w:spacing w:after="0" w:before="0"/>
+              <w:jc w:val="left"/>
+            </w:pPr>
+            <w:r>
+              <w:rPr>
+                <w:rFonts w:ascii="Calibri" w:cs="Calibri" w:eastAsia="Calibri" w:hAnsi="Calibri"/>
+                <w:b w:val="false"/>
+                <w:bCs w:val="false"/>
+                <w:sz w:val="14"/>
+                <w:szCs w:val="14"/>
+              </w:rPr>
+              <w:t xml:space="preserve">Kablo tava sistemleri kapak sacının montajı — onaylı projesinde belirtilen kanalların kapatılması; her türlü işçilik ve malzeme dâhil, işler hâlde teslim</w:t>
+            </w:r>
+          </w:p>
+        </w:tc>
+        <w:tc>
+          <w:tcPr>
+            <w:tcW w:type="dxa" w:w="680"/>
+            <w:tcBorders>
+              <w:top w:val="single" w:color="808080" w:sz="4"/>
+              <w:left w:val="single" w:color="808080" w:sz="4"/>
+              <w:bottom w:val="single" w:color="808080" w:sz="4"/>
+              <w:right w:val="single" w:color="808080" w:sz="4"/>
+            </w:tcBorders>
+            <w:tcMar>
+              <w:top w:type="dxa" w:w="40"/>
+              <w:left w:type="dxa" w:w="60"/>
+              <w:bottom w:type="dxa" w:w="40"/>
+              <w:right w:type="dxa" w:w="60"/>
+            </w:tcMar>
+            <w:vAlign w:val="top"/>
+          </w:tcPr>
+          <w:p>
+            <w:pPr>
+              <w:spacing w:after="0" w:before="0"/>
+              <w:jc w:val="center"/>
+            </w:pPr>
+            <w:r>
+              <w:rPr>
+                <w:rFonts w:ascii="Calibri" w:cs="Calibri" w:eastAsia="Calibri" w:hAnsi="Calibri"/>
+                <w:b w:val="false"/>
+                <w:bCs w:val="false"/>
+                <w:sz w:val="14"/>
+                <w:szCs w:val="14"/>
+              </w:rPr>
+              <w:t xml:space="preserve">kg</w:t>
+            </w:r>
+          </w:p>
+        </w:tc>
+        <w:tc>
+          <w:tcPr>
+            <w:tcW w:type="dxa" w:w="1134"/>
+            <w:tcBorders>
+              <w:top w:val="single" w:color="808080" w:sz="4"/>
+              <w:left w:val="single" w:color="808080" w:sz="4"/>
+              <w:bottom w:val="single" w:color="808080" w:sz="4"/>
+              <w:right w:val="single" w:color="808080" w:sz="4"/>
+            </w:tcBorders>
+            <w:tcMar>
+              <w:top w:type="dxa" w:w="40"/>
+              <w:left w:type="dxa" w:w="60"/>
+              <w:bottom w:type="dxa" w:w="40"/>
+              <w:right w:type="dxa" w:w="60"/>
+            </w:tcMar>
+            <w:vAlign w:val="top"/>
+          </w:tcPr>
+          <w:p>
+            <w:pPr>
+              <w:spacing w:after="0" w:before="0"/>
+              <w:jc w:val="right"/>
+            </w:pPr>
+            <w:r>
+              <w:rPr>
+                <w:rFonts w:ascii="Calibri" w:cs="Calibri" w:eastAsia="Calibri" w:hAnsi="Calibri"/>
+                <w:b w:val="false"/>
+                <w:bCs w:val="false"/>
+                <w:sz w:val="14"/>
+                <w:szCs w:val="14"/>
+              </w:rPr>
+              <w:t xml:space="preserve">361,200</w:t>
+            </w:r>
+          </w:p>
+        </w:tc>
+      </w:tr>
+      <w:tr>
+        <w:tc>
+          <w:tcPr>
+            <w:vMerge w:val="continue"/>
+            <w:tcBorders>
+              <w:top w:val="single" w:color="808080" w:sz="4"/>
+              <w:left w:val="single" w:color="808080" w:sz="4"/>
+              <w:bottom w:val="single" w:color="808080" w:sz="4"/>
+              <w:right w:val="single" w:color="808080" w:sz="4"/>
+            </w:tcBorders>
+          </w:tcPr>
+          <w:p/>
+        </w:tc>
+        <w:tc>
+          <w:tcPr>
+            <w:tcW w:type="dxa" w:w="454"/>
+            <w:tcBorders>
+              <w:top w:val="single" w:color="808080" w:sz="4"/>
+              <w:left w:val="single" w:color="808080" w:sz="4"/>
+              <w:bottom w:val="single" w:color="808080" w:sz="4"/>
+              <w:right w:val="single" w:color="808080" w:sz="4"/>
+            </w:tcBorders>
+            <w:tcMar>
+              <w:top w:type="dxa" w:w="40"/>
+              <w:left w:type="dxa" w:w="60"/>
+              <w:bottom w:type="dxa" w:w="40"/>
+              <w:right w:type="dxa" w:w="60"/>
+            </w:tcMar>
+            <w:vAlign w:val="top"/>
+          </w:tcPr>
+          <w:p>
+            <w:pPr>
+              <w:spacing w:after="0" w:before="0"/>
+              <w:jc w:val="center"/>
+            </w:pPr>
+            <w:r>
+              <w:rPr>
+                <w:rFonts w:ascii="Calibri" w:cs="Calibri" w:eastAsia="Calibri" w:hAnsi="Calibri"/>
+                <w:b w:val="false"/>
+                <w:bCs w:val="false"/>
+                <w:sz w:val="14"/>
+                <w:szCs w:val="14"/>
+              </w:rPr>
+              <w:t xml:space="preserve">20</w:t>
+            </w:r>
+          </w:p>
+        </w:tc>
+        <w:tc>
+          <w:tcPr>
+            <w:tcW w:type="dxa" w:w="1134"/>
+            <w:tcBorders>
+              <w:top w:val="single" w:color="808080" w:sz="4"/>
+              <w:left w:val="single" w:color="808080" w:sz="4"/>
+              <w:bottom w:val="single" w:color="808080" w:sz="4"/>
+              <w:right w:val="single" w:color="808080" w:sz="4"/>
+            </w:tcBorders>
+            <w:tcMar>
+              <w:top w:type="dxa" w:w="40"/>
+              <w:left w:type="dxa" w:w="60"/>
+              <w:bottom w:type="dxa" w:w="40"/>
+              <w:right w:type="dxa" w:w="60"/>
+            </w:tcMar>
+            <w:vAlign w:val="top"/>
+          </w:tcPr>
+          <w:p>
+            <w:pPr>
+              <w:spacing w:after="0" w:before="0"/>
+              <w:jc w:val="center"/>
+            </w:pPr>
+            <w:r>
+              <w:rPr>
+                <w:rFonts w:ascii="Calibri" w:cs="Calibri" w:eastAsia="Calibri" w:hAnsi="Calibri"/>
+                <w:b w:val="false"/>
+                <w:bCs w:val="false"/>
+                <w:sz w:val="14"/>
+                <w:szCs w:val="14"/>
+              </w:rPr>
+              <w:t xml:space="preserve">30.190.1304</w:t>
+            </w:r>
+          </w:p>
+        </w:tc>
+        <w:tc>
+          <w:tcPr>
+            <w:tcW w:type="dxa" w:w="5102"/>
+            <w:tcBorders>
+              <w:top w:val="single" w:color="808080" w:sz="4"/>
+              <w:left w:val="single" w:color="808080" w:sz="4"/>
+              <w:bottom w:val="single" w:color="808080" w:sz="4"/>
+              <w:right w:val="single" w:color="808080" w:sz="4"/>
+            </w:tcBorders>
+            <w:tcMar>
+              <w:top w:type="dxa" w:w="40"/>
+              <w:left w:type="dxa" w:w="60"/>
+              <w:bottom w:type="dxa" w:w="40"/>
+              <w:right w:type="dxa" w:w="60"/>
+            </w:tcMar>
+            <w:vAlign w:val="top"/>
+          </w:tcPr>
+          <w:p>
+            <w:pPr>
+              <w:spacing w:after="0" w:before="0"/>
+              <w:jc w:val="left"/>
+            </w:pPr>
+            <w:r>
+              <w:rPr>
+                <w:rFonts w:ascii="Calibri" w:cs="Calibri" w:eastAsia="Calibri" w:hAnsi="Calibri"/>
+                <w:b w:val="false"/>
+                <w:bCs w:val="false"/>
+                <w:sz w:val="14"/>
+                <w:szCs w:val="14"/>
+              </w:rPr>
+              <w:t xml:space="preserve">Sıva üstü PVC kablo kanalı — en az 100 x 35 mm, üç bölmeli (%25 müteahhit kârı dahil)</w:t>
+            </w:r>
+          </w:p>
+        </w:tc>
+        <w:tc>
+          <w:tcPr>
+            <w:tcW w:type="dxa" w:w="680"/>
+            <w:tcBorders>
+              <w:top w:val="single" w:color="808080" w:sz="4"/>
+              <w:left w:val="single" w:color="808080" w:sz="4"/>
+              <w:bottom w:val="single" w:color="808080" w:sz="4"/>
+              <w:right w:val="single" w:color="808080" w:sz="4"/>
+            </w:tcBorders>
+            <w:tcMar>
+              <w:top w:type="dxa" w:w="40"/>
+              <w:left w:type="dxa" w:w="60"/>
+              <w:bottom w:type="dxa" w:w="40"/>
+              <w:right w:type="dxa" w:w="60"/>
+            </w:tcMar>
+            <w:vAlign w:val="top"/>
+          </w:tcPr>
+          <w:p>
+            <w:pPr>
+              <w:spacing w:after="0" w:before="0"/>
+              <w:jc w:val="center"/>
+            </w:pPr>
+            <w:r>
+              <w:rPr>
+                <w:rFonts w:ascii="Calibri" w:cs="Calibri" w:eastAsia="Calibri" w:hAnsi="Calibri"/>
+                <w:b w:val="false"/>
+                <w:bCs w:val="false"/>
+                <w:sz w:val="14"/>
+                <w:szCs w:val="14"/>
+              </w:rPr>
+              <w:t xml:space="preserve">m</w:t>
+            </w:r>
+          </w:p>
+        </w:tc>
+        <w:tc>
+          <w:tcPr>
+            <w:tcW w:type="dxa" w:w="1134"/>
+            <w:tcBorders>
+              <w:top w:val="single" w:color="808080" w:sz="4"/>
+              <w:left w:val="single" w:color="808080" w:sz="4"/>
+              <w:bottom w:val="single" w:color="808080" w:sz="4"/>
+              <w:right w:val="single" w:color="808080" w:sz="4"/>
+            </w:tcBorders>
+            <w:tcMar>
+              <w:top w:type="dxa" w:w="40"/>
+              <w:left w:type="dxa" w:w="60"/>
+              <w:bottom w:type="dxa" w:w="40"/>
+              <w:right w:type="dxa" w:w="60"/>
+            </w:tcMar>
+            <w:vAlign w:val="top"/>
+          </w:tcPr>
+          <w:p>
+            <w:pPr>
+              <w:spacing w:after="0" w:before="0"/>
+              <w:jc w:val="right"/>
+            </w:pPr>
+            <w:r>
+              <w:rPr>
+                <w:rFonts w:ascii="Calibri" w:cs="Calibri" w:eastAsia="Calibri" w:hAnsi="Calibri"/>
+                <w:b w:val="false"/>
+                <w:bCs w:val="false"/>
+                <w:sz w:val="14"/>
+                <w:szCs w:val="14"/>
+              </w:rPr>
+              <w:t xml:space="preserve">123,000</w:t>
             </w:r>
           </w:p>
         </w:tc>

</xml_diff>